<commit_message>
Demo online: el lector queda listo para escanear, link de la demo y GIF de la caja
- El JavaScript del sistema usa la página donde corre (en Streamlit Cloud el
  sistema está adentro de otra página y antes buscaba el lector afuera).
- Stock: la columna Stock va al lado del producto, así se ve en pantallas angostas.
- README: link a la demo online y GIF de una venta con el lector.
- Guía: link de la demo y carpeta de videos.

Co-Authored-By: Claude Opus 5.5 (1M context) <noreply@anthropic.com>
Claude-Session: https://claude.ai/code/session_014Mc9Nf7M6wpdppcAp9AGsU
</commit_message>
<xml_diff>
--- a/informe/guia/guia-del-sistema.docx
+++ b/informe/guia/guia-del-sistema.docx
@@ -3072,7 +3072,71 @@
         <w:pStyle w:val="ListBullet"/>
       </w:pPr>
       <w:r>
-        <w:t>Cada vez que se sube un cambio a GitHub, la demo se actualiza sola.</w:t>
+        <w:t xml:space="preserve">La demo está en </w:t>
+      </w:r>
+      <w:r>
+        <w:rPr>
+          <w:b/>
+        </w:rPr>
+        <w:t>https://mini-sistema-demo.streamlit.app</w:t>
+      </w:r>
+      <w:r>
+        <w:t>. Cada vez que se sube un cambio a GitHub, se actualiza sola.</w:t>
+      </w:r>
+    </w:p>
+    <w:p>
+      <w:pPr>
+        <w:pStyle w:val="ListBullet"/>
+      </w:pPr>
+      <w:r>
+        <w:t>En Streamlit Cloud el sistema se muestra adentro de otra página (un marco). Por eso el JavaScript del sistema usa la página donde corre (</w:t>
+      </w:r>
+      <w:r>
+        <w:rPr>
+          <w:rFonts w:ascii="Consolas" w:hAnsi="Consolas"/>
+          <w:color w:val="8B1A1A"/>
+          <w:sz w:val="19"/>
+        </w:rPr>
+        <w:t>correr_script</w:t>
+      </w:r>
+      <w:r>
+        <w:t xml:space="preserve"> en </w:t>
+      </w:r>
+      <w:r>
+        <w:rPr>
+          <w:rFonts w:ascii="Consolas" w:hAnsi="Consolas"/>
+          <w:color w:val="8B1A1A"/>
+          <w:sz w:val="19"/>
+        </w:rPr>
+        <w:t>comun.py</w:t>
+      </w:r>
+      <w:r>
+        <w:t>) y no la de "afuera": si no, el lector no quedaría listo para escanear.</w:t>
+      </w:r>
+    </w:p>
+    <w:p>
+      <w:pPr>
+        <w:pStyle w:val="ListBullet"/>
+      </w:pPr>
+      <w:r>
+        <w:rPr>
+          <w:b/>
+        </w:rPr>
+        <w:t>Videos:</w:t>
+      </w:r>
+      <w:r>
+        <w:t xml:space="preserve"> en </w:t>
+      </w:r>
+      <w:r>
+        <w:rPr>
+          <w:rFonts w:ascii="Consolas" w:hAnsi="Consolas"/>
+          <w:color w:val="8B1A1A"/>
+          <w:sz w:val="19"/>
+        </w:rPr>
+        <w:t>informe/videos</w:t>
+      </w:r>
+      <w:r>
+        <w:t xml:space="preserve"> están el tutorial completo, la versión corta para LinkedIn y un GIF de la caja con la pistola (el GIF va en el README).</w:t>
       </w:r>
     </w:p>
     <w:p>

</xml_diff>

<commit_message>
Botón «Dejá tu reseña» que abre un formulario de Google
Aparece en la barra de la izquierda cuando FORMULARIO_RESENAS tiene el link
(en Streamlit Cloud, en los Secrets). Las respuestas no tocan la base.

Co-Authored-By: Claude Opus 5.5 (1M context) <noreply@anthropic.com>
Claude-Session: https://claude.ai/code/session_014Mc9Nf7M6wpdppcAp9AGsU
</commit_message>
<xml_diff>
--- a/informe/guia/guia-del-sistema.docx
+++ b/informe/guia/guia-del-sistema.docx
@@ -3122,6 +3122,40 @@
         <w:rPr>
           <w:b/>
         </w:rPr>
+        <w:t>Reseñas:</w:t>
+      </w:r>
+      <w:r>
+        <w:t xml:space="preserve"> con </w:t>
+      </w:r>
+      <w:r>
+        <w:rPr>
+          <w:rFonts w:ascii="Consolas" w:hAnsi="Consolas"/>
+          <w:color w:val="8B1A1A"/>
+          <w:sz w:val="19"/>
+        </w:rPr>
+        <w:t>FORMULARIO_RESENAS = "https://forms.gle/..."</w:t>
+      </w:r>
+      <w:r>
+        <w:t xml:space="preserve"> en los Secrets de la demo aparece el botón </w:t>
+      </w:r>
+      <w:r>
+        <w:rPr>
+          <w:b/>
+        </w:rPr>
+        <w:t>💬 Dejá tu reseña</w:t>
+      </w:r>
+      <w:r>
+        <w:t>, que abre un formulario de Google. Las respuestas quedan en una planilla de Google del dueño, no en la base (la demo en la nube borra la base cuando se reinicia).</w:t>
+      </w:r>
+    </w:p>
+    <w:p>
+      <w:pPr>
+        <w:pStyle w:val="ListBullet"/>
+      </w:pPr>
+      <w:r>
+        <w:rPr>
+          <w:b/>
+        </w:rPr>
         <w:t>Videos:</w:t>
       </w:r>
       <w:r>

</xml_diff>

<commit_message>
README y guía: vuelto, ajustes de caja y Compras para el empleado
Co-Authored-By: Claude Opus 5.5 (1M context) <noreply@anthropic.com>
Claude-Session: https://claude.ai/code/session_01G7WmpuHDdSo7FWS1x9MX1X
</commit_message>
<xml_diff>
--- a/informe/guia/guia-del-sistema.docx
+++ b/informe/guia/guia-del-sistema.docx
@@ -123,25 +123,22 @@
       <w:tblPr>
         <w:tblStyle w:val="TableGrid"/>
         <w:tblW w:type="auto" w:w="0"/>
-        <w:jc w:val="center"/>
         <w:tblLook w:firstColumn="1" w:firstRow="1" w:lastColumn="0" w:lastRow="0" w:noHBand="0" w:noVBand="1" w:val="04A0"/>
       </w:tblPr>
       <w:tblGrid>
-        <w:gridCol w:w="3249"/>
-        <w:gridCol w:w="3249"/>
-        <w:gridCol w:w="3249"/>
+        <w:gridCol w:w="2880"/>
+        <w:gridCol w:w="2880"/>
+        <w:gridCol w:w="2880"/>
       </w:tblGrid>
       <w:tr>
         <w:tc>
           <w:tcPr>
-            <w:tcW w:type="dxa" w:w="3249"/>
-            <w:shd w:val="clear" w:color="auto" w:fill="DCE8FC"/>
+            <w:tcW w:type="dxa" w:w="2880"/>
           </w:tcPr>
           <w:p>
             <w:r>
               <w:rPr>
                 <w:b/>
-                <w:sz w:val="20"/>
               </w:rPr>
               <w:t>Capa</w:t>
             </w:r>
@@ -149,14 +146,12 @@
         </w:tc>
         <w:tc>
           <w:tcPr>
-            <w:tcW w:type="dxa" w:w="3249"/>
-            <w:shd w:val="clear" w:color="auto" w:fill="DCE8FC"/>
+            <w:tcW w:type="dxa" w:w="2880"/>
           </w:tcPr>
           <w:p>
             <w:r>
               <w:rPr>
                 <w:b/>
-                <w:sz w:val="20"/>
               </w:rPr>
               <w:t>Qué es</w:t>
             </w:r>
@@ -164,14 +159,12 @@
         </w:tc>
         <w:tc>
           <w:tcPr>
-            <w:tcW w:type="dxa" w:w="3249"/>
-            <w:shd w:val="clear" w:color="auto" w:fill="DCE8FC"/>
+            <w:tcW w:type="dxa" w:w="2880"/>
           </w:tcPr>
           <w:p>
             <w:r>
               <w:rPr>
                 <w:b/>
-                <w:sz w:val="20"/>
               </w:rPr>
               <w:t>Archivos</w:t>
             </w:r>
@@ -181,13 +174,12 @@
       <w:tr>
         <w:tc>
           <w:tcPr>
-            <w:tcW w:type="dxa" w:w="3249"/>
+            <w:tcW w:type="dxa" w:w="2880"/>
           </w:tcPr>
           <w:p>
             <w:r>
               <w:rPr>
                 <w:b/>
-                <w:sz w:val="20"/>
               </w:rPr>
               <w:t>1. Base de datos</w:t>
             </w:r>
@@ -195,48 +187,35 @@
         </w:tc>
         <w:tc>
           <w:tcPr>
-            <w:tcW w:type="dxa" w:w="3249"/>
+            <w:tcW w:type="dxa" w:w="2880"/>
           </w:tcPr>
           <w:p>
             <w:r>
-              <w:rPr>
-                <w:sz w:val="20"/>
-              </w:rPr>
               <w:t>Donde se guarda todo: productos, ventas, cajas, gastos. Es como un Excel con muchas hojas (tablas) relacionadas entre sí.</w:t>
             </w:r>
           </w:p>
         </w:tc>
         <w:tc>
           <w:tcPr>
-            <w:tcW w:type="dxa" w:w="3249"/>
+            <w:tcW w:type="dxa" w:w="2880"/>
           </w:tcPr>
           <w:p>
             <w:r>
               <w:rPr>
                 <w:rFonts w:ascii="Consolas" w:hAnsi="Consolas"/>
-                <w:color w:val="8B1A1A"/>
-                <w:sz w:val="19"/>
               </w:rPr>
               <w:t>mini_sistema.db</w:t>
             </w:r>
             <w:r>
-              <w:rPr>
-                <w:sz w:val="20"/>
-              </w:rPr>
               <w:t xml:space="preserve"> (SQLite). Las tablas se definen en </w:t>
             </w:r>
             <w:r>
               <w:rPr>
                 <w:rFonts w:ascii="Consolas" w:hAnsi="Consolas"/>
-                <w:color w:val="8B1A1A"/>
-                <w:sz w:val="19"/>
               </w:rPr>
               <w:t>base_datos.py</w:t>
             </w:r>
             <w:r>
-              <w:rPr>
-                <w:sz w:val="20"/>
-              </w:rPr>
               <w:t>.</w:t>
             </w:r>
           </w:p>
@@ -245,13 +224,12 @@
       <w:tr>
         <w:tc>
           <w:tcPr>
-            <w:tcW w:type="dxa" w:w="3249"/>
+            <w:tcW w:type="dxa" w:w="2880"/>
           </w:tcPr>
           <w:p>
             <w:r>
               <w:rPr>
                 <w:b/>
-                <w:sz w:val="20"/>
               </w:rPr>
               <w:t>2. Operaciones</w:t>
             </w:r>
@@ -259,27 +237,22 @@
         </w:tc>
         <w:tc>
           <w:tcPr>
-            <w:tcW w:type="dxa" w:w="3249"/>
+            <w:tcW w:type="dxa" w:w="2880"/>
           </w:tcPr>
           <w:p>
             <w:r>
-              <w:rPr>
-                <w:sz w:val="20"/>
-              </w:rPr>
               <w:t>Las únicas funciones que leen y escriben en la base: "registrar una venta", "abrir caja", "listar productos".</w:t>
             </w:r>
           </w:p>
         </w:tc>
         <w:tc>
           <w:tcPr>
-            <w:tcW w:type="dxa" w:w="3249"/>
+            <w:tcW w:type="dxa" w:w="2880"/>
           </w:tcPr>
           <w:p>
             <w:r>
               <w:rPr>
                 <w:rFonts w:ascii="Consolas" w:hAnsi="Consolas"/>
-                <w:color w:val="8B1A1A"/>
-                <w:sz w:val="19"/>
               </w:rPr>
               <w:t>operaciones.py</w:t>
             </w:r>
@@ -289,13 +262,12 @@
       <w:tr>
         <w:tc>
           <w:tcPr>
-            <w:tcW w:type="dxa" w:w="3249"/>
+            <w:tcW w:type="dxa" w:w="2880"/>
           </w:tcPr>
           <w:p>
             <w:r>
               <w:rPr>
                 <w:b/>
-                <w:sz w:val="20"/>
               </w:rPr>
               <w:t>3. Pantallas</w:t>
             </w:r>
@@ -303,62 +275,44 @@
         </w:tc>
         <w:tc>
           <w:tcPr>
-            <w:tcW w:type="dxa" w:w="3249"/>
+            <w:tcW w:type="dxa" w:w="2880"/>
           </w:tcPr>
           <w:p>
             <w:r>
-              <w:rPr>
-                <w:sz w:val="20"/>
-              </w:rPr>
               <w:t>Lo que ve la persona: botones, tablas y formularios. Cuando alguien toca "Cobrar", la pantalla llama a una operación.</w:t>
             </w:r>
           </w:p>
         </w:tc>
         <w:tc>
           <w:tcPr>
-            <w:tcW w:type="dxa" w:w="3249"/>
+            <w:tcW w:type="dxa" w:w="2880"/>
           </w:tcPr>
           <w:p>
             <w:r>
               <w:rPr>
                 <w:rFonts w:ascii="Consolas" w:hAnsi="Consolas"/>
-                <w:color w:val="8B1A1A"/>
-                <w:sz w:val="19"/>
               </w:rPr>
               <w:t>app.py</w:t>
             </w:r>
             <w:r>
-              <w:rPr>
-                <w:sz w:val="20"/>
-              </w:rPr>
               <w:t xml:space="preserve">, </w:t>
             </w:r>
             <w:r>
               <w:rPr>
                 <w:rFonts w:ascii="Consolas" w:hAnsi="Consolas"/>
-                <w:color w:val="8B1A1A"/>
-                <w:sz w:val="19"/>
               </w:rPr>
               <w:t>ingreso.py</w:t>
             </w:r>
             <w:r>
-              <w:rPr>
-                <w:sz w:val="20"/>
-              </w:rPr>
               <w:t xml:space="preserve"> y la carpeta </w:t>
             </w:r>
             <w:r>
               <w:rPr>
                 <w:rFonts w:ascii="Consolas" w:hAnsi="Consolas"/>
-                <w:color w:val="8B1A1A"/>
-                <w:sz w:val="19"/>
               </w:rPr>
               <w:t>paginas/</w:t>
             </w:r>
             <w:r>
-              <w:rPr>
-                <w:sz w:val="20"/>
-              </w:rPr>
               <w:t xml:space="preserve"> (hechas con Streamlit)</w:t>
             </w:r>
           </w:p>
@@ -399,8 +353,6 @@
       <w:r>
         <w:rPr>
           <w:rFonts w:ascii="Consolas" w:hAnsi="Consolas"/>
-          <w:color w:val="8B1A1A"/>
-          <w:sz w:val="19"/>
         </w:rPr>
         <w:t>esquema.sql</w:t>
       </w:r>
@@ -410,8 +362,6 @@
       <w:r>
         <w:rPr>
           <w:rFonts w:ascii="Consolas" w:hAnsi="Consolas"/>
-          <w:color w:val="8B1A1A"/>
-          <w:sz w:val="19"/>
         </w:rPr>
         <w:t>ver_resumen.py</w:t>
       </w:r>
@@ -448,10 +398,6 @@
       </w:r>
     </w:p>
     <w:p>
-      <w:pPr>
-        <w:spacing w:after="60"/>
-        <w:ind w:left="510" w:hanging="340"/>
-      </w:pPr>
       <w:r>
         <w:rPr>
           <w:b/>
@@ -470,8 +416,6 @@
       <w:r>
         <w:rPr>
           <w:rFonts w:ascii="Consolas" w:hAnsi="Consolas"/>
-          <w:color w:val="8B1A1A"/>
-          <w:sz w:val="19"/>
         </w:rPr>
         <w:t>iniciar.bat</w:t>
       </w:r>
@@ -480,10 +424,6 @@
       </w:r>
     </w:p>
     <w:p>
-      <w:pPr>
-        <w:spacing w:after="60"/>
-        <w:ind w:left="510" w:hanging="340"/>
-      </w:pPr>
       <w:r>
         <w:rPr>
           <w:b/>
@@ -519,10 +459,6 @@
       </w:r>
     </w:p>
     <w:p>
-      <w:pPr>
-        <w:spacing w:after="60"/>
-        <w:ind w:left="510" w:hanging="340"/>
-      </w:pPr>
       <w:r>
         <w:rPr>
           <w:b/>
@@ -540,10 +476,6 @@
       </w:r>
     </w:p>
     <w:p>
-      <w:pPr>
-        <w:spacing w:after="60"/>
-        <w:ind w:left="510" w:hanging="340"/>
-      </w:pPr>
       <w:r>
         <w:rPr>
           <w:b/>
@@ -575,6 +507,15 @@
         <w:t>Cobrar</w:t>
       </w:r>
       <w:r>
+        <w:t xml:space="preserve">. Si pagan en efectivo, se puede escribir con cuánto pagan y el sistema muestra el </w:t>
+      </w:r>
+      <w:r>
+        <w:rPr>
+          <w:b/>
+        </w:rPr>
+        <w:t>vuelto</w:t>
+      </w:r>
+      <w:r>
         <w:t xml:space="preserve">. El stock se descuenta solo y, si el cliente lo pide, sale el </w:t>
       </w:r>
       <w:r>
@@ -588,10 +529,6 @@
       </w:r>
     </w:p>
     <w:p>
-      <w:pPr>
-        <w:spacing w:after="60"/>
-        <w:ind w:left="510" w:hanging="340"/>
-      </w:pPr>
       <w:r>
         <w:rPr>
           <w:b/>
@@ -614,14 +551,10 @@
         <w:t>Compras</w:t>
       </w:r>
       <w:r>
-        <w:t xml:space="preserve"> se pasa el lector por lo que llegó, se escribe la cantidad y se guarda. Suma al stock y actualiza el precio de costo.</w:t>
+        <w:t xml:space="preserve"> se pasa el lector por lo que llegó, se escribe la cantidad y se guarda. Suma al stock y actualiza el precio de costo. Lo puede hacer también el empleado (sin ver costos), y queda anotado quién la cargó.</w:t>
       </w:r>
     </w:p>
     <w:p>
-      <w:pPr>
-        <w:spacing w:after="60"/>
-        <w:ind w:left="510" w:hanging="340"/>
-      </w:pPr>
       <w:r>
         <w:rPr>
           <w:b/>
@@ -648,10 +581,6 @@
       </w:r>
     </w:p>
     <w:p>
-      <w:pPr>
-        <w:spacing w:after="60"/>
-        <w:ind w:left="510" w:hanging="340"/>
-      </w:pPr>
       <w:r>
         <w:rPr>
           <w:b/>
@@ -678,10 +607,6 @@
       </w:r>
     </w:p>
     <w:p>
-      <w:pPr>
-        <w:spacing w:after="60"/>
-        <w:ind w:left="510" w:hanging="340"/>
-      </w:pPr>
       <w:r>
         <w:rPr>
           <w:b/>
@@ -704,14 +629,19 @@
         <w:t>arqueo</w:t>
       </w:r>
       <w:r>
-        <w:t>). Una caja cerrada ya no se puede modificar.</w:t>
+        <w:t xml:space="preserve">). Una caja cerrada ya no se puede modificar. Si hubo un error, el jefe le hace un </w:t>
+      </w:r>
+      <w:r>
+        <w:rPr>
+          <w:b/>
+        </w:rPr>
+        <w:t>ajuste</w:t>
+      </w:r>
+      <w:r>
+        <w:t xml:space="preserve"> (ver más abajo).</w:t>
       </w:r>
     </w:p>
     <w:p>
-      <w:pPr>
-        <w:spacing w:after="60"/>
-        <w:ind w:left="510" w:hanging="340"/>
-      </w:pPr>
       <w:r>
         <w:rPr>
           <w:b/>
@@ -749,25 +679,22 @@
       <w:tblPr>
         <w:tblStyle w:val="TableGrid"/>
         <w:tblW w:type="auto" w:w="0"/>
-        <w:jc w:val="center"/>
         <w:tblLook w:firstColumn="1" w:firstRow="1" w:lastColumn="0" w:lastRow="0" w:noHBand="0" w:noVBand="1" w:val="04A0"/>
       </w:tblPr>
       <w:tblGrid>
-        <w:gridCol w:w="3249"/>
-        <w:gridCol w:w="3249"/>
-        <w:gridCol w:w="3249"/>
+        <w:gridCol w:w="2880"/>
+        <w:gridCol w:w="2880"/>
+        <w:gridCol w:w="2880"/>
       </w:tblGrid>
       <w:tr>
         <w:tc>
           <w:tcPr>
-            <w:tcW w:type="dxa" w:w="3249"/>
-            <w:shd w:val="clear" w:color="auto" w:fill="DCE8FC"/>
+            <w:tcW w:type="dxa" w:w="2880"/>
           </w:tcPr>
           <w:p>
             <w:r>
               <w:rPr>
                 <w:b/>
-                <w:sz w:val="20"/>
               </w:rPr>
               <w:t>Pantalla</w:t>
             </w:r>
@@ -775,14 +702,12 @@
         </w:tc>
         <w:tc>
           <w:tcPr>
-            <w:tcW w:type="dxa" w:w="3249"/>
-            <w:shd w:val="clear" w:color="auto" w:fill="DCE8FC"/>
+            <w:tcW w:type="dxa" w:w="2880"/>
           </w:tcPr>
           <w:p>
             <w:r>
               <w:rPr>
                 <w:b/>
-                <w:sz w:val="20"/>
               </w:rPr>
               <w:t>Qué hace</w:t>
             </w:r>
@@ -790,14 +715,12 @@
         </w:tc>
         <w:tc>
           <w:tcPr>
-            <w:tcW w:type="dxa" w:w="3249"/>
-            <w:shd w:val="clear" w:color="auto" w:fill="DCE8FC"/>
+            <w:tcW w:type="dxa" w:w="2880"/>
           </w:tcPr>
           <w:p>
             <w:r>
               <w:rPr>
                 <w:b/>
-                <w:sz w:val="20"/>
               </w:rPr>
               <w:t>Quién la ve</w:t>
             </w:r>
@@ -807,39 +730,30 @@
       <w:tr>
         <w:tc>
           <w:tcPr>
-            <w:tcW w:type="dxa" w:w="3249"/>
+            <w:tcW w:type="dxa" w:w="2880"/>
           </w:tcPr>
           <w:p>
             <w:r>
-              <w:rPr>
-                <w:sz w:val="20"/>
-              </w:rPr>
               <w:t>🏠 Inicio</w:t>
             </w:r>
           </w:p>
         </w:tc>
         <w:tc>
           <w:tcPr>
-            <w:tcW w:type="dxa" w:w="3249"/>
+            <w:tcW w:type="dxa" w:w="2880"/>
           </w:tcPr>
           <w:p>
             <w:r>
-              <w:rPr>
-                <w:sz w:val="20"/>
-              </w:rPr>
               <w:t>Cada comercio con lo vendido hoy y en el mes y el estado de la caja, más los totales y la ganancia bruta del mes. Botón para ir a la caja.</w:t>
             </w:r>
           </w:p>
         </w:tc>
         <w:tc>
           <w:tcPr>
-            <w:tcW w:type="dxa" w:w="3249"/>
+            <w:tcW w:type="dxa" w:w="2880"/>
           </w:tcPr>
           <w:p>
             <w:r>
-              <w:rPr>
-                <w:sz w:val="20"/>
-              </w:rPr>
               <w:t>Jefe</w:t>
             </w:r>
           </w:p>
@@ -848,39 +762,30 @@
       <w:tr>
         <w:tc>
           <w:tcPr>
-            <w:tcW w:type="dxa" w:w="3249"/>
+            <w:tcW w:type="dxa" w:w="2880"/>
           </w:tcPr>
           <w:p>
             <w:r>
-              <w:rPr>
-                <w:sz w:val="20"/>
-              </w:rPr>
               <w:t>💵 Caja</w:t>
             </w:r>
           </w:p>
         </w:tc>
         <w:tc>
           <w:tcPr>
-            <w:tcW w:type="dxa" w:w="3249"/>
+            <w:tcW w:type="dxa" w:w="2880"/>
           </w:tcPr>
           <w:p>
             <w:r>
-              <w:rPr>
-                <w:sz w:val="20"/>
-              </w:rPr>
-              <w:t>Abrir caja, vender con el lector o la lista, cobrar, ticket, cerrar caja con arqueo. El jefe ve el historial de cajas.</w:t>
+              <w:t>Abrir caja, vender con el lector o la lista, vuelto, cobrar, ticket, cerrar caja con arqueo. El jefe ve el historial de cajas y las ajusta.</w:t>
             </w:r>
           </w:p>
         </w:tc>
         <w:tc>
           <w:tcPr>
-            <w:tcW w:type="dxa" w:w="3249"/>
+            <w:tcW w:type="dxa" w:w="2880"/>
           </w:tcPr>
           <w:p>
             <w:r>
-              <w:rPr>
-                <w:sz w:val="20"/>
-              </w:rPr>
               <w:t>Jefe y empleado</w:t>
             </w:r>
           </w:p>
@@ -889,39 +794,62 @@
       <w:tr>
         <w:tc>
           <w:tcPr>
-            <w:tcW w:type="dxa" w:w="3249"/>
+            <w:tcW w:type="dxa" w:w="2880"/>
           </w:tcPr>
           <w:p>
             <w:r>
-              <w:rPr>
-                <w:sz w:val="20"/>
-              </w:rPr>
               <w:t>📦 Compras</w:t>
             </w:r>
           </w:p>
         </w:tc>
         <w:tc>
           <w:tcPr>
-            <w:tcW w:type="dxa" w:w="3249"/>
+            <w:tcW w:type="dxa" w:w="2880"/>
           </w:tcPr>
           <w:p>
             <w:r>
-              <w:rPr>
-                <w:sz w:val="20"/>
-              </w:rPr>
-              <w:t>Cargar lo que llega del proveedor: con el lector pide la cantidad. Suma al stock.</w:t>
+              <w:t>Cargar lo que llega del proveedor: con el lector pide la cantidad. Suma al stock. El empleado no ve costos.</w:t>
             </w:r>
           </w:p>
         </w:tc>
         <w:tc>
           <w:tcPr>
-            <w:tcW w:type="dxa" w:w="3249"/>
+            <w:tcW w:type="dxa" w:w="2880"/>
           </w:tcPr>
           <w:p>
             <w:r>
-              <w:rPr>
-                <w:sz w:val="20"/>
-              </w:rPr>
+              <w:t>Jefe y empleado (viene habilitado; el jefe lo puede sacar)</w:t>
+            </w:r>
+          </w:p>
+        </w:tc>
+      </w:tr>
+      <w:tr>
+        <w:tc>
+          <w:tcPr>
+            <w:tcW w:type="dxa" w:w="2880"/>
+          </w:tcPr>
+          <w:p>
+            <w:r>
+              <w:t>🧾 Gastos</w:t>
+            </w:r>
+          </w:p>
+        </w:tc>
+        <w:tc>
+          <w:tcPr>
+            <w:tcW w:type="dxa" w:w="2880"/>
+          </w:tcPr>
+          <w:p>
+            <w:r>
+              <w:t>Cargar gastos del comercio.</w:t>
+            </w:r>
+          </w:p>
+        </w:tc>
+        <w:tc>
+          <w:tcPr>
+            <w:tcW w:type="dxa" w:w="2880"/>
+          </w:tcPr>
+          <w:p>
+            <w:r>
               <w:t>Jefe (y empleado si tiene permiso)</w:t>
             </w:r>
           </w:p>
@@ -930,39 +858,30 @@
       <w:tr>
         <w:tc>
           <w:tcPr>
-            <w:tcW w:type="dxa" w:w="3249"/>
+            <w:tcW w:type="dxa" w:w="2880"/>
           </w:tcPr>
           <w:p>
             <w:r>
-              <w:rPr>
-                <w:sz w:val="20"/>
-              </w:rPr>
-              <w:t>🧾 Gastos</w:t>
+              <w:t>📊 Panel del día</w:t>
             </w:r>
           </w:p>
         </w:tc>
         <w:tc>
           <w:tcPr>
-            <w:tcW w:type="dxa" w:w="3249"/>
+            <w:tcW w:type="dxa" w:w="2880"/>
           </w:tcPr>
           <w:p>
             <w:r>
-              <w:rPr>
-                <w:sz w:val="20"/>
-              </w:rPr>
-              <w:t>Cargar gastos del comercio.</w:t>
+              <w:t>Lo vendido hoy, en vivo. El empleado no ve la ganancia.</w:t>
             </w:r>
           </w:p>
         </w:tc>
         <w:tc>
           <w:tcPr>
-            <w:tcW w:type="dxa" w:w="3249"/>
+            <w:tcW w:type="dxa" w:w="2880"/>
           </w:tcPr>
           <w:p>
             <w:r>
-              <w:rPr>
-                <w:sz w:val="20"/>
-              </w:rPr>
               <w:t>Jefe (y empleado si tiene permiso)</w:t>
             </w:r>
           </w:p>
@@ -971,39 +890,30 @@
       <w:tr>
         <w:tc>
           <w:tcPr>
-            <w:tcW w:type="dxa" w:w="3249"/>
+            <w:tcW w:type="dxa" w:w="2880"/>
           </w:tcPr>
           <w:p>
             <w:r>
-              <w:rPr>
-                <w:sz w:val="20"/>
-              </w:rPr>
-              <w:t>📊 Panel del día</w:t>
+              <w:t>📋 Stock</w:t>
             </w:r>
           </w:p>
         </w:tc>
         <w:tc>
           <w:tcPr>
-            <w:tcW w:type="dxa" w:w="3249"/>
+            <w:tcW w:type="dxa" w:w="2880"/>
           </w:tcPr>
           <w:p>
             <w:r>
-              <w:rPr>
-                <w:sz w:val="20"/>
-              </w:rPr>
-              <w:t>Lo vendido hoy, en vivo. El empleado no ve la ganancia.</w:t>
+              <w:t>Productos, precios, cantidades y códigos de barras; avisa qué reponer. El empleado solo mira, sin costos.</w:t>
             </w:r>
           </w:p>
         </w:tc>
         <w:tc>
           <w:tcPr>
-            <w:tcW w:type="dxa" w:w="3249"/>
+            <w:tcW w:type="dxa" w:w="2880"/>
           </w:tcPr>
           <w:p>
             <w:r>
-              <w:rPr>
-                <w:sz w:val="20"/>
-              </w:rPr>
               <w:t>Jefe (y empleado si tiene permiso)</w:t>
             </w:r>
           </w:p>
@@ -1012,80 +922,30 @@
       <w:tr>
         <w:tc>
           <w:tcPr>
-            <w:tcW w:type="dxa" w:w="3249"/>
+            <w:tcW w:type="dxa" w:w="2880"/>
           </w:tcPr>
           <w:p>
             <w:r>
-              <w:rPr>
-                <w:sz w:val="20"/>
-              </w:rPr>
-              <w:t>📋 Stock</w:t>
-            </w:r>
-          </w:p>
-        </w:tc>
-        <w:tc>
-          <w:tcPr>
-            <w:tcW w:type="dxa" w:w="3249"/>
-          </w:tcPr>
-          <w:p>
-            <w:r>
-              <w:rPr>
-                <w:sz w:val="20"/>
-              </w:rPr>
-              <w:t>Productos, precios, cantidades y códigos de barras; avisa qué reponer. El empleado solo mira, sin costos.</w:t>
-            </w:r>
-          </w:p>
-        </w:tc>
-        <w:tc>
-          <w:tcPr>
-            <w:tcW w:type="dxa" w:w="3249"/>
-          </w:tcPr>
-          <w:p>
-            <w:r>
-              <w:rPr>
-                <w:sz w:val="20"/>
-              </w:rPr>
-              <w:t>Jefe (y empleado si tiene permiso)</w:t>
-            </w:r>
-          </w:p>
-        </w:tc>
-      </w:tr>
-      <w:tr>
-        <w:tc>
-          <w:tcPr>
-            <w:tcW w:type="dxa" w:w="3249"/>
-          </w:tcPr>
-          <w:p>
-            <w:r>
-              <w:rPr>
-                <w:sz w:val="20"/>
-              </w:rPr>
               <w:t>📑 Reportes</w:t>
             </w:r>
           </w:p>
         </w:tc>
         <w:tc>
           <w:tcPr>
-            <w:tcW w:type="dxa" w:w="3249"/>
+            <w:tcW w:type="dxa" w:w="2880"/>
           </w:tcPr>
           <w:p>
             <w:r>
-              <w:rPr>
-                <w:sz w:val="20"/>
-              </w:rPr>
               <w:t>Las 5 preguntas (cuánto vendí, gané y gasté, qué se vende más y qué me falta comprar) y el Excel con gráficos.</w:t>
             </w:r>
           </w:p>
         </w:tc>
         <w:tc>
           <w:tcPr>
-            <w:tcW w:type="dxa" w:w="3249"/>
+            <w:tcW w:type="dxa" w:w="2880"/>
           </w:tcPr>
           <w:p>
             <w:r>
-              <w:rPr>
-                <w:sz w:val="20"/>
-              </w:rPr>
               <w:t>Jefe</w:t>
             </w:r>
           </w:p>
@@ -1094,39 +954,30 @@
       <w:tr>
         <w:tc>
           <w:tcPr>
-            <w:tcW w:type="dxa" w:w="3249"/>
+            <w:tcW w:type="dxa" w:w="2880"/>
           </w:tcPr>
           <w:p>
             <w:r>
-              <w:rPr>
-                <w:sz w:val="20"/>
-              </w:rPr>
               <w:t>🏬 Mis comercios</w:t>
             </w:r>
           </w:p>
         </w:tc>
         <w:tc>
           <w:tcPr>
-            <w:tcW w:type="dxa" w:w="3249"/>
+            <w:tcW w:type="dxa" w:w="2880"/>
           </w:tcPr>
           <w:p>
             <w:r>
-              <w:rPr>
-                <w:sz w:val="20"/>
-              </w:rPr>
               <w:t>Crear comercios, prender el ticket, el resumen semanal, elegir qué ve el empleado y cambiar el PIN.</w:t>
             </w:r>
           </w:p>
         </w:tc>
         <w:tc>
           <w:tcPr>
-            <w:tcW w:type="dxa" w:w="3249"/>
+            <w:tcW w:type="dxa" w:w="2880"/>
           </w:tcPr>
           <w:p>
             <w:r>
-              <w:rPr>
-                <w:sz w:val="20"/>
-              </w:rPr>
               <w:t>Jefe</w:t>
             </w:r>
           </w:p>
@@ -1135,39 +986,30 @@
       <w:tr>
         <w:tc>
           <w:tcPr>
-            <w:tcW w:type="dxa" w:w="3249"/>
+            <w:tcW w:type="dxa" w:w="2880"/>
           </w:tcPr>
           <w:p>
             <w:r>
-              <w:rPr>
-                <w:sz w:val="20"/>
-              </w:rPr>
               <w:t>📥 Importar / exportar Excel</w:t>
             </w:r>
           </w:p>
         </w:tc>
         <w:tc>
           <w:tcPr>
-            <w:tcW w:type="dxa" w:w="3249"/>
+            <w:tcW w:type="dxa" w:w="2880"/>
           </w:tcPr>
           <w:p>
             <w:r>
-              <w:rPr>
-                <w:sz w:val="20"/>
-              </w:rPr>
               <w:t>Cargar o actualizar muchos productos de una vez con Excel.</w:t>
             </w:r>
           </w:p>
         </w:tc>
         <w:tc>
           <w:tcPr>
-            <w:tcW w:type="dxa" w:w="3249"/>
+            <w:tcW w:type="dxa" w:w="2880"/>
           </w:tcPr>
           <w:p>
             <w:r>
-              <w:rPr>
-                <w:sz w:val="20"/>
-              </w:rPr>
               <w:t>Jefe</w:t>
             </w:r>
           </w:p>
@@ -1187,32 +1029,28 @@
       <w:tblPr>
         <w:tblStyle w:val="TableGrid"/>
         <w:tblW w:type="auto" w:w="0"/>
-        <w:jc w:val="center"/>
         <w:tblLook w:firstColumn="1" w:firstRow="1" w:lastColumn="0" w:lastRow="0" w:noHBand="0" w:noVBand="1" w:val="04A0"/>
       </w:tblPr>
       <w:tblGrid>
-        <w:gridCol w:w="3249"/>
-        <w:gridCol w:w="3249"/>
-        <w:gridCol w:w="3249"/>
+        <w:gridCol w:w="2880"/>
+        <w:gridCol w:w="2880"/>
+        <w:gridCol w:w="2880"/>
       </w:tblGrid>
       <w:tr>
         <w:tc>
           <w:tcPr>
-            <w:tcW w:type="dxa" w:w="3249"/>
-            <w:shd w:val="clear" w:color="auto" w:fill="DCE8FC"/>
+            <w:tcW w:type="dxa" w:w="2880"/>
           </w:tcPr>
           <w:p/>
         </w:tc>
         <w:tc>
           <w:tcPr>
-            <w:tcW w:type="dxa" w:w="3249"/>
-            <w:shd w:val="clear" w:color="auto" w:fill="DCE8FC"/>
+            <w:tcW w:type="dxa" w:w="2880"/>
           </w:tcPr>
           <w:p>
             <w:r>
               <w:rPr>
                 <w:b/>
-                <w:sz w:val="20"/>
               </w:rPr>
               <w:t>Jefe</w:t>
             </w:r>
@@ -1220,14 +1058,12 @@
         </w:tc>
         <w:tc>
           <w:tcPr>
-            <w:tcW w:type="dxa" w:w="3249"/>
-            <w:shd w:val="clear" w:color="auto" w:fill="DCE8FC"/>
+            <w:tcW w:type="dxa" w:w="2880"/>
           </w:tcPr>
           <w:p>
             <w:r>
               <w:rPr>
                 <w:b/>
-                <w:sz w:val="20"/>
               </w:rPr>
               <w:t>Empleado</w:t>
             </w:r>
@@ -1237,39 +1073,30 @@
       <w:tr>
         <w:tc>
           <w:tcPr>
-            <w:tcW w:type="dxa" w:w="3249"/>
+            <w:tcW w:type="dxa" w:w="2880"/>
           </w:tcPr>
           <w:p>
             <w:r>
-              <w:rPr>
-                <w:sz w:val="20"/>
-              </w:rPr>
               <w:t>Cómo entra</w:t>
             </w:r>
           </w:p>
         </w:tc>
         <w:tc>
           <w:tcPr>
-            <w:tcW w:type="dxa" w:w="3249"/>
+            <w:tcW w:type="dxa" w:w="2880"/>
           </w:tcPr>
           <w:p>
             <w:r>
-              <w:rPr>
-                <w:sz w:val="20"/>
-              </w:rPr>
               <w:t>Con su PIN (la primera vez lo crea)</w:t>
             </w:r>
           </w:p>
         </w:tc>
         <w:tc>
           <w:tcPr>
-            <w:tcW w:type="dxa" w:w="3249"/>
+            <w:tcW w:type="dxa" w:w="2880"/>
           </w:tcPr>
           <w:p>
             <w:r>
-              <w:rPr>
-                <w:sz w:val="20"/>
-              </w:rPr>
               <w:t>Con su nombre</w:t>
             </w:r>
           </w:p>
@@ -1278,39 +1105,30 @@
       <w:tr>
         <w:tc>
           <w:tcPr>
-            <w:tcW w:type="dxa" w:w="3249"/>
+            <w:tcW w:type="dxa" w:w="2880"/>
           </w:tcPr>
           <w:p>
             <w:r>
-              <w:rPr>
-                <w:sz w:val="20"/>
-              </w:rPr>
               <w:t>Qué ve</w:t>
             </w:r>
           </w:p>
         </w:tc>
         <w:tc>
           <w:tcPr>
-            <w:tcW w:type="dxa" w:w="3249"/>
+            <w:tcW w:type="dxa" w:w="2880"/>
           </w:tcPr>
           <w:p>
             <w:r>
-              <w:rPr>
-                <w:sz w:val="20"/>
-              </w:rPr>
               <w:t>Todo, en todos sus comercios</w:t>
             </w:r>
           </w:p>
         </w:tc>
         <w:tc>
           <w:tcPr>
-            <w:tcW w:type="dxa" w:w="3249"/>
+            <w:tcW w:type="dxa" w:w="2880"/>
           </w:tcPr>
           <w:p>
             <w:r>
-              <w:rPr>
-                <w:sz w:val="20"/>
-              </w:rPr>
               <w:t>Solo la Caja y lo que el jefe le habilite</w:t>
             </w:r>
           </w:p>
@@ -1319,39 +1137,30 @@
       <w:tr>
         <w:tc>
           <w:tcPr>
-            <w:tcW w:type="dxa" w:w="3249"/>
+            <w:tcW w:type="dxa" w:w="2880"/>
           </w:tcPr>
           <w:p>
             <w:r>
-              <w:rPr>
-                <w:sz w:val="20"/>
-              </w:rPr>
               <w:t>Costos y ganancia</w:t>
             </w:r>
           </w:p>
         </w:tc>
         <w:tc>
           <w:tcPr>
-            <w:tcW w:type="dxa" w:w="3249"/>
+            <w:tcW w:type="dxa" w:w="2880"/>
           </w:tcPr>
           <w:p>
             <w:r>
-              <w:rPr>
-                <w:sz w:val="20"/>
-              </w:rPr>
               <w:t>Sí</w:t>
             </w:r>
           </w:p>
         </w:tc>
         <w:tc>
           <w:tcPr>
-            <w:tcW w:type="dxa" w:w="3249"/>
+            <w:tcW w:type="dxa" w:w="2880"/>
           </w:tcPr>
           <w:p>
             <w:r>
-              <w:rPr>
-                <w:sz w:val="20"/>
-              </w:rPr>
               <w:t>No</w:t>
             </w:r>
           </w:p>
@@ -1360,39 +1169,30 @@
       <w:tr>
         <w:tc>
           <w:tcPr>
-            <w:tcW w:type="dxa" w:w="3249"/>
+            <w:tcW w:type="dxa" w:w="2880"/>
           </w:tcPr>
           <w:p>
             <w:r>
-              <w:rPr>
-                <w:sz w:val="20"/>
-              </w:rPr>
-              <w:t>Historial de cajas</w:t>
+              <w:t>Historial y ajustes de cajas</w:t>
             </w:r>
           </w:p>
         </w:tc>
         <w:tc>
           <w:tcPr>
-            <w:tcW w:type="dxa" w:w="3249"/>
+            <w:tcW w:type="dxa" w:w="2880"/>
           </w:tcPr>
           <w:p>
             <w:r>
-              <w:rPr>
-                <w:sz w:val="20"/>
-              </w:rPr>
               <w:t>Sí</w:t>
             </w:r>
           </w:p>
         </w:tc>
         <w:tc>
           <w:tcPr>
-            <w:tcW w:type="dxa" w:w="3249"/>
+            <w:tcW w:type="dxa" w:w="2880"/>
           </w:tcPr>
           <w:p>
             <w:r>
-              <w:rPr>
-                <w:sz w:val="20"/>
-              </w:rPr>
               <w:t>No</w:t>
             </w:r>
           </w:p>
@@ -1401,39 +1201,62 @@
       <w:tr>
         <w:tc>
           <w:tcPr>
-            <w:tcW w:type="dxa" w:w="3249"/>
+            <w:tcW w:type="dxa" w:w="2880"/>
           </w:tcPr>
           <w:p>
             <w:r>
-              <w:rPr>
-                <w:sz w:val="20"/>
-              </w:rPr>
+              <w:t>Cargar lo que llega (Compras)</w:t>
+            </w:r>
+          </w:p>
+        </w:tc>
+        <w:tc>
+          <w:tcPr>
+            <w:tcW w:type="dxa" w:w="2880"/>
+          </w:tcPr>
+          <w:p>
+            <w:r>
+              <w:t>Sí</w:t>
+            </w:r>
+          </w:p>
+        </w:tc>
+        <w:tc>
+          <w:tcPr>
+            <w:tcW w:type="dxa" w:w="2880"/>
+          </w:tcPr>
+          <w:p>
+            <w:r>
+              <w:t>Sí, sin ver costos (el jefe se lo puede sacar)</w:t>
+            </w:r>
+          </w:p>
+        </w:tc>
+      </w:tr>
+      <w:tr>
+        <w:tc>
+          <w:tcPr>
+            <w:tcW w:type="dxa" w:w="2880"/>
+          </w:tcPr>
+          <w:p>
+            <w:r>
               <w:t>Crear productos</w:t>
             </w:r>
           </w:p>
         </w:tc>
         <w:tc>
           <w:tcPr>
-            <w:tcW w:type="dxa" w:w="3249"/>
+            <w:tcW w:type="dxa" w:w="2880"/>
           </w:tcPr>
           <w:p>
             <w:r>
-              <w:rPr>
-                <w:sz w:val="20"/>
-              </w:rPr>
               <w:t>Sí (en Stock, o en el momento desde la Caja o Compras)</w:t>
             </w:r>
           </w:p>
         </w:tc>
         <w:tc>
           <w:tcPr>
-            <w:tcW w:type="dxa" w:w="3249"/>
+            <w:tcW w:type="dxa" w:w="2880"/>
           </w:tcPr>
           <w:p>
             <w:r>
-              <w:rPr>
-                <w:sz w:val="20"/>
-              </w:rPr>
               <w:t>No: le avisa al jefe</w:t>
             </w:r>
           </w:p>
@@ -1459,8 +1282,6 @@
       <w:r>
         <w:rPr>
           <w:rFonts w:ascii="Consolas" w:hAnsi="Consolas"/>
-          <w:color w:val="8B1A1A"/>
-          <w:sz w:val="19"/>
         </w:rPr>
         <w:t>python olvide_mi_pin.py "Nombre"</w:t>
       </w:r>
@@ -1495,6 +1316,70 @@
     </w:p>
     <w:p>
       <w:pPr>
+        <w:pStyle w:val="Heading2"/>
+      </w:pPr>
+      <w:r>
+        <w:t>Ajustes de una caja cerrada</w:t>
+      </w:r>
+    </w:p>
+    <w:p>
+      <w:r>
+        <w:t xml:space="preserve">Una caja cerrada no se cambia, porque la plata ya se contó. Si después aparece un error, el jefe entra a </w:t>
+      </w:r>
+      <w:r>
+        <w:rPr>
+          <w:b/>
+        </w:rPr>
+        <w:t>Caja → Cajas anteriores → Ajustar una caja cerrada</w:t>
+      </w:r>
+      <w:r>
+        <w:t>, elige la caja y hace uno de estos ajustes:</w:t>
+      </w:r>
+    </w:p>
+    <w:p>
+      <w:pPr>
+        <w:pStyle w:val="ListBullet"/>
+      </w:pPr>
+      <w:r>
+        <w:rPr>
+          <w:b/>
+        </w:rPr>
+        <w:t>Anular una venta</w:t>
+      </w:r>
+      <w:r>
+        <w:t xml:space="preserve"> (por ejemplo, se cobró dos veces): la venta no se borra, queda marcada como anulada. Deja de contar en reportes y paneles, y lo vendido vuelve al stock.</w:t>
+      </w:r>
+    </w:p>
+    <w:p>
+      <w:pPr>
+        <w:pStyle w:val="ListBullet"/>
+      </w:pPr>
+      <w:r>
+        <w:rPr>
+          <w:b/>
+        </w:rPr>
+        <w:t>Corregir el efectivo contado</w:t>
+      </w:r>
+      <w:r>
+        <w:t xml:space="preserve"> (por ejemplo, se contó mal un billete): se anota el nuevo conteo; el original queda guardado.</w:t>
+      </w:r>
+    </w:p>
+    <w:p>
+      <w:r>
+        <w:t xml:space="preserve">Cada ajuste pide un </w:t>
+      </w:r>
+      <w:r>
+        <w:rPr>
+          <w:b/>
+        </w:rPr>
+        <w:t>motivo</w:t>
+      </w:r>
+      <w:r>
+        <w:t xml:space="preserve"> y guarda la fecha, la hora y quién lo hizo. El historial muestra la diferencia del arqueo antes y después de los ajustes. Así nada desaparece y todo queda anotado.</w:t>
+      </w:r>
+    </w:p>
+    <w:p>
+      <w:pPr>
         <w:pStyle w:val="Heading1"/>
       </w:pPr>
       <w:r>
@@ -1518,10 +1403,6 @@
       </w:r>
     </w:p>
     <w:p>
-      <w:pPr>
-        <w:spacing w:after="60"/>
-        <w:ind w:left="510" w:hanging="340"/>
-      </w:pPr>
       <w:r>
         <w:rPr>
           <w:b/>
@@ -1540,8 +1421,6 @@
       <w:r>
         <w:rPr>
           <w:rFonts w:ascii="Consolas" w:hAnsi="Consolas"/>
-          <w:color w:val="8B1A1A"/>
-          <w:sz w:val="19"/>
         </w:rPr>
         <w:t>codigo_barras</w:t>
       </w:r>
@@ -1550,10 +1429,6 @@
       </w:r>
     </w:p>
     <w:p>
-      <w:pPr>
-        <w:spacing w:after="60"/>
-        <w:ind w:left="510" w:hanging="340"/>
-      </w:pPr>
       <w:r>
         <w:rPr>
           <w:b/>
@@ -1571,10 +1446,6 @@
       </w:r>
     </w:p>
     <w:p>
-      <w:pPr>
-        <w:spacing w:after="60"/>
-        <w:ind w:left="510" w:hanging="340"/>
-      </w:pPr>
       <w:r>
         <w:rPr>
           <w:b/>
@@ -1656,8 +1527,6 @@
       <w:r>
         <w:rPr>
           <w:rFonts w:ascii="Consolas" w:hAnsi="Consolas"/>
-          <w:color w:val="8B1A1A"/>
-          <w:sz w:val="19"/>
         </w:rPr>
         <w:t>productos</w:t>
       </w:r>
@@ -1680,117 +1549,65 @@
     </w:p>
     <w:tbl>
       <w:tblPr>
+        <w:tblStyle w:val="TableGrid"/>
         <w:tblW w:type="auto" w:w="0"/>
         <w:tblLook w:firstColumn="1" w:firstRow="1" w:lastColumn="0" w:lastRow="0" w:noHBand="0" w:noVBand="1" w:val="04A0"/>
       </w:tblPr>
       <w:tblGrid>
-        <w:gridCol w:w="9746"/>
+        <w:gridCol w:w="8640"/>
       </w:tblGrid>
       <w:tr>
         <w:tc>
           <w:tcPr>
-            <w:tcW w:type="dxa" w:w="9746"/>
-            <w:shd w:val="clear" w:color="auto" w:fill="F2F4F7"/>
+            <w:tcW w:type="dxa" w:w="8640"/>
           </w:tcPr>
           <w:p>
             <w:r>
               <w:rPr>
                 <w:rFonts w:ascii="Consolas" w:hAnsi="Consolas"/>
-                <w:sz w:val="19"/>
+                <w:sz w:val="18"/>
               </w:rPr>
               <w:t>duenos</w:t>
               <w:br/>
-            </w:r>
-            <w:r>
-              <w:rPr>
-                <w:rFonts w:ascii="Consolas" w:hAnsi="Consolas"/>
-                <w:sz w:val="19"/>
-              </w:rPr>
               <w:t xml:space="preserve">  └── comercios</w:t>
               <w:br/>
-            </w:r>
-            <w:r>
-              <w:rPr>
-                <w:rFonts w:ascii="Consolas" w:hAnsi="Consolas"/>
-                <w:sz w:val="19"/>
-              </w:rPr>
               <w:t xml:space="preserve">        ├── productos</w:t>
               <w:br/>
-            </w:r>
-            <w:r>
-              <w:rPr>
-                <w:rFonts w:ascii="Consolas" w:hAnsi="Consolas"/>
-                <w:sz w:val="19"/>
-              </w:rPr>
               <w:t xml:space="preserve">        ├── proveedores</w:t>
               <w:br/>
-            </w:r>
-            <w:r>
-              <w:rPr>
-                <w:rFonts w:ascii="Consolas" w:hAnsi="Consolas"/>
-                <w:sz w:val="19"/>
-              </w:rPr>
               <w:t xml:space="preserve">        ├── compras ── compras_detalle</w:t>
               <w:br/>
-            </w:r>
-            <w:r>
-              <w:rPr>
-                <w:rFonts w:ascii="Consolas" w:hAnsi="Consolas"/>
-                <w:sz w:val="19"/>
-              </w:rPr>
-              <w:t xml:space="preserve">        ├── cajas</w:t>
+              <w:t xml:space="preserve">        ├── cajas   ── ajustes_caja</w:t>
               <w:br/>
-            </w:r>
-            <w:r>
-              <w:rPr>
-                <w:rFonts w:ascii="Consolas" w:hAnsi="Consolas"/>
-                <w:sz w:val="19"/>
-              </w:rPr>
               <w:t xml:space="preserve">        ├── ventas  ── ventas_detalle</w:t>
               <w:br/>
-            </w:r>
-            <w:r>
-              <w:rPr>
-                <w:rFonts w:ascii="Consolas" w:hAnsi="Consolas"/>
-                <w:sz w:val="19"/>
-              </w:rPr>
               <w:t xml:space="preserve">        │     └── tickets</w:t>
               <w:br/>
-            </w:r>
-            <w:r>
-              <w:rPr>
-                <w:rFonts w:ascii="Consolas" w:hAnsi="Consolas"/>
-                <w:sz w:val="19"/>
-              </w:rPr>
               <w:t xml:space="preserve">        └── gastos</w:t>
             </w:r>
           </w:p>
         </w:tc>
       </w:tr>
     </w:tbl>
-    <w:p/>
     <w:tbl>
       <w:tblPr>
         <w:tblStyle w:val="TableGrid"/>
         <w:tblW w:type="auto" w:w="0"/>
-        <w:jc w:val="center"/>
         <w:tblLook w:firstColumn="1" w:firstRow="1" w:lastColumn="0" w:lastRow="0" w:noHBand="0" w:noVBand="1" w:val="04A0"/>
       </w:tblPr>
       <w:tblGrid>
-        <w:gridCol w:w="4873"/>
-        <w:gridCol w:w="4873"/>
+        <w:gridCol w:w="4320"/>
+        <w:gridCol w:w="4320"/>
       </w:tblGrid>
       <w:tr>
         <w:tc>
           <w:tcPr>
-            <w:tcW w:type="dxa" w:w="4873"/>
-            <w:shd w:val="clear" w:color="auto" w:fill="DCE8FC"/>
+            <w:tcW w:type="dxa" w:w="4320"/>
           </w:tcPr>
           <w:p>
             <w:r>
               <w:rPr>
                 <w:b/>
-                <w:sz w:val="20"/>
               </w:rPr>
               <w:t>Tabla</w:t>
             </w:r>
@@ -1798,14 +1615,12 @@
         </w:tc>
         <w:tc>
           <w:tcPr>
-            <w:tcW w:type="dxa" w:w="4873"/>
-            <w:shd w:val="clear" w:color="auto" w:fill="DCE8FC"/>
+            <w:tcW w:type="dxa" w:w="4320"/>
           </w:tcPr>
           <w:p>
             <w:r>
               <w:rPr>
                 <w:b/>
-                <w:sz w:val="20"/>
               </w:rPr>
               <w:t>Qué guarda</w:t>
             </w:r>
@@ -1815,14 +1630,12 @@
       <w:tr>
         <w:tc>
           <w:tcPr>
-            <w:tcW w:type="dxa" w:w="4873"/>
+            <w:tcW w:type="dxa" w:w="4320"/>
           </w:tcPr>
           <w:p>
             <w:r>
               <w:rPr>
                 <w:rFonts w:ascii="Consolas" w:hAnsi="Consolas"/>
-                <w:color w:val="8B1A1A"/>
-                <w:sz w:val="19"/>
               </w:rPr>
               <w:t>duenos</w:t>
             </w:r>
@@ -1830,13 +1643,10 @@
         </w:tc>
         <w:tc>
           <w:tcPr>
-            <w:tcW w:type="dxa" w:w="4873"/>
+            <w:tcW w:type="dxa" w:w="4320"/>
           </w:tcPr>
           <w:p>
             <w:r>
-              <w:rPr>
-                <w:sz w:val="20"/>
-              </w:rPr>
               <w:t>Los dueños y su PIN (mezclado).</w:t>
             </w:r>
           </w:p>
@@ -1845,14 +1655,12 @@
       <w:tr>
         <w:tc>
           <w:tcPr>
-            <w:tcW w:type="dxa" w:w="4873"/>
+            <w:tcW w:type="dxa" w:w="4320"/>
           </w:tcPr>
           <w:p>
             <w:r>
               <w:rPr>
                 <w:rFonts w:ascii="Consolas" w:hAnsi="Consolas"/>
-                <w:color w:val="8B1A1A"/>
-                <w:sz w:val="19"/>
               </w:rPr>
               <w:t>comercios</w:t>
             </w:r>
@@ -1860,13 +1668,10 @@
         </w:tc>
         <w:tc>
           <w:tcPr>
-            <w:tcW w:type="dxa" w:w="4873"/>
+            <w:tcW w:type="dxa" w:w="4320"/>
           </w:tcPr>
           <w:p>
             <w:r>
-              <w:rPr>
-                <w:sz w:val="20"/>
-              </w:rPr>
               <w:t>Cada comercio: rubro, dirección, si da ticket, si guarda el resumen semanal y qué ve el empleado.</w:t>
             </w:r>
           </w:p>
@@ -1875,14 +1680,12 @@
       <w:tr>
         <w:tc>
           <w:tcPr>
-            <w:tcW w:type="dxa" w:w="4873"/>
+            <w:tcW w:type="dxa" w:w="4320"/>
           </w:tcPr>
           <w:p>
             <w:r>
               <w:rPr>
                 <w:rFonts w:ascii="Consolas" w:hAnsi="Consolas"/>
-                <w:color w:val="8B1A1A"/>
-                <w:sz w:val="19"/>
               </w:rPr>
               <w:t>productos</w:t>
             </w:r>
@@ -1890,13 +1693,10 @@
         </w:tc>
         <w:tc>
           <w:tcPr>
-            <w:tcW w:type="dxa" w:w="4873"/>
+            <w:tcW w:type="dxa" w:w="4320"/>
           </w:tcPr>
           <w:p>
             <w:r>
-              <w:rPr>
-                <w:sz w:val="20"/>
-              </w:rPr>
               <w:t>Código interno, código de barras, nombre, categoría, costo, precio, stock y stock mínimo.</w:t>
             </w:r>
           </w:p>
@@ -1905,14 +1705,12 @@
       <w:tr>
         <w:tc>
           <w:tcPr>
-            <w:tcW w:type="dxa" w:w="4873"/>
+            <w:tcW w:type="dxa" w:w="4320"/>
           </w:tcPr>
           <w:p>
             <w:r>
               <w:rPr>
                 <w:rFonts w:ascii="Consolas" w:hAnsi="Consolas"/>
-                <w:color w:val="8B1A1A"/>
-                <w:sz w:val="19"/>
               </w:rPr>
               <w:t>proveedores</w:t>
             </w:r>
@@ -1920,13 +1718,10 @@
         </w:tc>
         <w:tc>
           <w:tcPr>
-            <w:tcW w:type="dxa" w:w="4873"/>
+            <w:tcW w:type="dxa" w:w="4320"/>
           </w:tcPr>
           <w:p>
             <w:r>
-              <w:rPr>
-                <w:sz w:val="20"/>
-              </w:rPr>
               <w:t>A quién le compra cada comercio.</w:t>
             </w:r>
           </w:p>
@@ -1935,28 +1730,21 @@
       <w:tr>
         <w:tc>
           <w:tcPr>
-            <w:tcW w:type="dxa" w:w="4873"/>
+            <w:tcW w:type="dxa" w:w="4320"/>
           </w:tcPr>
           <w:p>
             <w:r>
               <w:rPr>
                 <w:rFonts w:ascii="Consolas" w:hAnsi="Consolas"/>
-                <w:color w:val="8B1A1A"/>
-                <w:sz w:val="19"/>
               </w:rPr>
               <w:t>compras</w:t>
             </w:r>
             <w:r>
-              <w:rPr>
-                <w:sz w:val="20"/>
-              </w:rPr>
               <w:t xml:space="preserve"> y </w:t>
             </w:r>
             <w:r>
               <w:rPr>
                 <w:rFonts w:ascii="Consolas" w:hAnsi="Consolas"/>
-                <w:color w:val="8B1A1A"/>
-                <w:sz w:val="19"/>
               </w:rPr>
               <w:t>compras_detalle</w:t>
             </w:r>
@@ -1964,14 +1752,11 @@
         </w:tc>
         <w:tc>
           <w:tcPr>
-            <w:tcW w:type="dxa" w:w="4873"/>
+            <w:tcW w:type="dxa" w:w="4320"/>
           </w:tcPr>
           <w:p>
             <w:r>
-              <w:rPr>
-                <w:sz w:val="20"/>
-              </w:rPr>
-              <w:t>Cada compra (fecha, proveedor, total) y sus productos.</w:t>
+              <w:t>Cada compra (fecha, proveedor, total, quién la cargó) y sus productos.</w:t>
             </w:r>
           </w:p>
         </w:tc>
@@ -1979,14 +1764,12 @@
       <w:tr>
         <w:tc>
           <w:tcPr>
-            <w:tcW w:type="dxa" w:w="4873"/>
+            <w:tcW w:type="dxa" w:w="4320"/>
           </w:tcPr>
           <w:p>
             <w:r>
               <w:rPr>
                 <w:rFonts w:ascii="Consolas" w:hAnsi="Consolas"/>
-                <w:color w:val="8B1A1A"/>
-                <w:sz w:val="19"/>
               </w:rPr>
               <w:t>cajas</w:t>
             </w:r>
@@ -1994,13 +1777,10 @@
         </w:tc>
         <w:tc>
           <w:tcPr>
-            <w:tcW w:type="dxa" w:w="4873"/>
+            <w:tcW w:type="dxa" w:w="4320"/>
           </w:tcPr>
           <w:p>
             <w:r>
-              <w:rPr>
-                <w:sz w:val="20"/>
-              </w:rPr>
               <w:t>Quién abrió, cuándo, efectivo inicial; al cerrar, efectivo esperado, contado y nota.</w:t>
             </w:r>
           </w:p>
@@ -2009,28 +1789,46 @@
       <w:tr>
         <w:tc>
           <w:tcPr>
-            <w:tcW w:type="dxa" w:w="4873"/>
+            <w:tcW w:type="dxa" w:w="4320"/>
           </w:tcPr>
           <w:p>
             <w:r>
               <w:rPr>
                 <w:rFonts w:ascii="Consolas" w:hAnsi="Consolas"/>
-                <w:color w:val="8B1A1A"/>
-                <w:sz w:val="19"/>
+              </w:rPr>
+              <w:t>ajustes_caja</w:t>
+            </w:r>
+          </w:p>
+        </w:tc>
+        <w:tc>
+          <w:tcPr>
+            <w:tcW w:type="dxa" w:w="4320"/>
+          </w:tcPr>
+          <w:p>
+            <w:r>
+              <w:t>Las correcciones a cajas cerradas: cuándo, quién, qué (anular venta o recontar), monto y motivo.</w:t>
+            </w:r>
+          </w:p>
+        </w:tc>
+      </w:tr>
+      <w:tr>
+        <w:tc>
+          <w:tcPr>
+            <w:tcW w:type="dxa" w:w="4320"/>
+          </w:tcPr>
+          <w:p>
+            <w:r>
+              <w:rPr>
+                <w:rFonts w:ascii="Consolas" w:hAnsi="Consolas"/>
               </w:rPr>
               <w:t>ventas</w:t>
             </w:r>
             <w:r>
-              <w:rPr>
-                <w:sz w:val="20"/>
-              </w:rPr>
               <w:t xml:space="preserve"> y </w:t>
             </w:r>
             <w:r>
               <w:rPr>
                 <w:rFonts w:ascii="Consolas" w:hAnsi="Consolas"/>
-                <w:color w:val="8B1A1A"/>
-                <w:sz w:val="19"/>
               </w:rPr>
               <w:t>ventas_detalle</w:t>
             </w:r>
@@ -2038,26 +1836,19 @@
         </w:tc>
         <w:tc>
           <w:tcPr>
-            <w:tcW w:type="dxa" w:w="4873"/>
+            <w:tcW w:type="dxa" w:w="4320"/>
           </w:tcPr>
           <w:p>
             <w:r>
-              <w:rPr>
-                <w:sz w:val="20"/>
-              </w:rPr>
-              <w:t xml:space="preserve">Cada venta (fecha, medio de pago, total, caja) y sus productos con el precio </w:t>
+              <w:t xml:space="preserve">Cada venta (fecha, medio de pago, total, caja, si se anuló) y sus productos con el precio </w:t>
             </w:r>
             <w:r>
               <w:rPr>
                 <w:b/>
-                <w:sz w:val="20"/>
               </w:rPr>
               <w:t>y el costo de ese día</w:t>
             </w:r>
             <w:r>
-              <w:rPr>
-                <w:sz w:val="20"/>
-              </w:rPr>
               <w:t>.</w:t>
             </w:r>
           </w:p>
@@ -2066,14 +1857,12 @@
       <w:tr>
         <w:tc>
           <w:tcPr>
-            <w:tcW w:type="dxa" w:w="4873"/>
+            <w:tcW w:type="dxa" w:w="4320"/>
           </w:tcPr>
           <w:p>
             <w:r>
               <w:rPr>
                 <w:rFonts w:ascii="Consolas" w:hAnsi="Consolas"/>
-                <w:color w:val="8B1A1A"/>
-                <w:sz w:val="19"/>
               </w:rPr>
               <w:t>tickets</w:t>
             </w:r>
@@ -2081,13 +1870,10 @@
         </w:tc>
         <w:tc>
           <w:tcPr>
-            <w:tcW w:type="dxa" w:w="4873"/>
+            <w:tcW w:type="dxa" w:w="4320"/>
           </w:tcPr>
           <w:p>
             <w:r>
-              <w:rPr>
-                <w:sz w:val="20"/>
-              </w:rPr>
               <w:t>El número de ticket de las ventas que lo pidieron.</w:t>
             </w:r>
           </w:p>
@@ -2096,14 +1882,12 @@
       <w:tr>
         <w:tc>
           <w:tcPr>
-            <w:tcW w:type="dxa" w:w="4873"/>
+            <w:tcW w:type="dxa" w:w="4320"/>
           </w:tcPr>
           <w:p>
             <w:r>
               <w:rPr>
                 <w:rFonts w:ascii="Consolas" w:hAnsi="Consolas"/>
-                <w:color w:val="8B1A1A"/>
-                <w:sz w:val="19"/>
               </w:rPr>
               <w:t>gastos</w:t>
             </w:r>
@@ -2111,13 +1895,10 @@
         </w:tc>
         <w:tc>
           <w:tcPr>
-            <w:tcW w:type="dxa" w:w="4873"/>
+            <w:tcW w:type="dxa" w:w="4320"/>
           </w:tcPr>
           <w:p>
             <w:r>
-              <w:rPr>
-                <w:sz w:val="20"/>
-              </w:rPr>
               <w:t>Gastos del comercio por fecha y categoría.</w:t>
             </w:r>
           </w:p>
@@ -2138,8 +1919,6 @@
       <w:r>
         <w:rPr>
           <w:rFonts w:ascii="Consolas" w:hAnsi="Consolas"/>
-          <w:color w:val="8B1A1A"/>
-          <w:sz w:val="19"/>
         </w:rPr>
         <w:t>ventas</w:t>
       </w:r>
@@ -2149,8 +1928,6 @@
       <w:r>
         <w:rPr>
           <w:rFonts w:ascii="Consolas" w:hAnsi="Consolas"/>
-          <w:color w:val="8B1A1A"/>
-          <w:sz w:val="19"/>
         </w:rPr>
         <w:t>ventas_detalle</w:t>
       </w:r>
@@ -2178,10 +1955,6 @@
       </w:r>
     </w:p>
     <w:p>
-      <w:pPr>
-        <w:spacing w:after="60"/>
-        <w:ind w:left="510" w:hanging="340"/>
-      </w:pPr>
       <w:r>
         <w:rPr>
           <w:b/>
@@ -2193,10 +1966,6 @@
       </w:r>
     </w:p>
     <w:p>
-      <w:pPr>
-        <w:spacing w:after="60"/>
-        <w:ind w:left="510" w:hanging="340"/>
-      </w:pPr>
       <w:r>
         <w:rPr>
           <w:b/>
@@ -2209,8 +1978,6 @@
       <w:r>
         <w:rPr>
           <w:rFonts w:ascii="Consolas" w:hAnsi="Consolas"/>
-          <w:color w:val="8B1A1A"/>
-          <w:sz w:val="19"/>
         </w:rPr>
         <w:t>ventas</w:t>
       </w:r>
@@ -2219,10 +1986,6 @@
       </w:r>
     </w:p>
     <w:p>
-      <w:pPr>
-        <w:spacing w:after="60"/>
-        <w:ind w:left="510" w:hanging="340"/>
-      </w:pPr>
       <w:r>
         <w:rPr>
           <w:b/>
@@ -2235,8 +1998,6 @@
       <w:r>
         <w:rPr>
           <w:rFonts w:ascii="Consolas" w:hAnsi="Consolas"/>
-          <w:color w:val="8B1A1A"/>
-          <w:sz w:val="19"/>
         </w:rPr>
         <w:t>ventas_detalle</w:t>
       </w:r>
@@ -2245,10 +2006,6 @@
       </w:r>
     </w:p>
     <w:p>
-      <w:pPr>
-        <w:spacing w:after="60"/>
-        <w:ind w:left="510" w:hanging="340"/>
-      </w:pPr>
       <w:r>
         <w:rPr>
           <w:b/>
@@ -2261,8 +2018,6 @@
       <w:r>
         <w:rPr>
           <w:rFonts w:ascii="Consolas" w:hAnsi="Consolas"/>
-          <w:color w:val="8B1A1A"/>
-          <w:sz w:val="19"/>
         </w:rPr>
         <w:t>productos</w:t>
       </w:r>
@@ -2271,10 +2026,6 @@
       </w:r>
     </w:p>
     <w:p>
-      <w:pPr>
-        <w:spacing w:after="60"/>
-        <w:ind w:left="510" w:hanging="340"/>
-      </w:pPr>
       <w:r>
         <w:rPr>
           <w:b/>
@@ -2287,8 +2038,6 @@
       <w:r>
         <w:rPr>
           <w:rFonts w:ascii="Consolas" w:hAnsi="Consolas"/>
-          <w:color w:val="8B1A1A"/>
-          <w:sz w:val="19"/>
         </w:rPr>
         <w:t>tickets</w:t>
       </w:r>
@@ -2325,8 +2074,6 @@
       <w:r>
         <w:rPr>
           <w:rFonts w:ascii="Consolas" w:hAnsi="Consolas"/>
-          <w:color w:val="8B1A1A"/>
-          <w:sz w:val="19"/>
         </w:rPr>
         <w:t>codigo</w:t>
       </w:r>
@@ -2336,8 +2083,6 @@
       <w:r>
         <w:rPr>
           <w:rFonts w:ascii="Consolas" w:hAnsi="Consolas"/>
-          <w:color w:val="8B1A1A"/>
-          <w:sz w:val="19"/>
         </w:rPr>
         <w:t>nombre</w:t>
       </w:r>
@@ -2347,8 +2092,6 @@
       <w:r>
         <w:rPr>
           <w:rFonts w:ascii="Consolas" w:hAnsi="Consolas"/>
-          <w:color w:val="8B1A1A"/>
-          <w:sz w:val="19"/>
         </w:rPr>
         <w:t>precio_costo</w:t>
       </w:r>
@@ -2358,8 +2101,6 @@
       <w:r>
         <w:rPr>
           <w:rFonts w:ascii="Consolas" w:hAnsi="Consolas"/>
-          <w:color w:val="8B1A1A"/>
-          <w:sz w:val="19"/>
         </w:rPr>
         <w:t>precio_venta</w:t>
       </w:r>
@@ -2369,8 +2110,6 @@
       <w:r>
         <w:rPr>
           <w:rFonts w:ascii="Consolas" w:hAnsi="Consolas"/>
-          <w:color w:val="8B1A1A"/>
-          <w:sz w:val="19"/>
         </w:rPr>
         <w:t>stock</w:t>
       </w:r>
@@ -2380,8 +2119,6 @@
       <w:r>
         <w:rPr>
           <w:rFonts w:ascii="Consolas" w:hAnsi="Consolas"/>
-          <w:color w:val="8B1A1A"/>
-          <w:sz w:val="19"/>
         </w:rPr>
         <w:t>categoria</w:t>
       </w:r>
@@ -2391,8 +2128,6 @@
       <w:r>
         <w:rPr>
           <w:rFonts w:ascii="Consolas" w:hAnsi="Consolas"/>
-          <w:color w:val="8B1A1A"/>
-          <w:sz w:val="19"/>
         </w:rPr>
         <w:t>stock_minimo</w:t>
       </w:r>
@@ -2402,8 +2137,6 @@
       <w:r>
         <w:rPr>
           <w:rFonts w:ascii="Consolas" w:hAnsi="Consolas"/>
-          <w:color w:val="8B1A1A"/>
-          <w:sz w:val="19"/>
         </w:rPr>
         <w:t>codigo_barras</w:t>
       </w:r>
@@ -2441,8 +2174,6 @@
       <w:r>
         <w:rPr>
           <w:rFonts w:ascii="Consolas" w:hAnsi="Consolas"/>
-          <w:color w:val="8B1A1A"/>
-          <w:sz w:val="19"/>
         </w:rPr>
         <w:t>reportes/&lt;comercio&gt;/mensuales</w:t>
       </w:r>
@@ -2462,24 +2193,21 @@
       <w:tblPr>
         <w:tblStyle w:val="TableGrid"/>
         <w:tblW w:type="auto" w:w="0"/>
-        <w:jc w:val="center"/>
         <w:tblLook w:firstColumn="1" w:firstRow="1" w:lastColumn="0" w:lastRow="0" w:noHBand="0" w:noVBand="1" w:val="04A0"/>
       </w:tblPr>
       <w:tblGrid>
-        <w:gridCol w:w="4873"/>
-        <w:gridCol w:w="4873"/>
+        <w:gridCol w:w="4320"/>
+        <w:gridCol w:w="4320"/>
       </w:tblGrid>
       <w:tr>
         <w:tc>
           <w:tcPr>
-            <w:tcW w:type="dxa" w:w="4873"/>
-            <w:shd w:val="clear" w:color="auto" w:fill="DCE8FC"/>
+            <w:tcW w:type="dxa" w:w="4320"/>
           </w:tcPr>
           <w:p>
             <w:r>
               <w:rPr>
                 <w:b/>
-                <w:sz w:val="20"/>
               </w:rPr>
               <w:t>Archivo</w:t>
             </w:r>
@@ -2487,14 +2215,12 @@
         </w:tc>
         <w:tc>
           <w:tcPr>
-            <w:tcW w:type="dxa" w:w="4873"/>
-            <w:shd w:val="clear" w:color="auto" w:fill="DCE8FC"/>
+            <w:tcW w:type="dxa" w:w="4320"/>
           </w:tcPr>
           <w:p>
             <w:r>
               <w:rPr>
                 <w:b/>
-                <w:sz w:val="20"/>
               </w:rPr>
               <w:t>Para qué sirve</w:t>
             </w:r>
@@ -2504,14 +2230,12 @@
       <w:tr>
         <w:tc>
           <w:tcPr>
-            <w:tcW w:type="dxa" w:w="4873"/>
+            <w:tcW w:type="dxa" w:w="4320"/>
           </w:tcPr>
           <w:p>
             <w:r>
               <w:rPr>
                 <w:rFonts w:ascii="Consolas" w:hAnsi="Consolas"/>
-                <w:color w:val="8B1A1A"/>
-                <w:sz w:val="19"/>
               </w:rPr>
               <w:t>app.py</w:t>
             </w:r>
@@ -2519,13 +2243,10 @@
         </w:tc>
         <w:tc>
           <w:tcPr>
-            <w:tcW w:type="dxa" w:w="4873"/>
+            <w:tcW w:type="dxa" w:w="4320"/>
           </w:tcPr>
           <w:p>
             <w:r>
-              <w:rPr>
-                <w:sz w:val="20"/>
-              </w:rPr>
               <w:t>Arranca el sistema, prepara la base y arma el menú según quién entró.</w:t>
             </w:r>
           </w:p>
@@ -2534,14 +2255,12 @@
       <w:tr>
         <w:tc>
           <w:tcPr>
-            <w:tcW w:type="dxa" w:w="4873"/>
+            <w:tcW w:type="dxa" w:w="4320"/>
           </w:tcPr>
           <w:p>
             <w:r>
               <w:rPr>
                 <w:rFonts w:ascii="Consolas" w:hAnsi="Consolas"/>
-                <w:color w:val="8B1A1A"/>
-                <w:sz w:val="19"/>
               </w:rPr>
               <w:t>ingreso.py</w:t>
             </w:r>
@@ -2549,13 +2268,10 @@
         </w:tc>
         <w:tc>
           <w:tcPr>
-            <w:tcW w:type="dxa" w:w="4873"/>
+            <w:tcW w:type="dxa" w:w="4320"/>
           </w:tcPr>
           <w:p>
             <w:r>
-              <w:rPr>
-                <w:sz w:val="20"/>
-              </w:rPr>
               <w:t>La pantalla para entrar como jefe o empleado.</w:t>
             </w:r>
           </w:p>
@@ -2564,14 +2280,12 @@
       <w:tr>
         <w:tc>
           <w:tcPr>
-            <w:tcW w:type="dxa" w:w="4873"/>
+            <w:tcW w:type="dxa" w:w="4320"/>
           </w:tcPr>
           <w:p>
             <w:r>
               <w:rPr>
                 <w:rFonts w:ascii="Consolas" w:hAnsi="Consolas"/>
-                <w:color w:val="8B1A1A"/>
-                <w:sz w:val="19"/>
               </w:rPr>
               <w:t>paginas/</w:t>
             </w:r>
@@ -2579,13 +2293,10 @@
         </w:tc>
         <w:tc>
           <w:tcPr>
-            <w:tcW w:type="dxa" w:w="4873"/>
+            <w:tcW w:type="dxa" w:w="4320"/>
           </w:tcPr>
           <w:p>
             <w:r>
-              <w:rPr>
-                <w:sz w:val="20"/>
-              </w:rPr>
               <w:t>Una pantalla por archivo (caja, compras, stock, etc.).</w:t>
             </w:r>
           </w:p>
@@ -2594,14 +2305,12 @@
       <w:tr>
         <w:tc>
           <w:tcPr>
-            <w:tcW w:type="dxa" w:w="4873"/>
+            <w:tcW w:type="dxa" w:w="4320"/>
           </w:tcPr>
           <w:p>
             <w:r>
               <w:rPr>
                 <w:rFonts w:ascii="Consolas" w:hAnsi="Consolas"/>
-                <w:color w:val="8B1A1A"/>
-                <w:sz w:val="19"/>
               </w:rPr>
               <w:t>operaciones.py</w:t>
             </w:r>
@@ -2609,13 +2318,10 @@
         </w:tc>
         <w:tc>
           <w:tcPr>
-            <w:tcW w:type="dxa" w:w="4873"/>
+            <w:tcW w:type="dxa" w:w="4320"/>
           </w:tcPr>
           <w:p>
             <w:r>
-              <w:rPr>
-                <w:sz w:val="20"/>
-              </w:rPr>
               <w:t>Todas las lecturas y escrituras en la base.</w:t>
             </w:r>
           </w:p>
@@ -2624,14 +2330,12 @@
       <w:tr>
         <w:tc>
           <w:tcPr>
-            <w:tcW w:type="dxa" w:w="4873"/>
+            <w:tcW w:type="dxa" w:w="4320"/>
           </w:tcPr>
           <w:p>
             <w:r>
               <w:rPr>
                 <w:rFonts w:ascii="Consolas" w:hAnsi="Consolas"/>
-                <w:color w:val="8B1A1A"/>
-                <w:sz w:val="19"/>
               </w:rPr>
               <w:t>base_datos.py</w:t>
             </w:r>
@@ -2639,13 +2343,10 @@
         </w:tc>
         <w:tc>
           <w:tcPr>
-            <w:tcW w:type="dxa" w:w="4873"/>
+            <w:tcW w:type="dxa" w:w="4320"/>
           </w:tcPr>
           <w:p>
             <w:r>
-              <w:rPr>
-                <w:sz w:val="20"/>
-              </w:rPr>
               <w:t>Define las tablas y las actualiza solas.</w:t>
             </w:r>
           </w:p>
@@ -2654,14 +2355,12 @@
       <w:tr>
         <w:tc>
           <w:tcPr>
-            <w:tcW w:type="dxa" w:w="4873"/>
+            <w:tcW w:type="dxa" w:w="4320"/>
           </w:tcPr>
           <w:p>
             <w:r>
               <w:rPr>
                 <w:rFonts w:ascii="Consolas" w:hAnsi="Consolas"/>
-                <w:color w:val="8B1A1A"/>
-                <w:sz w:val="19"/>
               </w:rPr>
               <w:t>config.py</w:t>
             </w:r>
@@ -2669,13 +2368,10 @@
         </w:tc>
         <w:tc>
           <w:tcPr>
-            <w:tcW w:type="dxa" w:w="4873"/>
+            <w:tcW w:type="dxa" w:w="4320"/>
           </w:tcPr>
           <w:p>
             <w:r>
-              <w:rPr>
-                <w:sz w:val="20"/>
-              </w:rPr>
               <w:t>Dice dónde está la base y si está en modo demo.</w:t>
             </w:r>
           </w:p>
@@ -2684,14 +2380,12 @@
       <w:tr>
         <w:tc>
           <w:tcPr>
-            <w:tcW w:type="dxa" w:w="4873"/>
+            <w:tcW w:type="dxa" w:w="4320"/>
           </w:tcPr>
           <w:p>
             <w:r>
               <w:rPr>
                 <w:rFonts w:ascii="Consolas" w:hAnsi="Consolas"/>
-                <w:color w:val="8B1A1A"/>
-                <w:sz w:val="19"/>
               </w:rPr>
               <w:t>comun.py</w:t>
             </w:r>
@@ -2699,13 +2393,10 @@
         </w:tc>
         <w:tc>
           <w:tcPr>
-            <w:tcW w:type="dxa" w:w="4873"/>
+            <w:tcW w:type="dxa" w:w="4320"/>
           </w:tcPr>
           <w:p>
             <w:r>
-              <w:rPr>
-                <w:sz w:val="20"/>
-              </w:rPr>
               <w:t>Lo que comparten las pantallas: formato de pesos, medios de pago, permisos, el lector.</w:t>
             </w:r>
           </w:p>
@@ -2714,14 +2405,12 @@
       <w:tr>
         <w:tc>
           <w:tcPr>
-            <w:tcW w:type="dxa" w:w="4873"/>
+            <w:tcW w:type="dxa" w:w="4320"/>
           </w:tcPr>
           <w:p>
             <w:r>
               <w:rPr>
                 <w:rFonts w:ascii="Consolas" w:hAnsi="Consolas"/>
-                <w:color w:val="8B1A1A"/>
-                <w:sz w:val="19"/>
               </w:rPr>
               <w:t>reportes.py</w:t>
             </w:r>
@@ -2729,13 +2418,10 @@
         </w:tc>
         <w:tc>
           <w:tcPr>
-            <w:tcW w:type="dxa" w:w="4873"/>
+            <w:tcW w:type="dxa" w:w="4320"/>
           </w:tcPr>
           <w:p>
             <w:r>
-              <w:rPr>
-                <w:sz w:val="20"/>
-              </w:rPr>
               <w:t>Arma los Excel de reportes con gráficos.</w:t>
             </w:r>
           </w:p>
@@ -2744,14 +2430,12 @@
       <w:tr>
         <w:tc>
           <w:tcPr>
-            <w:tcW w:type="dxa" w:w="4873"/>
+            <w:tcW w:type="dxa" w:w="4320"/>
           </w:tcPr>
           <w:p>
             <w:r>
               <w:rPr>
                 <w:rFonts w:ascii="Consolas" w:hAnsi="Consolas"/>
-                <w:color w:val="8B1A1A"/>
-                <w:sz w:val="19"/>
               </w:rPr>
               <w:t>ticket.py</w:t>
             </w:r>
@@ -2759,13 +2443,10 @@
         </w:tc>
         <w:tc>
           <w:tcPr>
-            <w:tcW w:type="dxa" w:w="4873"/>
+            <w:tcW w:type="dxa" w:w="4320"/>
           </w:tcPr>
           <w:p>
             <w:r>
-              <w:rPr>
-                <w:sz w:val="20"/>
-              </w:rPr>
               <w:t>Arma el ticket en PDF.</w:t>
             </w:r>
           </w:p>
@@ -2774,14 +2455,12 @@
       <w:tr>
         <w:tc>
           <w:tcPr>
-            <w:tcW w:type="dxa" w:w="4873"/>
+            <w:tcW w:type="dxa" w:w="4320"/>
           </w:tcPr>
           <w:p>
             <w:r>
               <w:rPr>
                 <w:rFonts w:ascii="Consolas" w:hAnsi="Consolas"/>
-                <w:color w:val="8B1A1A"/>
-                <w:sz w:val="19"/>
               </w:rPr>
               <w:t>generar_datos_prueba.py</w:t>
             </w:r>
@@ -2789,13 +2468,10 @@
         </w:tc>
         <w:tc>
           <w:tcPr>
-            <w:tcW w:type="dxa" w:w="4873"/>
+            <w:tcW w:type="dxa" w:w="4320"/>
           </w:tcPr>
           <w:p>
             <w:r>
-              <w:rPr>
-                <w:sz w:val="20"/>
-              </w:rPr>
               <w:t>Crea 2 dueños, 4 comercios y 6 meses y medio de ventas de prueba.</w:t>
             </w:r>
           </w:p>
@@ -2804,14 +2480,12 @@
       <w:tr>
         <w:tc>
           <w:tcPr>
-            <w:tcW w:type="dxa" w:w="4873"/>
+            <w:tcW w:type="dxa" w:w="4320"/>
           </w:tcPr>
           <w:p>
             <w:r>
               <w:rPr>
                 <w:rFonts w:ascii="Consolas" w:hAnsi="Consolas"/>
-                <w:color w:val="8B1A1A"/>
-                <w:sz w:val="19"/>
               </w:rPr>
               <w:t>ver_resumen.py</w:t>
             </w:r>
@@ -2819,13 +2493,10 @@
         </w:tc>
         <w:tc>
           <w:tcPr>
-            <w:tcW w:type="dxa" w:w="4873"/>
+            <w:tcW w:type="dxa" w:w="4320"/>
           </w:tcPr>
           <w:p>
             <w:r>
-              <w:rPr>
-                <w:sz w:val="20"/>
-              </w:rPr>
               <w:t>Consultas SQL de ejemplo.</w:t>
             </w:r>
           </w:p>
@@ -2834,14 +2505,12 @@
       <w:tr>
         <w:tc>
           <w:tcPr>
-            <w:tcW w:type="dxa" w:w="4873"/>
+            <w:tcW w:type="dxa" w:w="4320"/>
           </w:tcPr>
           <w:p>
             <w:r>
               <w:rPr>
                 <w:rFonts w:ascii="Consolas" w:hAnsi="Consolas"/>
-                <w:color w:val="8B1A1A"/>
-                <w:sz w:val="19"/>
               </w:rPr>
               <w:t>olvide_mi_pin.py</w:t>
             </w:r>
@@ -2849,13 +2518,10 @@
         </w:tc>
         <w:tc>
           <w:tcPr>
-            <w:tcW w:type="dxa" w:w="4873"/>
+            <w:tcW w:type="dxa" w:w="4320"/>
           </w:tcPr>
           <w:p>
             <w:r>
-              <w:rPr>
-                <w:sz w:val="20"/>
-              </w:rPr>
               <w:t>Borra el PIN del jefe si se lo olvidó.</w:t>
             </w:r>
           </w:p>
@@ -2864,14 +2530,12 @@
       <w:tr>
         <w:tc>
           <w:tcPr>
-            <w:tcW w:type="dxa" w:w="4873"/>
+            <w:tcW w:type="dxa" w:w="4320"/>
           </w:tcPr>
           <w:p>
             <w:r>
               <w:rPr>
                 <w:rFonts w:ascii="Consolas" w:hAnsi="Consolas"/>
-                <w:color w:val="8B1A1A"/>
-                <w:sz w:val="19"/>
               </w:rPr>
               <w:t>esquema.sql</w:t>
             </w:r>
@@ -2879,13 +2543,10 @@
         </w:tc>
         <w:tc>
           <w:tcPr>
-            <w:tcW w:type="dxa" w:w="4873"/>
+            <w:tcW w:type="dxa" w:w="4320"/>
           </w:tcPr>
           <w:p>
             <w:r>
-              <w:rPr>
-                <w:sz w:val="20"/>
-              </w:rPr>
               <w:t>El SQL de las tablas, para leerlo.</w:t>
             </w:r>
           </w:p>
@@ -2894,14 +2555,12 @@
       <w:tr>
         <w:tc>
           <w:tcPr>
-            <w:tcW w:type="dxa" w:w="4873"/>
+            <w:tcW w:type="dxa" w:w="4320"/>
           </w:tcPr>
           <w:p>
             <w:r>
               <w:rPr>
                 <w:rFonts w:ascii="Consolas" w:hAnsi="Consolas"/>
-                <w:color w:val="8B1A1A"/>
-                <w:sz w:val="19"/>
               </w:rPr>
               <w:t>iniciar.bat</w:t>
             </w:r>
@@ -2909,13 +2568,10 @@
         </w:tc>
         <w:tc>
           <w:tcPr>
-            <w:tcW w:type="dxa" w:w="4873"/>
+            <w:tcW w:type="dxa" w:w="4320"/>
           </w:tcPr>
           <w:p>
             <w:r>
-              <w:rPr>
-                <w:sz w:val="20"/>
-              </w:rPr>
               <w:t>Doble clic para abrir el sistema en Windows.</w:t>
             </w:r>
           </w:p>
@@ -2924,14 +2580,12 @@
       <w:tr>
         <w:tc>
           <w:tcPr>
-            <w:tcW w:type="dxa" w:w="4873"/>
+            <w:tcW w:type="dxa" w:w="4320"/>
           </w:tcPr>
           <w:p>
             <w:r>
               <w:rPr>
                 <w:rFonts w:ascii="Consolas" w:hAnsi="Consolas"/>
-                <w:color w:val="8B1A1A"/>
-                <w:sz w:val="19"/>
               </w:rPr>
               <w:t>mini_sistema.db</w:t>
             </w:r>
@@ -2939,13 +2593,10 @@
         </w:tc>
         <w:tc>
           <w:tcPr>
-            <w:tcW w:type="dxa" w:w="4873"/>
+            <w:tcW w:type="dxa" w:w="4320"/>
           </w:tcPr>
           <w:p>
             <w:r>
-              <w:rPr>
-                <w:sz w:val="20"/>
-              </w:rPr>
               <w:t>La base de datos (no se sube a GitHub).</w:t>
             </w:r>
           </w:p>
@@ -2954,14 +2605,12 @@
       <w:tr>
         <w:tc>
           <w:tcPr>
-            <w:tcW w:type="dxa" w:w="4873"/>
+            <w:tcW w:type="dxa" w:w="4320"/>
           </w:tcPr>
           <w:p>
             <w:r>
               <w:rPr>
                 <w:rFonts w:ascii="Consolas" w:hAnsi="Consolas"/>
-                <w:color w:val="8B1A1A"/>
-                <w:sz w:val="19"/>
               </w:rPr>
               <w:t>informe/</w:t>
             </w:r>
@@ -2969,13 +2618,10 @@
         </w:tc>
         <w:tc>
           <w:tcPr>
-            <w:tcW w:type="dxa" w:w="4873"/>
+            <w:tcW w:type="dxa" w:w="4320"/>
           </w:tcPr>
           <w:p>
             <w:r>
-              <w:rPr>
-                <w:sz w:val="20"/>
-              </w:rPr>
               <w:t>Guía, plan, capturas y Excel de ejemplo.</w:t>
             </w:r>
           </w:p>
@@ -3024,8 +2670,6 @@
       <w:r>
         <w:rPr>
           <w:rFonts w:ascii="Consolas" w:hAnsi="Consolas"/>
-          <w:color w:val="8B1A1A"/>
-          <w:sz w:val="19"/>
         </w:rPr>
         <w:t>.gitignore</w:t>
       </w:r>
@@ -3049,8 +2693,6 @@
       <w:r>
         <w:rPr>
           <w:rFonts w:ascii="Consolas" w:hAnsi="Consolas"/>
-          <w:color w:val="8B1A1A"/>
-          <w:sz w:val="19"/>
         </w:rPr>
         <w:t>MODO_DEMO = "1"</w:t>
       </w:r>
@@ -3094,8 +2736,6 @@
       <w:r>
         <w:rPr>
           <w:rFonts w:ascii="Consolas" w:hAnsi="Consolas"/>
-          <w:color w:val="8B1A1A"/>
-          <w:sz w:val="19"/>
         </w:rPr>
         <w:t>correr_script</w:t>
       </w:r>
@@ -3105,8 +2745,6 @@
       <w:r>
         <w:rPr>
           <w:rFonts w:ascii="Consolas" w:hAnsi="Consolas"/>
-          <w:color w:val="8B1A1A"/>
-          <w:sz w:val="19"/>
         </w:rPr>
         <w:t>comun.py</w:t>
       </w:r>
@@ -3130,8 +2768,6 @@
       <w:r>
         <w:rPr>
           <w:rFonts w:ascii="Consolas" w:hAnsi="Consolas"/>
-          <w:color w:val="8B1A1A"/>
-          <w:sz w:val="19"/>
         </w:rPr>
         <w:t>FORMULARIO_RESENAS = "https://forms.gle/..."</w:t>
       </w:r>
@@ -3164,8 +2800,6 @@
       <w:r>
         <w:rPr>
           <w:rFonts w:ascii="Consolas" w:hAnsi="Consolas"/>
-          <w:color w:val="8B1A1A"/>
-          <w:sz w:val="19"/>
         </w:rPr>
         <w:t>informe/videos</w:t>
       </w:r>
@@ -3244,10 +2878,6 @@
       </w:r>
     </w:p>
     <w:p>
-      <w:pPr>
-        <w:spacing w:after="60"/>
-        <w:ind w:left="510" w:hanging="340"/>
-      </w:pPr>
       <w:r>
         <w:rPr>
           <w:b/>
@@ -3292,10 +2922,6 @@
       </w:r>
     </w:p>
     <w:p>
-      <w:pPr>
-        <w:spacing w:after="60"/>
-        <w:ind w:left="510" w:hanging="340"/>
-      </w:pPr>
       <w:r>
         <w:rPr>
           <w:b/>
@@ -3313,10 +2939,6 @@
       </w:r>
     </w:p>
     <w:p>
-      <w:pPr>
-        <w:spacing w:after="60"/>
-        <w:ind w:left="510" w:hanging="340"/>
-      </w:pPr>
       <w:r>
         <w:rPr>
           <w:b/>
@@ -3334,10 +2956,6 @@
       </w:r>
     </w:p>
     <w:p>
-      <w:pPr>
-        <w:spacing w:after="60"/>
-        <w:ind w:left="510" w:hanging="340"/>
-      </w:pPr>
       <w:r>
         <w:rPr>
           <w:b/>
@@ -3355,10 +2973,6 @@
       </w:r>
     </w:p>
     <w:p>
-      <w:pPr>
-        <w:spacing w:after="60"/>
-        <w:ind w:left="510" w:hanging="340"/>
-      </w:pPr>
       <w:r>
         <w:rPr>
           <w:b/>
@@ -3387,24 +3001,21 @@
       <w:tblPr>
         <w:tblStyle w:val="TableGrid"/>
         <w:tblW w:type="auto" w:w="0"/>
-        <w:jc w:val="center"/>
         <w:tblLook w:firstColumn="1" w:firstRow="1" w:lastColumn="0" w:lastRow="0" w:noHBand="0" w:noVBand="1" w:val="04A0"/>
       </w:tblPr>
       <w:tblGrid>
-        <w:gridCol w:w="4873"/>
-        <w:gridCol w:w="4873"/>
+        <w:gridCol w:w="4320"/>
+        <w:gridCol w:w="4320"/>
       </w:tblGrid>
       <w:tr>
         <w:tc>
           <w:tcPr>
-            <w:tcW w:type="dxa" w:w="4873"/>
-            <w:shd w:val="clear" w:color="auto" w:fill="DCE8FC"/>
+            <w:tcW w:type="dxa" w:w="4320"/>
           </w:tcPr>
           <w:p>
             <w:r>
               <w:rPr>
                 <w:b/>
-                <w:sz w:val="20"/>
               </w:rPr>
               <w:t>Palabra</w:t>
             </w:r>
@@ -3412,14 +3023,12 @@
         </w:tc>
         <w:tc>
           <w:tcPr>
-            <w:tcW w:type="dxa" w:w="4873"/>
-            <w:shd w:val="clear" w:color="auto" w:fill="DCE8FC"/>
+            <w:tcW w:type="dxa" w:w="4320"/>
           </w:tcPr>
           <w:p>
             <w:r>
               <w:rPr>
                 <w:b/>
-                <w:sz w:val="20"/>
               </w:rPr>
               <w:t>Qué significa</w:t>
             </w:r>
@@ -3429,26 +3038,20 @@
       <w:tr>
         <w:tc>
           <w:tcPr>
-            <w:tcW w:type="dxa" w:w="4873"/>
+            <w:tcW w:type="dxa" w:w="4320"/>
           </w:tcPr>
           <w:p>
             <w:r>
-              <w:rPr>
-                <w:sz w:val="20"/>
-              </w:rPr>
               <w:t>ERP</w:t>
             </w:r>
           </w:p>
         </w:tc>
         <w:tc>
           <w:tcPr>
-            <w:tcW w:type="dxa" w:w="4873"/>
+            <w:tcW w:type="dxa" w:w="4320"/>
           </w:tcPr>
           <w:p>
             <w:r>
-              <w:rPr>
-                <w:sz w:val="20"/>
-              </w:rPr>
               <w:t>Sistema que junta en un lugar ventas, compras, stock y caja de un negocio.</w:t>
             </w:r>
           </w:p>
@@ -3457,26 +3060,20 @@
       <w:tr>
         <w:tc>
           <w:tcPr>
-            <w:tcW w:type="dxa" w:w="4873"/>
+            <w:tcW w:type="dxa" w:w="4320"/>
           </w:tcPr>
           <w:p>
             <w:r>
-              <w:rPr>
-                <w:sz w:val="20"/>
-              </w:rPr>
               <w:t>Base de datos</w:t>
             </w:r>
           </w:p>
         </w:tc>
         <w:tc>
           <w:tcPr>
-            <w:tcW w:type="dxa" w:w="4873"/>
+            <w:tcW w:type="dxa" w:w="4320"/>
           </w:tcPr>
           <w:p>
             <w:r>
-              <w:rPr>
-                <w:sz w:val="20"/>
-              </w:rPr>
               <w:t>Donde se guarda la información, ordenada en tablas.</w:t>
             </w:r>
           </w:p>
@@ -3485,26 +3082,20 @@
       <w:tr>
         <w:tc>
           <w:tcPr>
-            <w:tcW w:type="dxa" w:w="4873"/>
+            <w:tcW w:type="dxa" w:w="4320"/>
           </w:tcPr>
           <w:p>
             <w:r>
-              <w:rPr>
-                <w:sz w:val="20"/>
-              </w:rPr>
               <w:t>Tabla</w:t>
             </w:r>
           </w:p>
         </w:tc>
         <w:tc>
           <w:tcPr>
-            <w:tcW w:type="dxa" w:w="4873"/>
+            <w:tcW w:type="dxa" w:w="4320"/>
           </w:tcPr>
           <w:p>
             <w:r>
-              <w:rPr>
-                <w:sz w:val="20"/>
-              </w:rPr>
               <w:t>Como una hoja de Excel: filas (registros) y columnas (datos).</w:t>
             </w:r>
           </w:p>
@@ -3513,26 +3104,20 @@
       <w:tr>
         <w:tc>
           <w:tcPr>
-            <w:tcW w:type="dxa" w:w="4873"/>
+            <w:tcW w:type="dxa" w:w="4320"/>
           </w:tcPr>
           <w:p>
             <w:r>
-              <w:rPr>
-                <w:sz w:val="20"/>
-              </w:rPr>
               <w:t>SQL</w:t>
             </w:r>
           </w:p>
         </w:tc>
         <w:tc>
           <w:tcPr>
-            <w:tcW w:type="dxa" w:w="4873"/>
+            <w:tcW w:type="dxa" w:w="4320"/>
           </w:tcPr>
           <w:p>
             <w:r>
-              <w:rPr>
-                <w:sz w:val="20"/>
-              </w:rPr>
               <w:t>El idioma para pedirle o guardar datos en una base.</w:t>
             </w:r>
           </w:p>
@@ -3541,26 +3126,20 @@
       <w:tr>
         <w:tc>
           <w:tcPr>
-            <w:tcW w:type="dxa" w:w="4873"/>
+            <w:tcW w:type="dxa" w:w="4320"/>
           </w:tcPr>
           <w:p>
             <w:r>
-              <w:rPr>
-                <w:sz w:val="20"/>
-              </w:rPr>
               <w:t>SQLite</w:t>
             </w:r>
           </w:p>
         </w:tc>
         <w:tc>
           <w:tcPr>
-            <w:tcW w:type="dxa" w:w="4873"/>
+            <w:tcW w:type="dxa" w:w="4320"/>
           </w:tcPr>
           <w:p>
             <w:r>
-              <w:rPr>
-                <w:sz w:val="20"/>
-              </w:rPr>
               <w:t>Una base de datos que es un solo archivo en la PC.</w:t>
             </w:r>
           </w:p>
@@ -3569,26 +3148,20 @@
       <w:tr>
         <w:tc>
           <w:tcPr>
-            <w:tcW w:type="dxa" w:w="4873"/>
+            <w:tcW w:type="dxa" w:w="4320"/>
           </w:tcPr>
           <w:p>
             <w:r>
-              <w:rPr>
-                <w:sz w:val="20"/>
-              </w:rPr>
               <w:t>Supabase / PostgreSQL</w:t>
             </w:r>
           </w:p>
         </w:tc>
         <w:tc>
           <w:tcPr>
-            <w:tcW w:type="dxa" w:w="4873"/>
+            <w:tcW w:type="dxa" w:w="4320"/>
           </w:tcPr>
           <w:p>
             <w:r>
-              <w:rPr>
-                <w:sz w:val="20"/>
-              </w:rPr>
               <w:t>Una base de datos en la nube, para varios locales a la vez.</w:t>
             </w:r>
           </w:p>
@@ -3597,26 +3170,20 @@
       <w:tr>
         <w:tc>
           <w:tcPr>
-            <w:tcW w:type="dxa" w:w="4873"/>
+            <w:tcW w:type="dxa" w:w="4320"/>
           </w:tcPr>
           <w:p>
             <w:r>
-              <w:rPr>
-                <w:sz w:val="20"/>
-              </w:rPr>
               <w:t>SQLAlchemy</w:t>
             </w:r>
           </w:p>
         </w:tc>
         <w:tc>
           <w:tcPr>
-            <w:tcW w:type="dxa" w:w="4873"/>
+            <w:tcW w:type="dxa" w:w="4320"/>
           </w:tcPr>
           <w:p>
             <w:r>
-              <w:rPr>
-                <w:sz w:val="20"/>
-              </w:rPr>
               <w:t>Librería de Python para hablar con cualquier base sin cambiar el código.</w:t>
             </w:r>
           </w:p>
@@ -3625,26 +3192,20 @@
       <w:tr>
         <w:tc>
           <w:tcPr>
-            <w:tcW w:type="dxa" w:w="4873"/>
+            <w:tcW w:type="dxa" w:w="4320"/>
           </w:tcPr>
           <w:p>
             <w:r>
-              <w:rPr>
-                <w:sz w:val="20"/>
-              </w:rPr>
               <w:t>Streamlit</w:t>
             </w:r>
           </w:p>
         </w:tc>
         <w:tc>
           <w:tcPr>
-            <w:tcW w:type="dxa" w:w="4873"/>
+            <w:tcW w:type="dxa" w:w="4320"/>
           </w:tcPr>
           <w:p>
             <w:r>
-              <w:rPr>
-                <w:sz w:val="20"/>
-              </w:rPr>
               <w:t>Librería de Python para hacer páginas web con botones y tablas.</w:t>
             </w:r>
           </w:p>
@@ -3653,26 +3214,20 @@
       <w:tr>
         <w:tc>
           <w:tcPr>
-            <w:tcW w:type="dxa" w:w="4873"/>
+            <w:tcW w:type="dxa" w:w="4320"/>
           </w:tcPr>
           <w:p>
             <w:r>
-              <w:rPr>
-                <w:sz w:val="20"/>
-              </w:rPr>
               <w:t>Arqueo</w:t>
             </w:r>
           </w:p>
         </w:tc>
         <w:tc>
           <w:tcPr>
-            <w:tcW w:type="dxa" w:w="4873"/>
+            <w:tcW w:type="dxa" w:w="4320"/>
           </w:tcPr>
           <w:p>
             <w:r>
-              <w:rPr>
-                <w:sz w:val="20"/>
-              </w:rPr>
               <w:t>Contar el efectivo al cerrar la caja y compararlo con lo que debería haber.</w:t>
             </w:r>
           </w:p>
@@ -3681,26 +3236,20 @@
       <w:tr>
         <w:tc>
           <w:tcPr>
-            <w:tcW w:type="dxa" w:w="4873"/>
+            <w:tcW w:type="dxa" w:w="4320"/>
           </w:tcPr>
           <w:p>
             <w:r>
-              <w:rPr>
-                <w:sz w:val="20"/>
-              </w:rPr>
               <w:t>EAN-13</w:t>
             </w:r>
           </w:p>
         </w:tc>
         <w:tc>
           <w:tcPr>
-            <w:tcW w:type="dxa" w:w="4873"/>
+            <w:tcW w:type="dxa" w:w="4320"/>
           </w:tcPr>
           <w:p>
             <w:r>
-              <w:rPr>
-                <w:sz w:val="20"/>
-              </w:rPr>
               <w:t>El código de barras de 13 números de los productos (en Argentina empieza con 779).</w:t>
             </w:r>
           </w:p>
@@ -3709,26 +3258,20 @@
       <w:tr>
         <w:tc>
           <w:tcPr>
-            <w:tcW w:type="dxa" w:w="4873"/>
+            <w:tcW w:type="dxa" w:w="4320"/>
           </w:tcPr>
           <w:p>
             <w:r>
-              <w:rPr>
-                <w:sz w:val="20"/>
-              </w:rPr>
               <w:t>Repositorio</w:t>
             </w:r>
           </w:p>
         </w:tc>
         <w:tc>
           <w:tcPr>
-            <w:tcW w:type="dxa" w:w="4873"/>
+            <w:tcW w:type="dxa" w:w="4320"/>
           </w:tcPr>
           <w:p>
             <w:r>
-              <w:rPr>
-                <w:sz w:val="20"/>
-              </w:rPr>
               <w:t>La carpeta del proyecto en GitHub, con todo su historial de cambios.</w:t>
             </w:r>
           </w:p>
@@ -3737,26 +3280,20 @@
       <w:tr>
         <w:tc>
           <w:tcPr>
-            <w:tcW w:type="dxa" w:w="4873"/>
+            <w:tcW w:type="dxa" w:w="4320"/>
           </w:tcPr>
           <w:p>
             <w:r>
-              <w:rPr>
-                <w:sz w:val="20"/>
-              </w:rPr>
               <w:t>Modo demo</w:t>
             </w:r>
           </w:p>
         </w:tc>
         <w:tc>
           <w:tcPr>
-            <w:tcW w:type="dxa" w:w="4873"/>
+            <w:tcW w:type="dxa" w:w="4320"/>
           </w:tcPr>
           <w:p>
             <w:r>
-              <w:rPr>
-                <w:sz w:val="20"/>
-              </w:rPr>
               <w:t>El sistema con datos inventados, para mostrarlo sin riesgo.</w:t>
             </w:r>
           </w:p>
@@ -3766,7 +3303,7 @@
     <w:p/>
     <w:sectPr>
       <w:pgSz w:w="12240" w:h="15840"/>
-      <w:pgMar w:top="1134" w:right="1247" w:bottom="1134" w:left="1247" w:header="720" w:footer="720" w:gutter="0"/>
+      <w:pgMar w:top="1440" w:right="1800" w:bottom="1440" w:left="1800" w:header="720" w:footer="720" w:gutter="0"/>
       <w:cols w:space="720"/>
       <w:docGrid w:linePitch="360"/>
     </w:sectPr>
@@ -4137,10 +3674,6 @@
     <w:name w:val="Normal"/>
     <w:qFormat/>
     <w:rsid w:val="00FC693F"/>
-    <w:rPr>
-      <w:rFonts w:ascii="Calibri" w:hAnsi="Calibri"/>
-      <w:sz w:val="22"/>
-    </w:rPr>
   </w:style>
   <w:style w:type="paragraph" w:styleId="Header">
     <w:name w:val="header"/>
@@ -4204,7 +3737,7 @@
       <w:rFonts w:asciiTheme="majorHAnsi" w:eastAsiaTheme="majorEastAsia" w:hAnsiTheme="majorHAnsi" w:cstheme="majorBidi"/>
       <w:b/>
       <w:bCs/>
-      <w:color w:val="1F6FEB"/>
+      <w:color w:val="365F91" w:themeColor="accent1" w:themeShade="BF"/>
       <w:sz w:val="28"/>
       <w:szCs w:val="28"/>
     </w:rPr>
@@ -4228,7 +3761,7 @@
       <w:rFonts w:asciiTheme="majorHAnsi" w:eastAsiaTheme="majorEastAsia" w:hAnsiTheme="majorHAnsi" w:cstheme="majorBidi"/>
       <w:b/>
       <w:bCs/>
-      <w:color w:val="1F6FEB"/>
+      <w:color w:val="4F81BD" w:themeColor="accent1"/>
       <w:sz w:val="26"/>
       <w:szCs w:val="26"/>
     </w:rPr>
@@ -4252,7 +3785,7 @@
       <w:rFonts w:asciiTheme="majorHAnsi" w:eastAsiaTheme="majorEastAsia" w:hAnsiTheme="majorHAnsi" w:cstheme="majorBidi"/>
       <w:b/>
       <w:bCs/>
-      <w:color w:val="1F6FEB"/>
+      <w:color w:val="4F81BD" w:themeColor="accent1"/>
     </w:rPr>
   </w:style>
   <w:style w:type="paragraph" w:styleId="Heading4">

</xml_diff>

<commit_message>
Permiso «Ajustar cajas cerradas» que el jefe le puede dar al empleado
Co-Authored-By: Claude Opus 5.5 (1M context) <noreply@anthropic.com>
Claude-Session: https://claude.ai/code/session_01G7WmpuHDdSo7FWS1x9MX1X
</commit_message>
<xml_diff>
--- a/informe/guia/guia-del-sistema.docx
+++ b/informe/guia/guia-del-sistema.docx
@@ -1193,7 +1193,7 @@
           </w:tcPr>
           <w:p>
             <w:r>
-              <w:t>No</w:t>
+              <w:t>Solo si el jefe le da el permiso "Ajustar cajas cerradas"</w:t>
             </w:r>
           </w:p>
         </w:tc>
@@ -1324,7 +1324,16 @@
     </w:p>
     <w:p>
       <w:r>
-        <w:t xml:space="preserve">Una caja cerrada no se cambia, porque la plata ya se contó. Si después aparece un error, el jefe entra a </w:t>
+        <w:t xml:space="preserve">Una caja cerrada no se cambia, porque la plata ya se contó. Si después aparece un error, el jefe (o el empleado al que le haya dado el permiso </w:t>
+      </w:r>
+      <w:r>
+        <w:rPr>
+          <w:b/>
+        </w:rPr>
+        <w:t>Ajustar cajas cerradas</w:t>
+      </w:r>
+      <w:r>
+        <w:t xml:space="preserve"> en Mis comercios) entra a </w:t>
       </w:r>
       <w:r>
         <w:rPr>

</xml_diff>

<commit_message>
Vencimientos por tanda para panadería y productos que vencen
Cada producto puede tener 'Dura (días)'. Las compras y lo que se hornea
quedan como tandas con fecha de vencimiento; Inicio y Caja avisan lo
vencido y lo que vence hoy; la pantalla Vencimientos permite cargar
tandas y retirar lo vencido, que queda como pérdida en Reportes.

Co-Authored-By: Claude Opus 5.5 (1M context) <noreply@anthropic.com>
Claude-Session: https://claude.ai/code/session_01G7WmpuHDdSo7FWS1x9MX1X
</commit_message>
<xml_diff>
--- a/informe/guia/guia-del-sistema.docx
+++ b/informe/guia/guia-del-sistema.docx
@@ -809,6 +809,38 @@
           <w:p>
             <w:r>
               <w:t>Cargar lo que llega del proveedor: con el lector pide la cantidad. Suma al stock. El empleado no ve costos.</w:t>
+            </w:r>
+          </w:p>
+        </w:tc>
+        <w:tc>
+          <w:tcPr>
+            <w:tcW w:type="dxa" w:w="2880"/>
+          </w:tcPr>
+          <w:p>
+            <w:r>
+              <w:t>Jefe y empleado (viene habilitado; el jefe lo puede sacar)</w:t>
+            </w:r>
+          </w:p>
+        </w:tc>
+      </w:tr>
+      <w:tr>
+        <w:tc>
+          <w:tcPr>
+            <w:tcW w:type="dxa" w:w="2880"/>
+          </w:tcPr>
+          <w:p>
+            <w:r>
+              <w:t>🗓️ Vencimientos</w:t>
+            </w:r>
+          </w:p>
+        </w:tc>
+        <w:tc>
+          <w:tcPr>
+            <w:tcW w:type="dxa" w:w="2880"/>
+          </w:tcPr>
+          <w:p>
+            <w:r>
+              <w:t>Lo que hay por tanda con su fecha de vencimiento, avisos de vencido / vence hoy / vence mañana, cargar lo que se horneó y retirar lo vencido como pérdida. Solo aparece si el comercio es panadería o tiene productos con "Dura (días)".</w:t>
             </w:r>
           </w:p>
         </w:tc>
@@ -1389,6 +1421,191 @@
     </w:p>
     <w:p>
       <w:pPr>
+        <w:pStyle w:val="Heading2"/>
+      </w:pPr>
+      <w:r>
+        <w:t>Vencimientos (lo que dura pocos días)</w:t>
+      </w:r>
+    </w:p>
+    <w:p>
+      <w:r>
+        <w:t>Pensado para panaderías y para cualquier comercio con productos que vencen (postres, prepizzas, lácteos):</w:t>
+      </w:r>
+    </w:p>
+    <w:p>
+      <w:r>
+        <w:rPr>
+          <w:b/>
+        </w:rPr>
+        <w:t xml:space="preserve">1.  </w:t>
+      </w:r>
+      <w:r>
+        <w:rPr>
+          <w:b/>
+        </w:rPr>
+        <w:t>Una sola vez:</w:t>
+      </w:r>
+      <w:r>
+        <w:t xml:space="preserve"> en </w:t>
+      </w:r>
+      <w:r>
+        <w:rPr>
+          <w:b/>
+        </w:rPr>
+        <w:t>Stock</w:t>
+      </w:r>
+      <w:r>
+        <w:t xml:space="preserve">, columna </w:t>
+      </w:r>
+      <w:r>
+        <w:rPr>
+          <w:b/>
+        </w:rPr>
+        <w:t>Dura (días)</w:t>
+      </w:r>
+      <w:r>
+        <w:t xml:space="preserve">, se pone cuánto dura cada producto contando exhibición y heladera (por ejemplo, un postre: 4). Si queda vacío, el producto no vence. También se puede cargar con la columna </w:t>
+      </w:r>
+      <w:r>
+        <w:rPr>
+          <w:rFonts w:ascii="Consolas" w:hAnsi="Consolas"/>
+        </w:rPr>
+        <w:t>dias_duracion</w:t>
+      </w:r>
+      <w:r>
+        <w:t xml:space="preserve"> del Excel.</w:t>
+      </w:r>
+    </w:p>
+    <w:p>
+      <w:r>
+        <w:rPr>
+          <w:b/>
+        </w:rPr>
+        <w:t xml:space="preserve">2.  </w:t>
+      </w:r>
+      <w:r>
+        <w:rPr>
+          <w:b/>
+        </w:rPr>
+        <w:t>Cada vez que entra mercadería</w:t>
+      </w:r>
+      <w:r>
+        <w:t xml:space="preserve"> queda una </w:t>
+      </w:r>
+      <w:r>
+        <w:rPr>
+          <w:b/>
+        </w:rPr>
+        <w:t>tanda</w:t>
+      </w:r>
+      <w:r>
+        <w:t xml:space="preserve"> con su fecha: lo que llega del proveedor se anota solo al cargarlo en </w:t>
+      </w:r>
+      <w:r>
+        <w:rPr>
+          <w:b/>
+        </w:rPr>
+        <w:t>Compras</w:t>
+      </w:r>
+      <w:r>
+        <w:t xml:space="preserve">; lo que se hornea o prepara en el local se carga en </w:t>
+      </w:r>
+      <w:r>
+        <w:rPr>
+          <w:b/>
+        </w:rPr>
+        <w:t>Vencimientos → Cargar lo que salió hoy</w:t>
+      </w:r>
+      <w:r>
+        <w:t>.</w:t>
+      </w:r>
+    </w:p>
+    <w:p>
+      <w:r>
+        <w:rPr>
+          <w:b/>
+        </w:rPr>
+        <w:t xml:space="preserve">3.  </w:t>
+      </w:r>
+      <w:r>
+        <w:rPr>
+          <w:b/>
+        </w:rPr>
+        <w:t>Avisos:</w:t>
+      </w:r>
+      <w:r>
+        <w:t xml:space="preserve"> el Inicio y la Caja muestran "N unidades vencidas para retirar · N vencen hoy". En </w:t>
+      </w:r>
+      <w:r>
+        <w:rPr>
+          <w:b/>
+        </w:rPr>
+        <w:t>Vencimientos</w:t>
+      </w:r>
+      <w:r>
+        <w:t xml:space="preserve"> se ve cada tanda con cuánto queda y cuándo vence.</w:t>
+      </w:r>
+    </w:p>
+    <w:p>
+      <w:r>
+        <w:rPr>
+          <w:b/>
+        </w:rPr>
+        <w:t xml:space="preserve">4.  </w:t>
+      </w:r>
+      <w:r>
+        <w:rPr>
+          <w:b/>
+        </w:rPr>
+        <w:t>Retirar:</w:t>
+      </w:r>
+      <w:r>
+        <w:t xml:space="preserve"> se saca lo vencido de la vitrina y se toca </w:t>
+      </w:r>
+      <w:r>
+        <w:rPr>
+          <w:b/>
+        </w:rPr>
+        <w:t>Ya lo retiré</w:t>
+      </w:r>
+      <w:r>
+        <w:t xml:space="preserve">. Sale del stock y queda anotado como </w:t>
+      </w:r>
+      <w:r>
+        <w:rPr>
+          <w:b/>
+        </w:rPr>
+        <w:t>pérdida</w:t>
+      </w:r>
+      <w:r>
+        <w:t xml:space="preserve"> (a precio de costo) con quién lo hizo. El jefe ve lo que se tiró en el mes y en </w:t>
+      </w:r>
+      <w:r>
+        <w:rPr>
+          <w:b/>
+        </w:rPr>
+        <w:t>Reportes</w:t>
+      </w:r>
+      <w:r>
+        <w:t xml:space="preserve"> aparece como "Mercadería vencida que se tiró", restada de la ganancia neta.</w:t>
+      </w:r>
+    </w:p>
+    <w:p>
+      <w:r>
+        <w:t xml:space="preserve">Para saber cuánto queda de cada tanda, el sistema cuenta que </w:t>
+      </w:r>
+      <w:r>
+        <w:rPr>
+          <w:b/>
+        </w:rPr>
+        <w:t>siempre se vende primero lo más viejo</w:t>
+      </w:r>
+      <w:r>
+        <w:t xml:space="preserve"> (así se trabaja en una panadería). Por eso las ventas no cambian: el cajero cobra igual que siempre.</w:t>
+      </w:r>
+    </w:p>
+    <w:p>
+      <w:pPr>
         <w:pStyle w:val="Heading1"/>
       </w:pPr>
       <w:r>
@@ -1580,7 +1797,7 @@
               <w:br/>
               <w:t xml:space="preserve">  └── comercios</w:t>
               <w:br/>
-              <w:t xml:space="preserve">        ├── productos</w:t>
+              <w:t xml:space="preserve">        ├── productos ── lotes, mermas</w:t>
               <w:br/>
               <w:t xml:space="preserve">        ├── proveedores</w:t>
               <w:br/>
@@ -1706,7 +1923,57 @@
           </w:tcPr>
           <w:p>
             <w:r>
-              <w:t>Código interno, código de barras, nombre, categoría, costo, precio, stock y stock mínimo.</w:t>
+              <w:t>Código interno, código de barras, nombre, categoría, costo, precio, stock, stock mínimo y cuántos días dura (si vence).</w:t>
+            </w:r>
+          </w:p>
+        </w:tc>
+      </w:tr>
+      <w:tr>
+        <w:tc>
+          <w:tcPr>
+            <w:tcW w:type="dxa" w:w="4320"/>
+          </w:tcPr>
+          <w:p>
+            <w:r>
+              <w:rPr>
+                <w:rFonts w:ascii="Consolas" w:hAnsi="Consolas"/>
+              </w:rPr>
+              <w:t>lotes</w:t>
+            </w:r>
+          </w:p>
+        </w:tc>
+        <w:tc>
+          <w:tcPr>
+            <w:tcW w:type="dxa" w:w="4320"/>
+          </w:tcPr>
+          <w:p>
+            <w:r>
+              <w:t>Cada tanda que entró de un producto que vence: fecha, cantidad, cuándo vence, si vino de una compra o se hizo en el local, y quién la cargó.</w:t>
+            </w:r>
+          </w:p>
+        </w:tc>
+      </w:tr>
+      <w:tr>
+        <w:tc>
+          <w:tcPr>
+            <w:tcW w:type="dxa" w:w="4320"/>
+          </w:tcPr>
+          <w:p>
+            <w:r>
+              <w:rPr>
+                <w:rFonts w:ascii="Consolas" w:hAnsi="Consolas"/>
+              </w:rPr>
+              <w:t>mermas</w:t>
+            </w:r>
+          </w:p>
+        </w:tc>
+        <w:tc>
+          <w:tcPr>
+            <w:tcW w:type="dxa" w:w="4320"/>
+          </w:tcPr>
+          <w:p>
+            <w:r>
+              <w:t>Lo que se retiró por vencido: fecha, cantidad, costo de cada unidad y quién lo retiró.</w:t>
             </w:r>
           </w:p>
         </w:tc>
@@ -2148,6 +2415,15 @@
           <w:rFonts w:ascii="Consolas" w:hAnsi="Consolas"/>
         </w:rPr>
         <w:t>codigo_barras</w:t>
+      </w:r>
+      <w:r>
+        <w:t xml:space="preserve">, </w:t>
+      </w:r>
+      <w:r>
+        <w:rPr>
+          <w:rFonts w:ascii="Consolas" w:hAnsi="Consolas"/>
+        </w:rPr>
+        <w:t>dias_duracion</w:t>
       </w:r>
       <w:r>
         <w:t xml:space="preserve"> (opcionales). Si el código ya existe actualiza el producto; si no, lo crea. Las filas con errores se muestran aparte y no se importan.</w:t>
@@ -2843,6 +3119,20 @@
         <w:pStyle w:val="ListBullet"/>
       </w:pPr>
       <w:r>
+        <w:rPr>
+          <w:b/>
+        </w:rPr>
+        <w:t>Sin límite de facturación</w:t>
+      </w:r>
+      <w:r>
+        <w:t xml:space="preserve"> en ningún plan: cada empleado cobra todo lo que venda. Otros sistemas limitan cuánto puede facturar cada empleado según el plan (por ejemplo, $250.000), y una panadería lo marcó como un problema.</w:t>
+      </w:r>
+    </w:p>
+    <w:p>
+      <w:pPr>
+        <w:pStyle w:val="ListBullet"/>
+      </w:pPr>
+      <w:r>
         <w:t>Los sistemas parecidos que facturan ARCA cobran entre $19.000 y $35.000 por mes (o de US$20 a US$79). Como todavía no factura, conviene entrar más abajo.</w:t>
       </w:r>
     </w:p>
@@ -3084,6 +3374,50 @@
           <w:p>
             <w:r>
               <w:t>Donde se guarda la información, ordenada en tablas.</w:t>
+            </w:r>
+          </w:p>
+        </w:tc>
+      </w:tr>
+      <w:tr>
+        <w:tc>
+          <w:tcPr>
+            <w:tcW w:type="dxa" w:w="4320"/>
+          </w:tcPr>
+          <w:p>
+            <w:r>
+              <w:t>Tanda (lote)</w:t>
+            </w:r>
+          </w:p>
+        </w:tc>
+        <w:tc>
+          <w:tcPr>
+            <w:tcW w:type="dxa" w:w="4320"/>
+          </w:tcPr>
+          <w:p>
+            <w:r>
+              <w:t>Lo que entró de un producto en un mismo momento: una horneada o una entrega del proveedor. Cada una tiene su fecha de vencimiento.</w:t>
+            </w:r>
+          </w:p>
+        </w:tc>
+      </w:tr>
+      <w:tr>
+        <w:tc>
+          <w:tcPr>
+            <w:tcW w:type="dxa" w:w="4320"/>
+          </w:tcPr>
+          <w:p>
+            <w:r>
+              <w:t>Merma</w:t>
+            </w:r>
+          </w:p>
+        </w:tc>
+        <w:tc>
+          <w:tcPr>
+            <w:tcW w:type="dxa" w:w="4320"/>
+          </w:tcPr>
+          <w:p>
+            <w:r>
+              <w:t>Mercadería que se pierde (por ejemplo, porque venció). Se anota a precio de costo.</w:t>
             </w:r>
           </w:p>
         </w:tc>

</xml_diff>

<commit_message>
Vencimientos: sacar unidades de una tanda elegida
Además de asumir que se vende primero lo más viejo, ahora se puede elegir
la tanda y anotar cuántas salieron: vendidas (corrige de qué tanda salió la
venta), tiradas o regaladas (salen del stock y quedan como pérdida).

Co-Authored-By: Claude Opus 5.5 (1M context) <noreply@anthropic.com>
Claude-Session: https://claude.ai/code/session_01G7WmpuHDdSo7FWS1x9MX1X
</commit_message>
<xml_diff>
--- a/informe/guia/guia-del-sistema.docx
+++ b/informe/guia/guia-del-sistema.docx
@@ -1602,6 +1602,47 @@
       </w:r>
       <w:r>
         <w:t xml:space="preserve"> (así se trabaja en una panadería). Por eso las ventas no cambian: el cajero cobra igual que siempre.</w:t>
+      </w:r>
+    </w:p>
+    <w:p>
+      <w:r>
+        <w:t xml:space="preserve">Si no fue así (por ejemplo, se vendió pan de la tanda de hoy y quedó el de ayer), en </w:t>
+      </w:r>
+      <w:r>
+        <w:rPr>
+          <w:b/>
+        </w:rPr>
+        <w:t>Vencimientos → Sacar de una tanda</w:t>
+      </w:r>
+      <w:r>
+        <w:t xml:space="preserve"> se elige la tanda, cuántas salieron y por qué: </w:t>
+      </w:r>
+      <w:r>
+        <w:rPr>
+          <w:b/>
+        </w:rPr>
+        <w:t>se vendió</w:t>
+      </w:r>
+      <w:r>
+        <w:t xml:space="preserve"> (ya cobrado en la Caja: solo corrige de qué tanda salió), </w:t>
+      </w:r>
+      <w:r>
+        <w:rPr>
+          <w:b/>
+        </w:rPr>
+        <w:t>se tiró</w:t>
+      </w:r>
+      <w:r>
+        <w:t xml:space="preserve"> o </w:t>
+      </w:r>
+      <w:r>
+        <w:rPr>
+          <w:b/>
+        </w:rPr>
+        <w:t>se regaló</w:t>
+      </w:r>
+      <w:r>
+        <w:t xml:space="preserve"> (salen del stock y quedan como pérdida).</w:t>
       </w:r>
     </w:p>
     <w:p>

</xml_diff>

<commit_message>
Modo claro u oscuro al estilo Supabase
Los colores de cada modo están en tema.py como variables de CSS y los
estilos de comun.py usan solo esas variables, así el cambio es al
instante. El jefe lo cambia con el botón de la barra lateral y queda
guardado por dueño (duenos.tema); en la demo queda solo en la sesión.
Tarjetas para los números, botón principal verde, casilleros, listas,
calendario y menús con los colores del tema. Capturas nuevas.

Co-Authored-By: Claude Opus 5.5 (1M context) <noreply@anthropic.com>
Claude-Session: https://claude.ai/code/session_013MiRa8bg68iYCC9FLNK3SH
</commit_message>
<xml_diff>
--- a/informe/guia/guia-del-sistema.docx
+++ b/informe/guia/guia-del-sistema.docx
@@ -1049,6 +1049,32 @@
       </w:tr>
     </w:tbl>
     <w:p/>
+    <w:p>
+      <w:pPr>
+        <w:pStyle w:val="Heading2"/>
+      </w:pPr>
+      <w:r>
+        <w:t>Modo claro u oscuro</w:t>
+      </w:r>
+    </w:p>
+    <w:p>
+      <w:pPr/>
+      <w:r>
+        <w:t>El jefe cambia los colores con el botón 🌙 Modo oscuro de la barra de la izquierda. El cambio es al instante y queda guardado en la base (en la tabla duenos), así que al volver a entrar sigue igual y sus empleados ven los mismos colores. En la demo en línea no se guarda, porque todos los visitantes usan el mismo dueño.</w:t>
+      </w:r>
+    </w:p>
+    <w:p>
+      <w:pPr/>
+      <w:r>
+        <w:t>Cómo funciona: los colores de cada modo están en tema.py, como variables de CSS (--fondo, --texto, --borde, --acento...). Los estilos de comun.py usan solo esas variables, nunca un color fijo. Cambiar de modo es cambiar esas pocas variables, y el navegador repinta todo sin recargar la página. Para cambiar un color del sistema alcanza con tocarlo en PALETAS, dentro de tema.py.</w:t>
+      </w:r>
+    </w:p>
+    <w:p>
+      <w:pPr/>
+      <w:r>
+        <w:t>Las tablas se dibujan como imagen y no toman colores de CSS: en modo oscuro se "dan vuelta" (blanco ↔ negro) para que no quede un recuadro blanco.</w:t>
+      </w:r>
+    </w:p>
     <w:p>
       <w:pPr>
         <w:pStyle w:val="Heading1"/>
@@ -2723,7 +2749,32 @@
           </w:tcPr>
           <w:p>
             <w:r>
-              <w:t>Lo que comparten las pantallas: formato de pesos, medios de pago, permisos, el lector.</w:t>
+              <w:t>Lo que comparten las pantallas: formato de pesos, medios de pago, permisos, el lector y los estilos.</w:t>
+            </w:r>
+          </w:p>
+        </w:tc>
+      </w:tr>
+      <w:tr>
+        <w:tc>
+          <w:tcPr>
+            <w:tcW w:type="dxa" w:w="4320"/>
+          </w:tcPr>
+          <w:p>
+            <w:r>
+              <w:rPr>
+                <w:rFonts w:ascii="Consolas" w:hAnsi="Consolas"/>
+              </w:rPr>
+              <w:t>tema.py</w:t>
+            </w:r>
+          </w:p>
+        </w:tc>
+        <w:tc>
+          <w:tcPr>
+            <w:tcW w:type="dxa" w:w="4320"/>
+          </w:tcPr>
+          <w:p>
+            <w:r>
+              <w:t>Los colores del modo claro y del oscuro, y el botón para cambiarlos.</w:t>
             </w:r>
           </w:p>
         </w:tc>

</xml_diff>

<commit_message>
Guía en Word actualizada
Co-Authored-By: Claude Opus 5.5 (1M context) <noreply@anthropic.com>
Claude-Session: https://claude.ai/code/session_01P2zPEbtxr5ymkWTBg7C8RA
</commit_message>
<xml_diff>
--- a/informe/guia/guia-del-sistema.docx
+++ b/informe/guia/guia-del-sistema.docx
@@ -1942,7 +1942,25 @@
               <w:jc w:val="left"/>
             </w:pPr>
             <w:r>
-              <w:t xml:space="preserve">Sí (ve solo lo de su turno)</w:t>
+              <w:t xml:space="preserve">Solo si el jefe le da el permiso</w:t>
+            </w:r>
+            <w:r>
+              <w:t xml:space="preserve"> </w:t>
+            </w:r>
+            <w:r>
+              <w:t xml:space="preserve">“</w:t>
+            </w:r>
+            <w:r>
+              <w:t xml:space="preserve">Hacer el relevo de turno</w:t>
+            </w:r>
+            <w:r>
+              <w:t xml:space="preserve">”</w:t>
+            </w:r>
+            <w:r>
+              <w:t xml:space="preserve"> </w:t>
+            </w:r>
+            <w:r>
+              <w:t xml:space="preserve">(ve solo lo de su turno)</w:t>
             </w:r>
           </w:p>
         </w:tc>
@@ -2195,7 +2213,7 @@
         <w:pStyle w:val="Compact"/>
       </w:pPr>
       <w:r>
-        <w:t xml:space="preserve">En la Caja, el que se va toca</w:t>
+        <w:t xml:space="preserve">En la Caja se toca</w:t>
       </w:r>
       <w:r>
         <w:t xml:space="preserve"> </w:t>
@@ -2208,7 +2226,10 @@
         <w:t xml:space="preserve">🔄 Relevo de turno</w:t>
       </w:r>
       <w:r>
-        <w:t xml:space="preserve">.</w:t>
+        <w:t xml:space="preserve"> </w:t>
+      </w:r>
+      <w:r>
+        <w:t xml:space="preserve">(el jefe o el empleado autorizado).</w:t>
       </w:r>
     </w:p>
     <w:p>
@@ -2365,7 +2386,23 @@
         <w:pStyle w:val="FirstParagraph"/>
       </w:pPr>
       <w:r>
-        <w:t xml:space="preserve">El empleado puede hacer el relevo, pero los turnos de otros solo los ve el jefe (o quien tenga el permiso</w:t>
+        <w:t xml:space="preserve">El relevo lo hace el jefe o el empleado al que le dé el permiso</w:t>
+      </w:r>
+      <w:r>
+        <w:t xml:space="preserve"> </w:t>
+      </w:r>
+      <w:r>
+        <w:rPr>
+          <w:bCs/>
+          <w:b/>
+        </w:rPr>
+        <w:t xml:space="preserve">🔄 Hacer el relevo de turno</w:t>
+      </w:r>
+      <w:r>
+        <w:t xml:space="preserve"> </w:t>
+      </w:r>
+      <w:r>
+        <w:t xml:space="preserve">en Mis comercios (viene apagado). Los turnos de otros solo los ve el jefe (o quien tenga el permiso</w:t>
       </w:r>
       <w:r>
         <w:t xml:space="preserve"> </w:t>
@@ -18450,13 +18487,239 @@
       </w:tcPr>
     </w:tblStylePr>
   </w:style>
-  <w:style w:type="paragraph" w:customStyle="1" w:styleId="SourceCode">
+  <w:style w:customStyle="1" w:styleId="SourceCode" w:type="paragraph">
     <w:name w:val="Source Code"/>
     <w:basedOn w:val="Normal"/>
     <w:link w:val="VerbatimChar"/>
     <w:pPr>
       <w:wordWrap w:val="off"/>
     </w:pPr>
+  </w:style>
+  <w:style w:customStyle="1" w:styleId="KeywordTok" w:type="character">
+    <w:name w:val="KeywordTok"/>
+    <w:basedOn w:val="VerbatimChar"/>
+    <w:rPr>
+      <w:color w:val="007020"/>
+      <w:b/>
+    </w:rPr>
+  </w:style>
+  <w:style w:customStyle="1" w:styleId="DataTypeTok" w:type="character">
+    <w:name w:val="DataTypeTok"/>
+    <w:basedOn w:val="VerbatimChar"/>
+    <w:rPr>
+      <w:color w:val="902000"/>
+    </w:rPr>
+  </w:style>
+  <w:style w:customStyle="1" w:styleId="DecValTok" w:type="character">
+    <w:name w:val="DecValTok"/>
+    <w:basedOn w:val="VerbatimChar"/>
+    <w:rPr>
+      <w:color w:val="40a070"/>
+    </w:rPr>
+  </w:style>
+  <w:style w:customStyle="1" w:styleId="BaseNTok" w:type="character">
+    <w:name w:val="BaseNTok"/>
+    <w:basedOn w:val="VerbatimChar"/>
+    <w:rPr>
+      <w:color w:val="40a070"/>
+    </w:rPr>
+  </w:style>
+  <w:style w:customStyle="1" w:styleId="FloatTok" w:type="character">
+    <w:name w:val="FloatTok"/>
+    <w:basedOn w:val="VerbatimChar"/>
+    <w:rPr>
+      <w:color w:val="40a070"/>
+    </w:rPr>
+  </w:style>
+  <w:style w:customStyle="1" w:styleId="ConstantTok" w:type="character">
+    <w:name w:val="ConstantTok"/>
+    <w:basedOn w:val="VerbatimChar"/>
+    <w:rPr>
+      <w:color w:val="880000"/>
+    </w:rPr>
+  </w:style>
+  <w:style w:customStyle="1" w:styleId="CharTok" w:type="character">
+    <w:name w:val="CharTok"/>
+    <w:basedOn w:val="VerbatimChar"/>
+    <w:rPr>
+      <w:color w:val="4070a0"/>
+    </w:rPr>
+  </w:style>
+  <w:style w:customStyle="1" w:styleId="SpecialCharTok" w:type="character">
+    <w:name w:val="SpecialCharTok"/>
+    <w:basedOn w:val="VerbatimChar"/>
+    <w:rPr>
+      <w:color w:val="4070a0"/>
+    </w:rPr>
+  </w:style>
+  <w:style w:customStyle="1" w:styleId="StringTok" w:type="character">
+    <w:name w:val="StringTok"/>
+    <w:basedOn w:val="VerbatimChar"/>
+    <w:rPr>
+      <w:color w:val="4070a0"/>
+    </w:rPr>
+  </w:style>
+  <w:style w:customStyle="1" w:styleId="VerbatimStringTok" w:type="character">
+    <w:name w:val="VerbatimStringTok"/>
+    <w:basedOn w:val="VerbatimChar"/>
+    <w:rPr>
+      <w:color w:val="4070a0"/>
+    </w:rPr>
+  </w:style>
+  <w:style w:customStyle="1" w:styleId="SpecialStringTok" w:type="character">
+    <w:name w:val="SpecialStringTok"/>
+    <w:basedOn w:val="VerbatimChar"/>
+    <w:rPr>
+      <w:color w:val="bb6688"/>
+    </w:rPr>
+  </w:style>
+  <w:style w:customStyle="1" w:styleId="ImportTok" w:type="character">
+    <w:name w:val="ImportTok"/>
+    <w:basedOn w:val="VerbatimChar"/>
+    <w:rPr>
+      <w:color w:val="008000"/>
+      <w:b/>
+    </w:rPr>
+  </w:style>
+  <w:style w:customStyle="1" w:styleId="CommentTok" w:type="character">
+    <w:name w:val="CommentTok"/>
+    <w:basedOn w:val="VerbatimChar"/>
+    <w:rPr>
+      <w:color w:val="60a0b0"/>
+      <w:i/>
+    </w:rPr>
+  </w:style>
+  <w:style w:customStyle="1" w:styleId="DocumentationTok" w:type="character">
+    <w:name w:val="DocumentationTok"/>
+    <w:basedOn w:val="VerbatimChar"/>
+    <w:rPr>
+      <w:color w:val="ba2121"/>
+      <w:i/>
+    </w:rPr>
+  </w:style>
+  <w:style w:customStyle="1" w:styleId="AnnotationTok" w:type="character">
+    <w:name w:val="AnnotationTok"/>
+    <w:basedOn w:val="VerbatimChar"/>
+    <w:rPr>
+      <w:color w:val="60a0b0"/>
+      <w:b/>
+      <w:i/>
+    </w:rPr>
+  </w:style>
+  <w:style w:customStyle="1" w:styleId="CommentVarTok" w:type="character">
+    <w:name w:val="CommentVarTok"/>
+    <w:basedOn w:val="VerbatimChar"/>
+    <w:rPr>
+      <w:color w:val="60a0b0"/>
+      <w:b/>
+      <w:i/>
+    </w:rPr>
+  </w:style>
+  <w:style w:customStyle="1" w:styleId="OtherTok" w:type="character">
+    <w:name w:val="OtherTok"/>
+    <w:basedOn w:val="VerbatimChar"/>
+    <w:rPr>
+      <w:color w:val="007020"/>
+    </w:rPr>
+  </w:style>
+  <w:style w:customStyle="1" w:styleId="FunctionTok" w:type="character">
+    <w:name w:val="FunctionTok"/>
+    <w:basedOn w:val="VerbatimChar"/>
+    <w:rPr>
+      <w:color w:val="06287e"/>
+    </w:rPr>
+  </w:style>
+  <w:style w:customStyle="1" w:styleId="VariableTok" w:type="character">
+    <w:name w:val="VariableTok"/>
+    <w:basedOn w:val="VerbatimChar"/>
+    <w:rPr>
+      <w:color w:val="19177c"/>
+    </w:rPr>
+  </w:style>
+  <w:style w:customStyle="1" w:styleId="ControlFlowTok" w:type="character">
+    <w:name w:val="ControlFlowTok"/>
+    <w:basedOn w:val="VerbatimChar"/>
+    <w:rPr>
+      <w:color w:val="007020"/>
+      <w:b/>
+    </w:rPr>
+  </w:style>
+  <w:style w:customStyle="1" w:styleId="OperatorTok" w:type="character">
+    <w:name w:val="OperatorTok"/>
+    <w:basedOn w:val="VerbatimChar"/>
+    <w:rPr>
+      <w:color w:val="666666"/>
+    </w:rPr>
+  </w:style>
+  <w:style w:customStyle="1" w:styleId="BuiltInTok" w:type="character">
+    <w:name w:val="BuiltInTok"/>
+    <w:basedOn w:val="VerbatimChar"/>
+    <w:rPr>
+      <w:color w:val="008000"/>
+    </w:rPr>
+  </w:style>
+  <w:style w:customStyle="1" w:styleId="ExtensionTok" w:type="character">
+    <w:name w:val="ExtensionTok"/>
+    <w:basedOn w:val="VerbatimChar"/>
+    <w:rPr/>
+  </w:style>
+  <w:style w:customStyle="1" w:styleId="PreprocessorTok" w:type="character">
+    <w:name w:val="PreprocessorTok"/>
+    <w:basedOn w:val="VerbatimChar"/>
+    <w:rPr>
+      <w:color w:val="bc7a00"/>
+    </w:rPr>
+  </w:style>
+  <w:style w:customStyle="1" w:styleId="AttributeTok" w:type="character">
+    <w:name w:val="AttributeTok"/>
+    <w:basedOn w:val="VerbatimChar"/>
+    <w:rPr>
+      <w:color w:val="7d9029"/>
+    </w:rPr>
+  </w:style>
+  <w:style w:customStyle="1" w:styleId="RegionMarkerTok" w:type="character">
+    <w:name w:val="RegionMarkerTok"/>
+    <w:basedOn w:val="VerbatimChar"/>
+    <w:rPr/>
+  </w:style>
+  <w:style w:customStyle="1" w:styleId="InformationTok" w:type="character">
+    <w:name w:val="InformationTok"/>
+    <w:basedOn w:val="VerbatimChar"/>
+    <w:rPr>
+      <w:color w:val="60a0b0"/>
+      <w:b/>
+      <w:i/>
+    </w:rPr>
+  </w:style>
+  <w:style w:customStyle="1" w:styleId="WarningTok" w:type="character">
+    <w:name w:val="WarningTok"/>
+    <w:basedOn w:val="VerbatimChar"/>
+    <w:rPr>
+      <w:color w:val="60a0b0"/>
+      <w:b/>
+      <w:i/>
+    </w:rPr>
+  </w:style>
+  <w:style w:customStyle="1" w:styleId="AlertTok" w:type="character">
+    <w:name w:val="AlertTok"/>
+    <w:basedOn w:val="VerbatimChar"/>
+    <w:rPr>
+      <w:color w:val="ff0000"/>
+      <w:b/>
+    </w:rPr>
+  </w:style>
+  <w:style w:customStyle="1" w:styleId="ErrorTok" w:type="character">
+    <w:name w:val="ErrorTok"/>
+    <w:basedOn w:val="VerbatimChar"/>
+    <w:rPr>
+      <w:color w:val="ff0000"/>
+      <w:b/>
+    </w:rPr>
+  </w:style>
+  <w:style w:customStyle="1" w:styleId="NormalTok" w:type="character">
+    <w:name w:val="NormalTok"/>
+    <w:basedOn w:val="VerbatimChar"/>
+    <w:rPr/>
   </w:style>
   <w:style w:type="character" w:customStyle="1" w:styleId="KeywordTok">
     <w:name w:val="KeywordTok"/>

</xml_diff>

<commit_message>
El empleado vuelve a poder hacer el relevo de turno
Nahuel aclaró que el relevo lo puede hacer el empleado; lo que es solo del jefe son los horarios del local (eso ya era así).

Co-Authored-By: Claude Opus 5.5 (1M context) <noreply@anthropic.com>
Claude-Session: https://claude.ai/code/session_01P2zPEbtxr5ymkWTBg7C8RA
</commit_message>
<xml_diff>
--- a/informe/guia/guia-del-sistema.docx
+++ b/informe/guia/guia-del-sistema.docx
@@ -1942,25 +1942,7 @@
               <w:jc w:val="left"/>
             </w:pPr>
             <w:r>
-              <w:t xml:space="preserve">Solo si el jefe le da el permiso</w:t>
-            </w:r>
-            <w:r>
-              <w:t xml:space="preserve"> </w:t>
-            </w:r>
-            <w:r>
-              <w:t xml:space="preserve">“</w:t>
-            </w:r>
-            <w:r>
-              <w:t xml:space="preserve">Hacer el relevo de turno</w:t>
-            </w:r>
-            <w:r>
-              <w:t xml:space="preserve">”</w:t>
-            </w:r>
-            <w:r>
-              <w:t xml:space="preserve"> </w:t>
-            </w:r>
-            <w:r>
-              <w:t xml:space="preserve">(ve solo lo de su turno)</w:t>
+              <w:t xml:space="preserve">Sí (ve solo lo de su turno)</w:t>
             </w:r>
           </w:p>
         </w:tc>
@@ -2213,7 +2195,7 @@
         <w:pStyle w:val="Compact"/>
       </w:pPr>
       <w:r>
-        <w:t xml:space="preserve">En la Caja se toca</w:t>
+        <w:t xml:space="preserve">En la Caja, el que se va toca</w:t>
       </w:r>
       <w:r>
         <w:t xml:space="preserve"> </w:t>
@@ -2226,10 +2208,7 @@
         <w:t xml:space="preserve">🔄 Relevo de turno</w:t>
       </w:r>
       <w:r>
-        <w:t xml:space="preserve"> </w:t>
-      </w:r>
-      <w:r>
-        <w:t xml:space="preserve">(el jefe o el empleado autorizado).</w:t>
+        <w:t xml:space="preserve">.</w:t>
       </w:r>
     </w:p>
     <w:p>
@@ -2386,23 +2365,7 @@
         <w:pStyle w:val="FirstParagraph"/>
       </w:pPr>
       <w:r>
-        <w:t xml:space="preserve">El relevo lo hace el jefe o el empleado al que le dé el permiso</w:t>
-      </w:r>
-      <w:r>
-        <w:t xml:space="preserve"> </w:t>
-      </w:r>
-      <w:r>
-        <w:rPr>
-          <w:bCs/>
-          <w:b/>
-        </w:rPr>
-        <w:t xml:space="preserve">🔄 Hacer el relevo de turno</w:t>
-      </w:r>
-      <w:r>
-        <w:t xml:space="preserve"> </w:t>
-      </w:r>
-      <w:r>
-        <w:t xml:space="preserve">en Mis comercios (viene apagado). Los turnos de otros solo los ve el jefe (o quien tenga el permiso</w:t>
+        <w:t xml:space="preserve">El empleado puede hacer el relevo, pero los turnos de otros solo los ve el jefe (o quien tenga el permiso</w:t>
       </w:r>
       <w:r>
         <w:t xml:space="preserve"> </w:t>
@@ -18494,6 +18457,232 @@
     <w:pPr>
       <w:wordWrap w:val="off"/>
     </w:pPr>
+  </w:style>
+  <w:style w:customStyle="1" w:styleId="KeywordTok" w:type="character">
+    <w:name w:val="KeywordTok"/>
+    <w:basedOn w:val="VerbatimChar"/>
+    <w:rPr>
+      <w:color w:val="007020"/>
+      <w:b/>
+    </w:rPr>
+  </w:style>
+  <w:style w:customStyle="1" w:styleId="DataTypeTok" w:type="character">
+    <w:name w:val="DataTypeTok"/>
+    <w:basedOn w:val="VerbatimChar"/>
+    <w:rPr>
+      <w:color w:val="902000"/>
+    </w:rPr>
+  </w:style>
+  <w:style w:customStyle="1" w:styleId="DecValTok" w:type="character">
+    <w:name w:val="DecValTok"/>
+    <w:basedOn w:val="VerbatimChar"/>
+    <w:rPr>
+      <w:color w:val="40a070"/>
+    </w:rPr>
+  </w:style>
+  <w:style w:customStyle="1" w:styleId="BaseNTok" w:type="character">
+    <w:name w:val="BaseNTok"/>
+    <w:basedOn w:val="VerbatimChar"/>
+    <w:rPr>
+      <w:color w:val="40a070"/>
+    </w:rPr>
+  </w:style>
+  <w:style w:customStyle="1" w:styleId="FloatTok" w:type="character">
+    <w:name w:val="FloatTok"/>
+    <w:basedOn w:val="VerbatimChar"/>
+    <w:rPr>
+      <w:color w:val="40a070"/>
+    </w:rPr>
+  </w:style>
+  <w:style w:customStyle="1" w:styleId="ConstantTok" w:type="character">
+    <w:name w:val="ConstantTok"/>
+    <w:basedOn w:val="VerbatimChar"/>
+    <w:rPr>
+      <w:color w:val="880000"/>
+    </w:rPr>
+  </w:style>
+  <w:style w:customStyle="1" w:styleId="CharTok" w:type="character">
+    <w:name w:val="CharTok"/>
+    <w:basedOn w:val="VerbatimChar"/>
+    <w:rPr>
+      <w:color w:val="4070a0"/>
+    </w:rPr>
+  </w:style>
+  <w:style w:customStyle="1" w:styleId="SpecialCharTok" w:type="character">
+    <w:name w:val="SpecialCharTok"/>
+    <w:basedOn w:val="VerbatimChar"/>
+    <w:rPr>
+      <w:color w:val="4070a0"/>
+    </w:rPr>
+  </w:style>
+  <w:style w:customStyle="1" w:styleId="StringTok" w:type="character">
+    <w:name w:val="StringTok"/>
+    <w:basedOn w:val="VerbatimChar"/>
+    <w:rPr>
+      <w:color w:val="4070a0"/>
+    </w:rPr>
+  </w:style>
+  <w:style w:customStyle="1" w:styleId="VerbatimStringTok" w:type="character">
+    <w:name w:val="VerbatimStringTok"/>
+    <w:basedOn w:val="VerbatimChar"/>
+    <w:rPr>
+      <w:color w:val="4070a0"/>
+    </w:rPr>
+  </w:style>
+  <w:style w:customStyle="1" w:styleId="SpecialStringTok" w:type="character">
+    <w:name w:val="SpecialStringTok"/>
+    <w:basedOn w:val="VerbatimChar"/>
+    <w:rPr>
+      <w:color w:val="bb6688"/>
+    </w:rPr>
+  </w:style>
+  <w:style w:customStyle="1" w:styleId="ImportTok" w:type="character">
+    <w:name w:val="ImportTok"/>
+    <w:basedOn w:val="VerbatimChar"/>
+    <w:rPr>
+      <w:color w:val="008000"/>
+      <w:b/>
+    </w:rPr>
+  </w:style>
+  <w:style w:customStyle="1" w:styleId="CommentTok" w:type="character">
+    <w:name w:val="CommentTok"/>
+    <w:basedOn w:val="VerbatimChar"/>
+    <w:rPr>
+      <w:color w:val="60a0b0"/>
+      <w:i/>
+    </w:rPr>
+  </w:style>
+  <w:style w:customStyle="1" w:styleId="DocumentationTok" w:type="character">
+    <w:name w:val="DocumentationTok"/>
+    <w:basedOn w:val="VerbatimChar"/>
+    <w:rPr>
+      <w:color w:val="ba2121"/>
+      <w:i/>
+    </w:rPr>
+  </w:style>
+  <w:style w:customStyle="1" w:styleId="AnnotationTok" w:type="character">
+    <w:name w:val="AnnotationTok"/>
+    <w:basedOn w:val="VerbatimChar"/>
+    <w:rPr>
+      <w:color w:val="60a0b0"/>
+      <w:b/>
+      <w:i/>
+    </w:rPr>
+  </w:style>
+  <w:style w:customStyle="1" w:styleId="CommentVarTok" w:type="character">
+    <w:name w:val="CommentVarTok"/>
+    <w:basedOn w:val="VerbatimChar"/>
+    <w:rPr>
+      <w:color w:val="60a0b0"/>
+      <w:b/>
+      <w:i/>
+    </w:rPr>
+  </w:style>
+  <w:style w:customStyle="1" w:styleId="OtherTok" w:type="character">
+    <w:name w:val="OtherTok"/>
+    <w:basedOn w:val="VerbatimChar"/>
+    <w:rPr>
+      <w:color w:val="007020"/>
+    </w:rPr>
+  </w:style>
+  <w:style w:customStyle="1" w:styleId="FunctionTok" w:type="character">
+    <w:name w:val="FunctionTok"/>
+    <w:basedOn w:val="VerbatimChar"/>
+    <w:rPr>
+      <w:color w:val="06287e"/>
+    </w:rPr>
+  </w:style>
+  <w:style w:customStyle="1" w:styleId="VariableTok" w:type="character">
+    <w:name w:val="VariableTok"/>
+    <w:basedOn w:val="VerbatimChar"/>
+    <w:rPr>
+      <w:color w:val="19177c"/>
+    </w:rPr>
+  </w:style>
+  <w:style w:customStyle="1" w:styleId="ControlFlowTok" w:type="character">
+    <w:name w:val="ControlFlowTok"/>
+    <w:basedOn w:val="VerbatimChar"/>
+    <w:rPr>
+      <w:color w:val="007020"/>
+      <w:b/>
+    </w:rPr>
+  </w:style>
+  <w:style w:customStyle="1" w:styleId="OperatorTok" w:type="character">
+    <w:name w:val="OperatorTok"/>
+    <w:basedOn w:val="VerbatimChar"/>
+    <w:rPr>
+      <w:color w:val="666666"/>
+    </w:rPr>
+  </w:style>
+  <w:style w:customStyle="1" w:styleId="BuiltInTok" w:type="character">
+    <w:name w:val="BuiltInTok"/>
+    <w:basedOn w:val="VerbatimChar"/>
+    <w:rPr>
+      <w:color w:val="008000"/>
+    </w:rPr>
+  </w:style>
+  <w:style w:customStyle="1" w:styleId="ExtensionTok" w:type="character">
+    <w:name w:val="ExtensionTok"/>
+    <w:basedOn w:val="VerbatimChar"/>
+    <w:rPr/>
+  </w:style>
+  <w:style w:customStyle="1" w:styleId="PreprocessorTok" w:type="character">
+    <w:name w:val="PreprocessorTok"/>
+    <w:basedOn w:val="VerbatimChar"/>
+    <w:rPr>
+      <w:color w:val="bc7a00"/>
+    </w:rPr>
+  </w:style>
+  <w:style w:customStyle="1" w:styleId="AttributeTok" w:type="character">
+    <w:name w:val="AttributeTok"/>
+    <w:basedOn w:val="VerbatimChar"/>
+    <w:rPr>
+      <w:color w:val="7d9029"/>
+    </w:rPr>
+  </w:style>
+  <w:style w:customStyle="1" w:styleId="RegionMarkerTok" w:type="character">
+    <w:name w:val="RegionMarkerTok"/>
+    <w:basedOn w:val="VerbatimChar"/>
+    <w:rPr/>
+  </w:style>
+  <w:style w:customStyle="1" w:styleId="InformationTok" w:type="character">
+    <w:name w:val="InformationTok"/>
+    <w:basedOn w:val="VerbatimChar"/>
+    <w:rPr>
+      <w:color w:val="60a0b0"/>
+      <w:b/>
+      <w:i/>
+    </w:rPr>
+  </w:style>
+  <w:style w:customStyle="1" w:styleId="WarningTok" w:type="character">
+    <w:name w:val="WarningTok"/>
+    <w:basedOn w:val="VerbatimChar"/>
+    <w:rPr>
+      <w:color w:val="60a0b0"/>
+      <w:b/>
+      <w:i/>
+    </w:rPr>
+  </w:style>
+  <w:style w:customStyle="1" w:styleId="AlertTok" w:type="character">
+    <w:name w:val="AlertTok"/>
+    <w:basedOn w:val="VerbatimChar"/>
+    <w:rPr>
+      <w:color w:val="ff0000"/>
+      <w:b/>
+    </w:rPr>
+  </w:style>
+  <w:style w:customStyle="1" w:styleId="ErrorTok" w:type="character">
+    <w:name w:val="ErrorTok"/>
+    <w:basedOn w:val="VerbatimChar"/>
+    <w:rPr>
+      <w:color w:val="ff0000"/>
+      <w:b/>
+    </w:rPr>
+  </w:style>
+  <w:style w:customStyle="1" w:styleId="NormalTok" w:type="character">
+    <w:name w:val="NormalTok"/>
+    <w:basedOn w:val="VerbatimChar"/>
+    <w:rPr/>
   </w:style>
   <w:style w:customStyle="1" w:styleId="KeywordTok" w:type="character">
     <w:name w:val="KeywordTok"/>

</xml_diff>

<commit_message>
Avisos al celular del jefe por Telegram
Apertura y cierre de caja (con esperado, contado y diferencia), relevo de turno
y falta de stock. Se conectan desde Mis comercios con un link de un solo uso;
tabla configuracion_telegram por comercio. Se mandan en segundo plano y nunca
frenan la Caja. Guía y README actualizados.

Co-Authored-By: Claude Opus 5.5 (1M context) <noreply@anthropic.com>
Claude-Session: https://claude.ai/code/session_01RCy4xV2R83tGYACMxcEVRz
</commit_message>
<xml_diff>
--- a/informe/guia/guia-del-sistema.docx
+++ b/informe/guia/guia-del-sistema.docx
@@ -2,7 +2,7 @@
 <file path=word/document.xml><?xml version="1.0" encoding="utf-8"?>
 <w:document xmlns:w="http://schemas.openxmlformats.org/wordprocessingml/2006/main" xmlns:m="http://schemas.openxmlformats.org/officeDocument/2006/math" xmlns:r="http://schemas.openxmlformats.org/officeDocument/2006/relationships" xmlns:o="urn:schemas-microsoft-com:office:office" xmlns:v="urn:schemas-microsoft-com:vml" xmlns:w10="urn:schemas-microsoft-com:office:word" xmlns:a="http://schemas.openxmlformats.org/drawingml/2006/main" xmlns:pic="http://schemas.openxmlformats.org/drawingml/2006/picture" xmlns:wp="http://schemas.openxmlformats.org/drawingml/2006/wordprocessingDrawing">
   <w:body>
-    <w:bookmarkStart w:id="38" w:name="X201b470bc2211cfa7ca72a3b3a935502bafda1a"/>
+    <w:bookmarkStart w:id="39" w:name="X201b470bc2211cfa7ca72a3b3a935502bafda1a"/>
     <w:p>
       <w:pPr>
         <w:pStyle w:val="Heading1"/>
@@ -1687,7 +1687,7 @@
     </w:p>
     <w:bookmarkEnd w:id="23"/>
     <w:bookmarkEnd w:id="24"/>
-    <w:bookmarkStart w:id="29" w:name="jefe-y-empleado"/>
+    <w:bookmarkStart w:id="30" w:name="jefe-y-empleado"/>
     <w:p>
       <w:pPr>
         <w:pStyle w:val="Heading2"/>
@@ -2973,8 +2973,777 @@
       </w:r>
     </w:p>
     <w:bookmarkEnd w:id="28"/>
+    <w:bookmarkStart w:id="29" w:name="avisos-al-celular-por-telegram"/>
+    <w:p>
+      <w:pPr>
+        <w:pStyle w:val="Heading3"/>
+      </w:pPr>
+      <w:r>
+        <w:t xml:space="preserve">Avisos al celular por Telegram</w:t>
+      </w:r>
+    </w:p>
+    <w:p>
+      <w:pPr>
+        <w:pStyle w:val="FirstParagraph"/>
+      </w:pPr>
+      <w:r>
+        <w:t xml:space="preserve">El jefe no está siempre en el local. Con un</w:t>
+      </w:r>
+      <w:r>
+        <w:t xml:space="preserve"> </w:t>
+      </w:r>
+      <w:r>
+        <w:rPr>
+          <w:bCs/>
+          <w:b/>
+        </w:rPr>
+        <w:t xml:space="preserve">bot de Telegram</w:t>
+      </w:r>
+      <w:r>
+        <w:t xml:space="preserve"> </w:t>
+      </w:r>
+      <w:r>
+        <w:t xml:space="preserve">(un</w:t>
+      </w:r>
+      <w:r>
+        <w:t xml:space="preserve"> </w:t>
+      </w:r>
+      <w:r>
+        <w:t xml:space="preserve">“</w:t>
+      </w:r>
+      <w:r>
+        <w:t xml:space="preserve">contacto</w:t>
+      </w:r>
+      <w:r>
+        <w:t xml:space="preserve">”</w:t>
+      </w:r>
+      <w:r>
+        <w:t xml:space="preserve"> </w:t>
+      </w:r>
+      <w:r>
+        <w:t xml:space="preserve">automático que manda mensajes) le llega al celular:</w:t>
+      </w:r>
+    </w:p>
+    <w:p>
+      <w:pPr>
+        <w:numPr>
+          <w:ilvl w:val="0"/>
+          <w:numId w:val="1009"/>
+        </w:numPr>
+        <w:pStyle w:val="Compact"/>
+      </w:pPr>
+      <w:r>
+        <w:t xml:space="preserve">🔓</w:t>
+      </w:r>
+      <w:r>
+        <w:t xml:space="preserve"> </w:t>
+      </w:r>
+      <w:r>
+        <w:rPr>
+          <w:bCs/>
+          <w:b/>
+        </w:rPr>
+        <w:t xml:space="preserve">Apertura de caja:</w:t>
+      </w:r>
+      <w:r>
+        <w:t xml:space="preserve"> </w:t>
+      </w:r>
+      <w:r>
+        <w:t xml:space="preserve">quién abrió y con cuánto efectivo.</w:t>
+      </w:r>
+    </w:p>
+    <w:p>
+      <w:pPr>
+        <w:numPr>
+          <w:ilvl w:val="0"/>
+          <w:numId w:val="1009"/>
+        </w:numPr>
+        <w:pStyle w:val="Compact"/>
+      </w:pPr>
+      <w:r>
+        <w:t xml:space="preserve">🔔</w:t>
+      </w:r>
+      <w:r>
+        <w:t xml:space="preserve"> </w:t>
+      </w:r>
+      <w:r>
+        <w:rPr>
+          <w:bCs/>
+          <w:b/>
+        </w:rPr>
+        <w:t xml:space="preserve">Cierre de caja:</w:t>
+      </w:r>
+      <w:r>
+        <w:t xml:space="preserve"> </w:t>
+      </w:r>
+      <w:r>
+        <w:t xml:space="preserve">quién cerró, cuántas ventas, efectivo esperado, efectivo contado y si</w:t>
+      </w:r>
+      <w:r>
+        <w:t xml:space="preserve"> </w:t>
+      </w:r>
+      <w:r>
+        <w:rPr>
+          <w:bCs/>
+          <w:b/>
+        </w:rPr>
+        <w:t xml:space="preserve">faltó o sobró</w:t>
+      </w:r>
+      <w:r>
+        <w:t xml:space="preserve">.</w:t>
+      </w:r>
+    </w:p>
+    <w:p>
+      <w:pPr>
+        <w:numPr>
+          <w:ilvl w:val="0"/>
+          <w:numId w:val="1009"/>
+        </w:numPr>
+        <w:pStyle w:val="Compact"/>
+      </w:pPr>
+      <w:r>
+        <w:t xml:space="preserve">🔄</w:t>
+      </w:r>
+      <w:r>
+        <w:t xml:space="preserve"> </w:t>
+      </w:r>
+      <w:r>
+        <w:rPr>
+          <w:bCs/>
+          <w:b/>
+        </w:rPr>
+        <w:t xml:space="preserve">Relevo de turno:</w:t>
+      </w:r>
+      <w:r>
+        <w:t xml:space="preserve"> </w:t>
+      </w:r>
+      <w:r>
+        <w:t xml:space="preserve">quién entregó, quién recibe y cómo dio el efectivo de ese turno.</w:t>
+      </w:r>
+    </w:p>
+    <w:p>
+      <w:pPr>
+        <w:numPr>
+          <w:ilvl w:val="0"/>
+          <w:numId w:val="1009"/>
+        </w:numPr>
+        <w:pStyle w:val="Compact"/>
+      </w:pPr>
+      <w:r>
+        <w:t xml:space="preserve">📦</w:t>
+      </w:r>
+      <w:r>
+        <w:t xml:space="preserve"> </w:t>
+      </w:r>
+      <w:r>
+        <w:rPr>
+          <w:bCs/>
+          <w:b/>
+        </w:rPr>
+        <w:t xml:space="preserve">Falta de stock:</w:t>
+      </w:r>
+      <w:r>
+        <w:t xml:space="preserve"> </w:t>
+      </w:r>
+      <w:r>
+        <w:t xml:space="preserve">cuando un producto llega al stock mínimo (por una venta o por retirar vencidos). Avisa una sola vez, cuando cruza el mínimo; no uno por cada venta que sigue.</w:t>
+      </w:r>
+    </w:p>
+    <w:p>
+      <w:pPr>
+        <w:pStyle w:val="FirstParagraph"/>
+      </w:pPr>
+      <w:r>
+        <w:t xml:space="preserve">Solo le llegan al</w:t>
+      </w:r>
+      <w:r>
+        <w:t xml:space="preserve"> </w:t>
+      </w:r>
+      <w:r>
+        <w:rPr>
+          <w:bCs/>
+          <w:b/>
+        </w:rPr>
+        <w:t xml:space="preserve">jefe</w:t>
+      </w:r>
+      <w:r>
+        <w:t xml:space="preserve">: el empleado no ve esta parte.</w:t>
+      </w:r>
+    </w:p>
+    <w:p>
+      <w:pPr>
+        <w:pStyle w:val="BodyText"/>
+      </w:pPr>
+      <w:r>
+        <w:rPr>
+          <w:bCs/>
+          <w:b/>
+        </w:rPr>
+        <w:t xml:space="preserve">Paso 1 · Crear el bot (una sola vez, 2 minutos):</w:t>
+      </w:r>
+    </w:p>
+    <w:p>
+      <w:pPr>
+        <w:numPr>
+          <w:ilvl w:val="0"/>
+          <w:numId w:val="1010"/>
+        </w:numPr>
+        <w:pStyle w:val="Compact"/>
+      </w:pPr>
+      <w:r>
+        <w:t xml:space="preserve">En Telegram, buscá</w:t>
+      </w:r>
+      <w:r>
+        <w:t xml:space="preserve"> </w:t>
+      </w:r>
+      <w:r>
+        <w:rPr>
+          <w:bCs/>
+          <w:b/>
+        </w:rPr>
+        <w:t xml:space="preserve">@BotFather</w:t>
+      </w:r>
+      <w:r>
+        <w:t xml:space="preserve"> </w:t>
+      </w:r>
+      <w:r>
+        <w:t xml:space="preserve">(tiene una tilde azul) y tocá</w:t>
+      </w:r>
+      <w:r>
+        <w:t xml:space="preserve"> </w:t>
+      </w:r>
+      <w:r>
+        <w:rPr>
+          <w:bCs/>
+          <w:b/>
+        </w:rPr>
+        <w:t xml:space="preserve">Iniciar</w:t>
+      </w:r>
+      <w:r>
+        <w:t xml:space="preserve">.</w:t>
+      </w:r>
+    </w:p>
+    <w:p>
+      <w:pPr>
+        <w:numPr>
+          <w:ilvl w:val="0"/>
+          <w:numId w:val="1010"/>
+        </w:numPr>
+        <w:pStyle w:val="Compact"/>
+      </w:pPr>
+      <w:r>
+        <w:t xml:space="preserve">Escribile</w:t>
+      </w:r>
+      <w:r>
+        <w:t xml:space="preserve"> </w:t>
+      </w:r>
+      <w:r>
+        <w:rPr>
+          <w:rStyle w:val="VerbatimChar"/>
+        </w:rPr>
+        <w:t xml:space="preserve">/newbot</w:t>
+      </w:r>
+      <w:r>
+        <w:t xml:space="preserve">.</w:t>
+      </w:r>
+    </w:p>
+    <w:p>
+      <w:pPr>
+        <w:numPr>
+          <w:ilvl w:val="0"/>
+          <w:numId w:val="1010"/>
+        </w:numPr>
+        <w:pStyle w:val="Compact"/>
+      </w:pPr>
+      <w:r>
+        <w:t xml:space="preserve">Te pide un</w:t>
+      </w:r>
+      <w:r>
+        <w:t xml:space="preserve"> </w:t>
+      </w:r>
+      <w:r>
+        <w:rPr>
+          <w:bCs/>
+          <w:b/>
+        </w:rPr>
+        <w:t xml:space="preserve">nombre</w:t>
+      </w:r>
+      <w:r>
+        <w:t xml:space="preserve">, el que vas a ver en los chats (ej.:</w:t>
+      </w:r>
+      <w:r>
+        <w:t xml:space="preserve"> </w:t>
+      </w:r>
+      <w:r>
+        <w:rPr>
+          <w:iCs/>
+          <w:i/>
+        </w:rPr>
+        <w:t xml:space="preserve">Avisos Ferretería</w:t>
+      </w:r>
+      <w:r>
+        <w:t xml:space="preserve">).</w:t>
+      </w:r>
+    </w:p>
+    <w:p>
+      <w:pPr>
+        <w:numPr>
+          <w:ilvl w:val="0"/>
+          <w:numId w:val="1010"/>
+        </w:numPr>
+        <w:pStyle w:val="Compact"/>
+      </w:pPr>
+      <w:r>
+        <w:t xml:space="preserve">Te pide un</w:t>
+      </w:r>
+      <w:r>
+        <w:t xml:space="preserve"> </w:t>
+      </w:r>
+      <w:r>
+        <w:rPr>
+          <w:bCs/>
+          <w:b/>
+        </w:rPr>
+        <w:t xml:space="preserve">usuario</w:t>
+      </w:r>
+      <w:r>
+        <w:t xml:space="preserve"> </w:t>
+      </w:r>
+      <w:r>
+        <w:t xml:space="preserve">que termine en</w:t>
+      </w:r>
+      <w:r>
+        <w:t xml:space="preserve"> </w:t>
+      </w:r>
+      <w:r>
+        <w:rPr>
+          <w:rStyle w:val="VerbatimChar"/>
+        </w:rPr>
+        <w:t xml:space="preserve">bot</w:t>
+      </w:r>
+      <w:r>
+        <w:t xml:space="preserve"> </w:t>
+      </w:r>
+      <w:r>
+        <w:t xml:space="preserve">y que nadie más tenga (ej.:</w:t>
+      </w:r>
+      <w:r>
+        <w:t xml:space="preserve"> </w:t>
+      </w:r>
+      <w:r>
+        <w:rPr>
+          <w:rStyle w:val="VerbatimChar"/>
+        </w:rPr>
+        <w:t xml:space="preserve">avisos_ferreteria_tito_bot</w:t>
+      </w:r>
+      <w:r>
+        <w:t xml:space="preserve">).</w:t>
+      </w:r>
+    </w:p>
+    <w:p>
+      <w:pPr>
+        <w:numPr>
+          <w:ilvl w:val="0"/>
+          <w:numId w:val="1010"/>
+        </w:numPr>
+        <w:pStyle w:val="Compact"/>
+      </w:pPr>
+      <w:r>
+        <w:t xml:space="preserve">Te responde con el</w:t>
+      </w:r>
+      <w:r>
+        <w:t xml:space="preserve"> </w:t>
+      </w:r>
+      <w:r>
+        <w:rPr>
+          <w:bCs/>
+          <w:b/>
+        </w:rPr>
+        <w:t xml:space="preserve">token</w:t>
+      </w:r>
+      <w:r>
+        <w:t xml:space="preserve">, algo como</w:t>
+      </w:r>
+      <w:r>
+        <w:t xml:space="preserve"> </w:t>
+      </w:r>
+      <w:r>
+        <w:rPr>
+          <w:rStyle w:val="VerbatimChar"/>
+        </w:rPr>
+        <w:t xml:space="preserve">123456789:AAH...</w:t>
+      </w:r>
+      <w:r>
+        <w:t xml:space="preserve">. Es la clave del bot:</w:t>
+      </w:r>
+      <w:r>
+        <w:t xml:space="preserve"> </w:t>
+      </w:r>
+      <w:r>
+        <w:rPr>
+          <w:bCs/>
+          <w:b/>
+        </w:rPr>
+        <w:t xml:space="preserve">no se la pases a nadie</w:t>
+      </w:r>
+      <w:r>
+        <w:t xml:space="preserve"> </w:t>
+      </w:r>
+      <w:r>
+        <w:t xml:space="preserve">ni la pegues en un chat.</w:t>
+      </w:r>
+    </w:p>
+    <w:p>
+      <w:pPr>
+        <w:pStyle w:val="FirstParagraph"/>
+      </w:pPr>
+      <w:r>
+        <w:rPr>
+          <w:bCs/>
+          <w:b/>
+        </w:rPr>
+        <w:t xml:space="preserve">Paso 2 · Pegar el token:</w:t>
+      </w:r>
+      <w:r>
+        <w:t xml:space="preserve"> </w:t>
+      </w:r>
+      <w:r>
+        <w:t xml:space="preserve">en</w:t>
+      </w:r>
+      <w:r>
+        <w:t xml:space="preserve"> </w:t>
+      </w:r>
+      <w:r>
+        <w:rPr>
+          <w:bCs/>
+          <w:b/>
+        </w:rPr>
+        <w:t xml:space="preserve">Mis comercios → 📲 Avisos al celular</w:t>
+      </w:r>
+      <w:r>
+        <w:t xml:space="preserve">, pegalo y tocá</w:t>
+      </w:r>
+      <w:r>
+        <w:t xml:space="preserve"> </w:t>
+      </w:r>
+      <w:r>
+        <w:rPr>
+          <w:bCs/>
+          <w:b/>
+        </w:rPr>
+        <w:t xml:space="preserve">Guardar token</w:t>
+      </w:r>
+      <w:r>
+        <w:t xml:space="preserve">. El sistema lo prueba con Telegram y lo guarda en el archivo</w:t>
+      </w:r>
+      <w:r>
+        <w:t xml:space="preserve"> </w:t>
+      </w:r>
+      <w:r>
+        <w:rPr>
+          <w:rStyle w:val="VerbatimChar"/>
+        </w:rPr>
+        <w:t xml:space="preserve">.env</w:t>
+      </w:r>
+      <w:r>
+        <w:t xml:space="preserve"> </w:t>
+      </w:r>
+      <w:r>
+        <w:t xml:space="preserve">de la carpeta (no se sube a GitHub).</w:t>
+      </w:r>
+    </w:p>
+    <w:p>
+      <w:pPr>
+        <w:pStyle w:val="BodyText"/>
+      </w:pPr>
+      <w:r>
+        <w:rPr>
+          <w:bCs/>
+          <w:b/>
+        </w:rPr>
+        <w:t xml:space="preserve">Paso 3 · Conectar tu celular:</w:t>
+      </w:r>
+      <w:r>
+        <w:t xml:space="preserve"> </w:t>
+      </w:r>
+      <w:r>
+        <w:t xml:space="preserve">tocá</w:t>
+      </w:r>
+      <w:r>
+        <w:t xml:space="preserve"> </w:t>
+      </w:r>
+      <w:r>
+        <w:rPr>
+          <w:bCs/>
+          <w:b/>
+        </w:rPr>
+        <w:t xml:space="preserve">📲 Conectar con Telegram</w:t>
+      </w:r>
+      <w:r>
+        <w:t xml:space="preserve">, elegí qué comercios te avisan (vienen todos marcados), abrí el link y tocá</w:t>
+      </w:r>
+      <w:r>
+        <w:t xml:space="preserve"> </w:t>
+      </w:r>
+      <w:r>
+        <w:rPr>
+          <w:bCs/>
+          <w:b/>
+        </w:rPr>
+        <w:t xml:space="preserve">Iniciar</w:t>
+      </w:r>
+      <w:r>
+        <w:t xml:space="preserve">. En unos segundos el sistema se da cuenta solo y el bot te escribe</w:t>
+      </w:r>
+      <w:r>
+        <w:t xml:space="preserve"> </w:t>
+      </w:r>
+      <w:r>
+        <w:t xml:space="preserve">“</w:t>
+      </w:r>
+      <w:r>
+        <w:t xml:space="preserve">Listo, quedaste conectado</w:t>
+      </w:r>
+      <w:r>
+        <w:t xml:space="preserve">”</w:t>
+      </w:r>
+      <w:r>
+        <w:t xml:space="preserve">.</w:t>
+      </w:r>
+    </w:p>
+    <w:p>
+      <w:pPr>
+        <w:pStyle w:val="BodyText"/>
+      </w:pPr>
+      <w:r>
+        <w:rPr>
+          <w:bCs/>
+          <w:b/>
+        </w:rPr>
+        <w:t xml:space="preserve">Después:</w:t>
+      </w:r>
+      <w:r>
+        <w:t xml:space="preserve"> </w:t>
+      </w:r>
+      <w:r>
+        <w:t xml:space="preserve">en cada comercio podés elegir qué avisos querés, mandar un</w:t>
+      </w:r>
+      <w:r>
+        <w:t xml:space="preserve"> </w:t>
+      </w:r>
+      <w:r>
+        <w:rPr>
+          <w:bCs/>
+          <w:b/>
+        </w:rPr>
+        <w:t xml:space="preserve">mensaje de prueba</w:t>
+      </w:r>
+      <w:r>
+        <w:t xml:space="preserve">, apagar los avisos un rato o</w:t>
+      </w:r>
+      <w:r>
+        <w:t xml:space="preserve"> </w:t>
+      </w:r>
+      <w:r>
+        <w:rPr>
+          <w:bCs/>
+          <w:b/>
+        </w:rPr>
+        <w:t xml:space="preserve">desconectar</w:t>
+      </w:r>
+      <w:r>
+        <w:t xml:space="preserve">.</w:t>
+      </w:r>
+    </w:p>
+    <w:p>
+      <w:pPr>
+        <w:pStyle w:val="BodyText"/>
+      </w:pPr>
+      <w:r>
+        <w:rPr>
+          <w:bCs/>
+          <w:b/>
+        </w:rPr>
+        <w:t xml:space="preserve">Cosas importantes:</w:t>
+      </w:r>
+    </w:p>
+    <w:p>
+      <w:pPr>
+        <w:numPr>
+          <w:ilvl w:val="0"/>
+          <w:numId w:val="1011"/>
+        </w:numPr>
+        <w:pStyle w:val="Compact"/>
+      </w:pPr>
+      <w:r>
+        <w:t xml:space="preserve">Los avisos salen</w:t>
+      </w:r>
+      <w:r>
+        <w:t xml:space="preserve"> </w:t>
+      </w:r>
+      <w:r>
+        <w:rPr>
+          <w:bCs/>
+          <w:b/>
+        </w:rPr>
+        <w:t xml:space="preserve">por detrás</w:t>
+      </w:r>
+      <w:r>
+        <w:t xml:space="preserve"> </w:t>
+      </w:r>
+      <w:r>
+        <w:t xml:space="preserve">(en segundo plano): la Caja no espera a Telegram. Si no hay internet, se cobra y se cierra igual; solo se pierde el aviso.</w:t>
+      </w:r>
+    </w:p>
+    <w:p>
+      <w:pPr>
+        <w:numPr>
+          <w:ilvl w:val="0"/>
+          <w:numId w:val="1011"/>
+        </w:numPr>
+        <w:pStyle w:val="Compact"/>
+      </w:pPr>
+      <w:r>
+        <w:t xml:space="preserve">Cada aviso se busca por</w:t>
+      </w:r>
+      <w:r>
+        <w:t xml:space="preserve"> </w:t>
+      </w:r>
+      <w:r>
+        <w:rPr>
+          <w:bCs/>
+          <w:b/>
+        </w:rPr>
+        <w:t xml:space="preserve">comercio</w:t>
+      </w:r>
+      <w:r>
+        <w:t xml:space="preserve">: un comercio nunca le avisa al chat de otro dueño.</w:t>
+      </w:r>
+    </w:p>
+    <w:p>
+      <w:pPr>
+        <w:numPr>
+          <w:ilvl w:val="0"/>
+          <w:numId w:val="1011"/>
+        </w:numPr>
+        <w:pStyle w:val="Compact"/>
+      </w:pPr>
+      <w:r>
+        <w:rPr>
+          <w:bCs/>
+          <w:b/>
+        </w:rPr>
+        <w:t xml:space="preserve">Cómo funciona el link:</w:t>
+      </w:r>
+      <w:r>
+        <w:t xml:space="preserve"> </w:t>
+      </w:r>
+      <w:r>
+        <w:t xml:space="preserve">lleva un código de un solo uso (</w:t>
+      </w:r>
+      <w:r>
+        <w:rPr>
+          <w:rStyle w:val="VerbatimChar"/>
+        </w:rPr>
+        <w:t xml:space="preserve">token_vinculacion</w:t>
+      </w:r>
+      <w:r>
+        <w:t xml:space="preserve">). Al tocar Iniciar, Telegram le manda al bot</w:t>
+      </w:r>
+      <w:r>
+        <w:t xml:space="preserve"> </w:t>
+      </w:r>
+      <w:r>
+        <w:rPr>
+          <w:rStyle w:val="VerbatimChar"/>
+        </w:rPr>
+        <w:t xml:space="preserve">/start &lt;código&gt;</w:t>
+      </w:r>
+      <w:r>
+        <w:t xml:space="preserve">, el sistema lo lee, guarda tu chat (</w:t>
+      </w:r>
+      <w:r>
+        <w:rPr>
+          <w:rStyle w:val="VerbatimChar"/>
+        </w:rPr>
+        <w:t xml:space="preserve">telegram_chat_id</w:t>
+      </w:r>
+      <w:r>
+        <w:t xml:space="preserve">) y borra el código. Si en 10 minutos no tocás Iniciar, hay que pedir el link de nuevo.</w:t>
+      </w:r>
+    </w:p>
+    <w:p>
+      <w:pPr>
+        <w:numPr>
+          <w:ilvl w:val="0"/>
+          <w:numId w:val="1011"/>
+        </w:numPr>
+        <w:pStyle w:val="Compact"/>
+      </w:pPr>
+      <w:r>
+        <w:rPr>
+          <w:bCs/>
+          <w:b/>
+        </w:rPr>
+        <w:t xml:space="preserve">En la demo</w:t>
+      </w:r>
+      <w:r>
+        <w:t xml:space="preserve"> </w:t>
+      </w:r>
+      <w:r>
+        <w:t xml:space="preserve">(internet) no se manda nada salvo que el token esté en los</w:t>
+      </w:r>
+      <w:r>
+        <w:t xml:space="preserve"> </w:t>
+      </w:r>
+      <w:r>
+        <w:rPr>
+          <w:iCs/>
+          <w:i/>
+        </w:rPr>
+        <w:t xml:space="preserve">Secrets</w:t>
+      </w:r>
+      <w:r>
+        <w:t xml:space="preserve"> </w:t>
+      </w:r>
+      <w:r>
+        <w:t xml:space="preserve">de Streamlit (</w:t>
+      </w:r>
+      <w:r>
+        <w:rPr>
+          <w:rStyle w:val="VerbatimChar"/>
+        </w:rPr>
+        <w:t xml:space="preserve">TELEGRAM_BOT_TOKEN</w:t>
+      </w:r>
+      <w:r>
+        <w:t xml:space="preserve">).</w:t>
+      </w:r>
+    </w:p>
+    <w:p>
+      <w:pPr>
+        <w:numPr>
+          <w:ilvl w:val="0"/>
+          <w:numId w:val="1011"/>
+        </w:numPr>
+        <w:pStyle w:val="Compact"/>
+      </w:pPr>
+      <w:r>
+        <w:rPr>
+          <w:bCs/>
+          <w:b/>
+        </w:rPr>
+        <w:t xml:space="preserve">En la nube</w:t>
+      </w:r>
+      <w:r>
+        <w:t xml:space="preserve"> </w:t>
+      </w:r>
+      <w:r>
+        <w:t xml:space="preserve">(más adelante) va a haber un solo bot del sistema para todos los clientes; cada jefe solo hace el paso 3.</w:t>
+      </w:r>
+    </w:p>
     <w:bookmarkEnd w:id="29"/>
-    <w:bookmarkStart w:id="30" w:name="el-lector-de-código-de-barras"/>
+    <w:bookmarkEnd w:id="30"/>
+    <w:bookmarkStart w:id="31" w:name="el-lector-de-código-de-barras"/>
     <w:p>
       <w:pPr>
         <w:pStyle w:val="Heading2"/>
@@ -3049,7 +3818,7 @@
       <w:pPr>
         <w:numPr>
           <w:ilvl w:val="0"/>
-          <w:numId w:val="1009"/>
+          <w:numId w:val="1012"/>
         </w:numPr>
         <w:pStyle w:val="Compact"/>
       </w:pPr>
@@ -3128,7 +3897,7 @@
       <w:pPr>
         <w:numPr>
           <w:ilvl w:val="0"/>
-          <w:numId w:val="1009"/>
+          <w:numId w:val="1012"/>
         </w:numPr>
         <w:pStyle w:val="Compact"/>
       </w:pPr>
@@ -3168,7 +3937,7 @@
       <w:pPr>
         <w:numPr>
           <w:ilvl w:val="0"/>
-          <w:numId w:val="1009"/>
+          <w:numId w:val="1012"/>
         </w:numPr>
         <w:pStyle w:val="Compact"/>
       </w:pPr>
@@ -3202,7 +3971,7 @@
       <w:pPr>
         <w:numPr>
           <w:ilvl w:val="0"/>
-          <w:numId w:val="1010"/>
+          <w:numId w:val="1013"/>
         </w:numPr>
         <w:pStyle w:val="Compact"/>
       </w:pPr>
@@ -3239,7 +4008,7 @@
       <w:pPr>
         <w:numPr>
           <w:ilvl w:val="0"/>
-          <w:numId w:val="1010"/>
+          <w:numId w:val="1013"/>
         </w:numPr>
         <w:pStyle w:val="Compact"/>
       </w:pPr>
@@ -3276,7 +4045,7 @@
       <w:pPr>
         <w:numPr>
           <w:ilvl w:val="0"/>
-          <w:numId w:val="1010"/>
+          <w:numId w:val="1013"/>
         </w:numPr>
         <w:pStyle w:val="Compact"/>
       </w:pPr>
@@ -3288,7 +4057,7 @@
       <w:pPr>
         <w:numPr>
           <w:ilvl w:val="0"/>
-          <w:numId w:val="1010"/>
+          <w:numId w:val="1013"/>
         </w:numPr>
         <w:pStyle w:val="Compact"/>
       </w:pPr>
@@ -3329,8 +4098,8 @@
         <w:t xml:space="preserve">de la base, y desde ahí la leen la Caja, el Stock y los reportes.</w:t>
       </w:r>
     </w:p>
-    <w:bookmarkEnd w:id="30"/>
-    <w:bookmarkStart w:id="31" w:name="la-base-de-datos-por-dentro"/>
+    <w:bookmarkEnd w:id="31"/>
+    <w:bookmarkStart w:id="32" w:name="la-base-de-datos-por-dentro"/>
     <w:p>
       <w:pPr>
         <w:pStyle w:val="Heading2"/>
@@ -3427,7 +4196,16 @@
         <w:rPr>
           <w:rStyle w:val="VerbatimChar"/>
         </w:rPr>
-        <w:t xml:space="preserve">        └── gastos</w:t>
+        <w:t xml:space="preserve">        ├── gastos</w:t>
+      </w:r>
+      <w:r>
+        <w:br/>
+      </w:r>
+      <w:r>
+        <w:rPr>
+          <w:rStyle w:val="VerbatimChar"/>
+        </w:rPr>
+        <w:t xml:space="preserve">        └── configuracion_telegram</w:t>
       </w:r>
     </w:p>
     <w:tbl>
@@ -3926,6 +4704,35 @@
           </w:p>
         </w:tc>
       </w:tr>
+      <w:tr>
+        <w:tc>
+          <w:tcPr/>
+          <w:p>
+            <w:pPr>
+              <w:pStyle w:val="Compact"/>
+              <w:jc w:val="left"/>
+            </w:pPr>
+            <w:r>
+              <w:rPr>
+                <w:rStyle w:val="VerbatimChar"/>
+              </w:rPr>
+              <w:t xml:space="preserve">configuracion_telegram</w:t>
+            </w:r>
+          </w:p>
+        </w:tc>
+        <w:tc>
+          <w:tcPr/>
+          <w:p>
+            <w:pPr>
+              <w:pStyle w:val="Compact"/>
+              <w:jc w:val="left"/>
+            </w:pPr>
+            <w:r>
+              <w:t xml:space="preserve">Una fila por comercio: el chat de Telegram del jefe, el código del link para conectarse (se borra al usarlo), si los avisos están prendidos y cuáles quiere.</w:t>
+            </w:r>
+          </w:p>
+        </w:tc>
+      </w:tr>
     </w:tbl>
     <w:p>
       <w:pPr>
@@ -4009,7 +4816,7 @@
       <w:pPr>
         <w:numPr>
           <w:ilvl w:val="0"/>
-          <w:numId w:val="1011"/>
+          <w:numId w:val="1014"/>
         </w:numPr>
         <w:pStyle w:val="Compact"/>
       </w:pPr>
@@ -4021,7 +4828,7 @@
       <w:pPr>
         <w:numPr>
           <w:ilvl w:val="0"/>
-          <w:numId w:val="1011"/>
+          <w:numId w:val="1014"/>
         </w:numPr>
         <w:pStyle w:val="Compact"/>
       </w:pPr>
@@ -4048,7 +4855,7 @@
       <w:pPr>
         <w:numPr>
           <w:ilvl w:val="0"/>
-          <w:numId w:val="1011"/>
+          <w:numId w:val="1014"/>
         </w:numPr>
         <w:pStyle w:val="Compact"/>
       </w:pPr>
@@ -4075,7 +4882,7 @@
       <w:pPr>
         <w:numPr>
           <w:ilvl w:val="0"/>
-          <w:numId w:val="1011"/>
+          <w:numId w:val="1014"/>
         </w:numPr>
         <w:pStyle w:val="Compact"/>
       </w:pPr>
@@ -4099,7 +4906,7 @@
       <w:pPr>
         <w:numPr>
           <w:ilvl w:val="0"/>
-          <w:numId w:val="1011"/>
+          <w:numId w:val="1014"/>
         </w:numPr>
         <w:pStyle w:val="Compact"/>
       </w:pPr>
@@ -4130,8 +4937,8 @@
         <w:t xml:space="preserve">Todo eso pasa junto: si algo falla, no se guarda nada a medias.</w:t>
       </w:r>
     </w:p>
-    <w:bookmarkEnd w:id="31"/>
-    <w:bookmarkStart w:id="32" w:name="los-excel-del-sistema"/>
+    <w:bookmarkEnd w:id="32"/>
+    <w:bookmarkStart w:id="33" w:name="los-excel-del-sistema"/>
     <w:p>
       <w:pPr>
         <w:pStyle w:val="Heading2"/>
@@ -4144,7 +4951,7 @@
       <w:pPr>
         <w:numPr>
           <w:ilvl w:val="0"/>
-          <w:numId w:val="1012"/>
+          <w:numId w:val="1015"/>
         </w:numPr>
         <w:pStyle w:val="Compact"/>
       </w:pPr>
@@ -4280,7 +5087,7 @@
       <w:pPr>
         <w:numPr>
           <w:ilvl w:val="0"/>
-          <w:numId w:val="1012"/>
+          <w:numId w:val="1015"/>
         </w:numPr>
         <w:pStyle w:val="Compact"/>
       </w:pPr>
@@ -4302,7 +5109,7 @@
       <w:pPr>
         <w:numPr>
           <w:ilvl w:val="0"/>
-          <w:numId w:val="1012"/>
+          <w:numId w:val="1015"/>
         </w:numPr>
         <w:pStyle w:val="Compact"/>
       </w:pPr>
@@ -4332,8 +5139,8 @@
         <w:t xml:space="preserve">. El semanal se prende por comercio (conviene en temporada alta; de diciembre a febrero el Inicio lo sugiere).</w:t>
       </w:r>
     </w:p>
-    <w:bookmarkEnd w:id="32"/>
-    <w:bookmarkStart w:id="33" w:name="los-archivos-del-proyecto"/>
+    <w:bookmarkEnd w:id="33"/>
+    <w:bookmarkStart w:id="34" w:name="los-archivos-del-proyecto"/>
     <w:p>
       <w:pPr>
         <w:pStyle w:val="Heading2"/>
@@ -4684,7 +5491,7 @@
               <w:rPr>
                 <w:rStyle w:val="VerbatimChar"/>
               </w:rPr>
-              <w:t xml:space="preserve">generar_datos_prueba.py</w:t>
+              <w:t xml:space="preserve">notificaciones_telegram.py</w:t>
             </w:r>
           </w:p>
         </w:tc>
@@ -4696,7 +5503,7 @@
               <w:jc w:val="left"/>
             </w:pPr>
             <w:r>
-              <w:t xml:space="preserve">Crea 2 dueños, 4 comercios y 6 meses y medio de ventas de prueba.</w:t>
+              <w:t xml:space="preserve">Los avisos por Telegram: conectar el chat del jefe y mandar los mensajes en segundo plano.</w:t>
             </w:r>
           </w:p>
         </w:tc>
@@ -4713,7 +5520,7 @@
               <w:rPr>
                 <w:rStyle w:val="VerbatimChar"/>
               </w:rPr>
-              <w:t xml:space="preserve">ver_resumen.py</w:t>
+              <w:t xml:space="preserve">.env</w:t>
             </w:r>
           </w:p>
         </w:tc>
@@ -4725,7 +5532,7 @@
               <w:jc w:val="left"/>
             </w:pPr>
             <w:r>
-              <w:t xml:space="preserve">Consultas SQL de ejemplo.</w:t>
+              <w:t xml:space="preserve">Secretos de la PC, como el token del bot (no se sube a GitHub).</w:t>
             </w:r>
           </w:p>
         </w:tc>
@@ -4742,7 +5549,7 @@
               <w:rPr>
                 <w:rStyle w:val="VerbatimChar"/>
               </w:rPr>
-              <w:t xml:space="preserve">olvide_mi_pin.py</w:t>
+              <w:t xml:space="preserve">generar_datos_prueba.py</w:t>
             </w:r>
           </w:p>
         </w:tc>
@@ -4754,7 +5561,7 @@
               <w:jc w:val="left"/>
             </w:pPr>
             <w:r>
-              <w:t xml:space="preserve">Borra el PIN del jefe si se lo olvidó.</w:t>
+              <w:t xml:space="preserve">Crea 2 dueños, 4 comercios y 6 meses y medio de ventas de prueba.</w:t>
             </w:r>
           </w:p>
         </w:tc>
@@ -4771,7 +5578,7 @@
               <w:rPr>
                 <w:rStyle w:val="VerbatimChar"/>
               </w:rPr>
-              <w:t xml:space="preserve">esquema.sql</w:t>
+              <w:t xml:space="preserve">ver_resumen.py</w:t>
             </w:r>
           </w:p>
         </w:tc>
@@ -4783,7 +5590,7 @@
               <w:jc w:val="left"/>
             </w:pPr>
             <w:r>
-              <w:t xml:space="preserve">El SQL de las tablas, para leerlo.</w:t>
+              <w:t xml:space="preserve">Consultas SQL de ejemplo.</w:t>
             </w:r>
           </w:p>
         </w:tc>
@@ -4800,7 +5607,7 @@
               <w:rPr>
                 <w:rStyle w:val="VerbatimChar"/>
               </w:rPr>
-              <w:t xml:space="preserve">iniciar.bat</w:t>
+              <w:t xml:space="preserve">olvide_mi_pin.py</w:t>
             </w:r>
           </w:p>
         </w:tc>
@@ -4812,7 +5619,7 @@
               <w:jc w:val="left"/>
             </w:pPr>
             <w:r>
-              <w:t xml:space="preserve">Doble clic para abrir el sistema en Windows.</w:t>
+              <w:t xml:space="preserve">Borra el PIN del jefe si se lo olvidó.</w:t>
             </w:r>
           </w:p>
         </w:tc>
@@ -4829,7 +5636,7 @@
               <w:rPr>
                 <w:rStyle w:val="VerbatimChar"/>
               </w:rPr>
-              <w:t xml:space="preserve">mini_sistema.db</w:t>
+              <w:t xml:space="preserve">esquema.sql</w:t>
             </w:r>
           </w:p>
         </w:tc>
@@ -4841,7 +5648,7 @@
               <w:jc w:val="left"/>
             </w:pPr>
             <w:r>
-              <w:t xml:space="preserve">La base de datos (no se sube a GitHub).</w:t>
+              <w:t xml:space="preserve">El SQL de las tablas, para leerlo.</w:t>
             </w:r>
           </w:p>
         </w:tc>
@@ -4858,7 +5665,7 @@
               <w:rPr>
                 <w:rStyle w:val="VerbatimChar"/>
               </w:rPr>
-              <w:t xml:space="preserve">informe/</w:t>
+              <w:t xml:space="preserve">iniciar.bat</w:t>
             </w:r>
           </w:p>
         </w:tc>
@@ -4870,14 +5677,72 @@
               <w:jc w:val="left"/>
             </w:pPr>
             <w:r>
+              <w:t xml:space="preserve">Doble clic para abrir el sistema en Windows.</w:t>
+            </w:r>
+          </w:p>
+        </w:tc>
+      </w:tr>
+      <w:tr>
+        <w:tc>
+          <w:tcPr/>
+          <w:p>
+            <w:pPr>
+              <w:pStyle w:val="Compact"/>
+              <w:jc w:val="left"/>
+            </w:pPr>
+            <w:r>
+              <w:rPr>
+                <w:rStyle w:val="VerbatimChar"/>
+              </w:rPr>
+              <w:t xml:space="preserve">mini_sistema.db</w:t>
+            </w:r>
+          </w:p>
+        </w:tc>
+        <w:tc>
+          <w:tcPr/>
+          <w:p>
+            <w:pPr>
+              <w:pStyle w:val="Compact"/>
+              <w:jc w:val="left"/>
+            </w:pPr>
+            <w:r>
+              <w:t xml:space="preserve">La base de datos (no se sube a GitHub).</w:t>
+            </w:r>
+          </w:p>
+        </w:tc>
+      </w:tr>
+      <w:tr>
+        <w:tc>
+          <w:tcPr/>
+          <w:p>
+            <w:pPr>
+              <w:pStyle w:val="Compact"/>
+              <w:jc w:val="left"/>
+            </w:pPr>
+            <w:r>
+              <w:rPr>
+                <w:rStyle w:val="VerbatimChar"/>
+              </w:rPr>
+              <w:t xml:space="preserve">informe/</w:t>
+            </w:r>
+          </w:p>
+        </w:tc>
+        <w:tc>
+          <w:tcPr/>
+          <w:p>
+            <w:pPr>
+              <w:pStyle w:val="Compact"/>
+              <w:jc w:val="left"/>
+            </w:pPr>
+            <w:r>
               <w:t xml:space="preserve">Guía, plan, capturas y Excel de ejemplo.</w:t>
             </w:r>
           </w:p>
         </w:tc>
       </w:tr>
     </w:tbl>
-    <w:bookmarkEnd w:id="33"/>
-    <w:bookmarkStart w:id="34" w:name="github-y-la-demo-en-línea"/>
+    <w:bookmarkEnd w:id="34"/>
+    <w:bookmarkStart w:id="35" w:name="github-y-la-demo-en-línea"/>
     <w:p>
       <w:pPr>
         <w:pStyle w:val="Heading2"/>
@@ -4890,7 +5755,7 @@
       <w:pPr>
         <w:numPr>
           <w:ilvl w:val="0"/>
-          <w:numId w:val="1013"/>
+          <w:numId w:val="1016"/>
         </w:numPr>
         <w:pStyle w:val="Compact"/>
       </w:pPr>
@@ -4915,7 +5780,7 @@
       <w:pPr>
         <w:numPr>
           <w:ilvl w:val="0"/>
-          <w:numId w:val="1013"/>
+          <w:numId w:val="1016"/>
         </w:numPr>
         <w:pStyle w:val="Compact"/>
       </w:pPr>
@@ -4949,7 +5814,7 @@
       <w:pPr>
         <w:numPr>
           <w:ilvl w:val="0"/>
-          <w:numId w:val="1013"/>
+          <w:numId w:val="1016"/>
         </w:numPr>
         <w:pStyle w:val="Compact"/>
       </w:pPr>
@@ -4999,7 +5864,7 @@
       <w:pPr>
         <w:numPr>
           <w:ilvl w:val="0"/>
-          <w:numId w:val="1013"/>
+          <w:numId w:val="1016"/>
         </w:numPr>
         <w:pStyle w:val="Compact"/>
       </w:pPr>
@@ -5024,7 +5889,7 @@
       <w:pPr>
         <w:numPr>
           <w:ilvl w:val="0"/>
-          <w:numId w:val="1013"/>
+          <w:numId w:val="1016"/>
         </w:numPr>
         <w:pStyle w:val="Compact"/>
       </w:pPr>
@@ -5075,7 +5940,7 @@
       <w:pPr>
         <w:numPr>
           <w:ilvl w:val="0"/>
-          <w:numId w:val="1013"/>
+          <w:numId w:val="1016"/>
         </w:numPr>
         <w:pStyle w:val="Compact"/>
       </w:pPr>
@@ -5125,7 +5990,7 @@
       <w:pPr>
         <w:numPr>
           <w:ilvl w:val="0"/>
-          <w:numId w:val="1013"/>
+          <w:numId w:val="1016"/>
         </w:numPr>
         <w:pStyle w:val="Compact"/>
       </w:pPr>
@@ -5158,8 +6023,8 @@
         <w:t xml:space="preserve">están el tutorial completo, la versión corta para LinkedIn y un GIF de la caja con la pistola (el GIF va en el README).</w:t>
       </w:r>
     </w:p>
-    <w:bookmarkEnd w:id="34"/>
-    <w:bookmarkStart w:id="35" w:name="cuánto-cobrarlo-propuesta"/>
+    <w:bookmarkEnd w:id="35"/>
+    <w:bookmarkStart w:id="36" w:name="cuánto-cobrarlo-propuesta"/>
     <w:p>
       <w:pPr>
         <w:pStyle w:val="Heading2"/>
@@ -5172,7 +6037,7 @@
       <w:pPr>
         <w:numPr>
           <w:ilvl w:val="0"/>
-          <w:numId w:val="1014"/>
+          <w:numId w:val="1017"/>
         </w:numPr>
         <w:pStyle w:val="Compact"/>
       </w:pPr>
@@ -5194,7 +6059,7 @@
       <w:pPr>
         <w:numPr>
           <w:ilvl w:val="0"/>
-          <w:numId w:val="1014"/>
+          <w:numId w:val="1017"/>
         </w:numPr>
         <w:pStyle w:val="Compact"/>
       </w:pPr>
@@ -5216,7 +6081,7 @@
       <w:pPr>
         <w:numPr>
           <w:ilvl w:val="0"/>
-          <w:numId w:val="1014"/>
+          <w:numId w:val="1017"/>
         </w:numPr>
         <w:pStyle w:val="Compact"/>
       </w:pPr>
@@ -5228,7 +6093,7 @@
       <w:pPr>
         <w:numPr>
           <w:ilvl w:val="0"/>
-          <w:numId w:val="1014"/>
+          <w:numId w:val="1017"/>
         </w:numPr>
         <w:pStyle w:val="Compact"/>
       </w:pPr>
@@ -5240,7 +6105,7 @@
       <w:pPr>
         <w:numPr>
           <w:ilvl w:val="0"/>
-          <w:numId w:val="1014"/>
+          <w:numId w:val="1017"/>
         </w:numPr>
         <w:pStyle w:val="Compact"/>
       </w:pPr>
@@ -5252,7 +6117,7 @@
       <w:pPr>
         <w:numPr>
           <w:ilvl w:val="0"/>
-          <w:numId w:val="1014"/>
+          <w:numId w:val="1017"/>
         </w:numPr>
         <w:pStyle w:val="Compact"/>
       </w:pPr>
@@ -5264,7 +6129,7 @@
       <w:pPr>
         <w:numPr>
           <w:ilvl w:val="0"/>
-          <w:numId w:val="1014"/>
+          <w:numId w:val="1017"/>
         </w:numPr>
         <w:pStyle w:val="Compact"/>
       </w:pPr>
@@ -5272,8 +6137,8 @@
         <w:t xml:space="preserve">Los costos de la nube rondan US$30-35 por mes: con 3 clientes ya se cubren.</w:t>
       </w:r>
     </w:p>
-    <w:bookmarkEnd w:id="35"/>
-    <w:bookmarkStart w:id="36" w:name="lo-que-viene"/>
+    <w:bookmarkEnd w:id="36"/>
+    <w:bookmarkStart w:id="37" w:name="lo-que-viene"/>
     <w:p>
       <w:pPr>
         <w:pStyle w:val="Heading2"/>
@@ -5286,7 +6151,7 @@
       <w:pPr>
         <w:numPr>
           <w:ilvl w:val="0"/>
-          <w:numId w:val="1015"/>
+          <w:numId w:val="1018"/>
         </w:numPr>
         <w:pStyle w:val="Compact"/>
       </w:pPr>
@@ -5353,7 +6218,7 @@
       <w:pPr>
         <w:numPr>
           <w:ilvl w:val="0"/>
-          <w:numId w:val="1015"/>
+          <w:numId w:val="1018"/>
         </w:numPr>
         <w:pStyle w:val="Compact"/>
       </w:pPr>
@@ -5375,7 +6240,7 @@
       <w:pPr>
         <w:numPr>
           <w:ilvl w:val="0"/>
-          <w:numId w:val="1015"/>
+          <w:numId w:val="1018"/>
         </w:numPr>
         <w:pStyle w:val="Compact"/>
       </w:pPr>
@@ -5397,7 +6262,7 @@
       <w:pPr>
         <w:numPr>
           <w:ilvl w:val="0"/>
-          <w:numId w:val="1015"/>
+          <w:numId w:val="1018"/>
         </w:numPr>
         <w:pStyle w:val="Compact"/>
       </w:pPr>
@@ -5437,7 +6302,7 @@
       <w:pPr>
         <w:numPr>
           <w:ilvl w:val="0"/>
-          <w:numId w:val="1015"/>
+          <w:numId w:val="1018"/>
         </w:numPr>
         <w:pStyle w:val="Compact"/>
       </w:pPr>
@@ -5455,8 +6320,8 @@
         <w:t xml:space="preserve">en la ticketera térmica (hoy se imprime el PDF).</w:t>
       </w:r>
     </w:p>
-    <w:bookmarkEnd w:id="36"/>
-    <w:bookmarkStart w:id="37" w:name="palabras-que-aparecen"/>
+    <w:bookmarkEnd w:id="37"/>
+    <w:bookmarkStart w:id="38" w:name="palabras-que-aparecen"/>
     <w:p>
       <w:pPr>
         <w:pStyle w:val="Heading2"/>
@@ -5921,9 +6786,122 @@
           </w:p>
         </w:tc>
       </w:tr>
+      <w:tr>
+        <w:tc>
+          <w:tcPr/>
+          <w:p>
+            <w:pPr>
+              <w:pStyle w:val="Compact"/>
+              <w:jc w:val="left"/>
+            </w:pPr>
+            <w:r>
+              <w:t xml:space="preserve">Bot de Telegram</w:t>
+            </w:r>
+          </w:p>
+        </w:tc>
+        <w:tc>
+          <w:tcPr/>
+          <w:p>
+            <w:pPr>
+              <w:pStyle w:val="Compact"/>
+              <w:jc w:val="left"/>
+            </w:pPr>
+            <w:r>
+              <w:t xml:space="preserve">Una cuenta automática de Telegram que manda mensajes. La crea el jefe con</w:t>
+            </w:r>
+            <w:r>
+              <w:t xml:space="preserve"> </w:t>
+            </w:r>
+            <w:r>
+              <w:t xml:space="preserve">@BotFather</w:t>
+            </w:r>
+            <w:r>
+              <w:t xml:space="preserve">.</w:t>
+            </w:r>
+          </w:p>
+        </w:tc>
+      </w:tr>
+      <w:tr>
+        <w:tc>
+          <w:tcPr/>
+          <w:p>
+            <w:pPr>
+              <w:pStyle w:val="Compact"/>
+              <w:jc w:val="left"/>
+            </w:pPr>
+            <w:r>
+              <w:t xml:space="preserve">Token</w:t>
+            </w:r>
+          </w:p>
+        </w:tc>
+        <w:tc>
+          <w:tcPr/>
+          <w:p>
+            <w:pPr>
+              <w:pStyle w:val="Compact"/>
+              <w:jc w:val="left"/>
+            </w:pPr>
+            <w:r>
+              <w:t xml:space="preserve">La clave secreta de un bot. Con ella el sistema puede mandar mensajes en su nombre: no se comparte.</w:t>
+            </w:r>
+          </w:p>
+        </w:tc>
+      </w:tr>
+      <w:tr>
+        <w:tc>
+          <w:tcPr/>
+          <w:p>
+            <w:pPr>
+              <w:pStyle w:val="Compact"/>
+              <w:jc w:val="left"/>
+            </w:pPr>
+            <w:r>
+              <w:t xml:space="preserve">Chat ID</w:t>
+            </w:r>
+          </w:p>
+        </w:tc>
+        <w:tc>
+          <w:tcPr/>
+          <w:p>
+            <w:pPr>
+              <w:pStyle w:val="Compact"/>
+              <w:jc w:val="left"/>
+            </w:pPr>
+            <w:r>
+              <w:t xml:space="preserve">El número con el que Telegram identifica tu chat. El sistema lo guarda al conectarte.</w:t>
+            </w:r>
+          </w:p>
+        </w:tc>
+      </w:tr>
+      <w:tr>
+        <w:tc>
+          <w:tcPr/>
+          <w:p>
+            <w:pPr>
+              <w:pStyle w:val="Compact"/>
+              <w:jc w:val="left"/>
+            </w:pPr>
+            <w:r>
+              <w:t xml:space="preserve">Segundo plano</w:t>
+            </w:r>
+          </w:p>
+        </w:tc>
+        <w:tc>
+          <w:tcPr/>
+          <w:p>
+            <w:pPr>
+              <w:pStyle w:val="Compact"/>
+              <w:jc w:val="left"/>
+            </w:pPr>
+            <w:r>
+              <w:t xml:space="preserve">Algo que el programa hace por detrás, sin hacer esperar a quien está usando la pantalla.</w:t>
+            </w:r>
+          </w:p>
+        </w:tc>
+      </w:tr>
     </w:tbl>
-    <w:bookmarkEnd w:id="37"/>
     <w:bookmarkEnd w:id="38"/>
+    <w:bookmarkEnd w:id="39"/>
     <w:sectPr>
       <w:pgSz w:h="15840" w:w="12240"/>
       <w:pgMar w:bottom="1440" w:footer="720" w:gutter="0" w:header="720" w:left="1800" w:right="1800" w:top="1440"/>
@@ -6503,6 +7481,9 @@
     </w:lvlOverride>
   </w:num>
   <w:num w:numId="1009">
+    <w:abstractNumId w:val="991"/>
+  </w:num>
+  <w:num w:numId="1010">
     <w:abstractNumId w:val="99411"/>
     <w:lvlOverride w:ilvl="0">
       <w:startOverride w:val="1"/>
@@ -6532,10 +7513,10 @@
       <w:startOverride w:val="1"/>
     </w:lvlOverride>
   </w:num>
-  <w:num w:numId="1010">
+  <w:num w:numId="1011">
     <w:abstractNumId w:val="991"/>
   </w:num>
-  <w:num w:numId="1011">
+  <w:num w:numId="1012">
     <w:abstractNumId w:val="99411"/>
     <w:lvlOverride w:ilvl="0">
       <w:startOverride w:val="1"/>
@@ -6565,16 +7546,49 @@
       <w:startOverride w:val="1"/>
     </w:lvlOverride>
   </w:num>
-  <w:num w:numId="1012">
-    <w:abstractNumId w:val="991"/>
-  </w:num>
   <w:num w:numId="1013">
     <w:abstractNumId w:val="991"/>
   </w:num>
   <w:num w:numId="1014">
+    <w:abstractNumId w:val="99411"/>
+    <w:lvlOverride w:ilvl="0">
+      <w:startOverride w:val="1"/>
+    </w:lvlOverride>
+    <w:lvlOverride w:ilvl="1">
+      <w:startOverride w:val="1"/>
+    </w:lvlOverride>
+    <w:lvlOverride w:ilvl="2">
+      <w:startOverride w:val="1"/>
+    </w:lvlOverride>
+    <w:lvlOverride w:ilvl="3">
+      <w:startOverride w:val="1"/>
+    </w:lvlOverride>
+    <w:lvlOverride w:ilvl="4">
+      <w:startOverride w:val="1"/>
+    </w:lvlOverride>
+    <w:lvlOverride w:ilvl="5">
+      <w:startOverride w:val="1"/>
+    </w:lvlOverride>
+    <w:lvlOverride w:ilvl="6">
+      <w:startOverride w:val="1"/>
+    </w:lvlOverride>
+    <w:lvlOverride w:ilvl="7">
+      <w:startOverride w:val="1"/>
+    </w:lvlOverride>
+    <w:lvlOverride w:ilvl="8">
+      <w:startOverride w:val="1"/>
+    </w:lvlOverride>
+  </w:num>
+  <w:num w:numId="1015">
     <w:abstractNumId w:val="991"/>
   </w:num>
-  <w:num w:numId="1015">
+  <w:num w:numId="1016">
+    <w:abstractNumId w:val="991"/>
+  </w:num>
+  <w:num w:numId="1017">
+    <w:abstractNumId w:val="991"/>
+  </w:num>
+  <w:num w:numId="1018">
     <w:abstractNumId w:val="99411"/>
     <w:lvlOverride w:ilvl="0">
       <w:startOverride w:val="1"/>
@@ -18457,6 +19471,232 @@
     <w:pPr>
       <w:wordWrap w:val="off"/>
     </w:pPr>
+  </w:style>
+  <w:style w:customStyle="1" w:styleId="KeywordTok" w:type="character">
+    <w:name w:val="KeywordTok"/>
+    <w:basedOn w:val="VerbatimChar"/>
+    <w:rPr>
+      <w:color w:val="007020"/>
+      <w:b/>
+    </w:rPr>
+  </w:style>
+  <w:style w:customStyle="1" w:styleId="DataTypeTok" w:type="character">
+    <w:name w:val="DataTypeTok"/>
+    <w:basedOn w:val="VerbatimChar"/>
+    <w:rPr>
+      <w:color w:val="902000"/>
+    </w:rPr>
+  </w:style>
+  <w:style w:customStyle="1" w:styleId="DecValTok" w:type="character">
+    <w:name w:val="DecValTok"/>
+    <w:basedOn w:val="VerbatimChar"/>
+    <w:rPr>
+      <w:color w:val="40a070"/>
+    </w:rPr>
+  </w:style>
+  <w:style w:customStyle="1" w:styleId="BaseNTok" w:type="character">
+    <w:name w:val="BaseNTok"/>
+    <w:basedOn w:val="VerbatimChar"/>
+    <w:rPr>
+      <w:color w:val="40a070"/>
+    </w:rPr>
+  </w:style>
+  <w:style w:customStyle="1" w:styleId="FloatTok" w:type="character">
+    <w:name w:val="FloatTok"/>
+    <w:basedOn w:val="VerbatimChar"/>
+    <w:rPr>
+      <w:color w:val="40a070"/>
+    </w:rPr>
+  </w:style>
+  <w:style w:customStyle="1" w:styleId="ConstantTok" w:type="character">
+    <w:name w:val="ConstantTok"/>
+    <w:basedOn w:val="VerbatimChar"/>
+    <w:rPr>
+      <w:color w:val="880000"/>
+    </w:rPr>
+  </w:style>
+  <w:style w:customStyle="1" w:styleId="CharTok" w:type="character">
+    <w:name w:val="CharTok"/>
+    <w:basedOn w:val="VerbatimChar"/>
+    <w:rPr>
+      <w:color w:val="4070a0"/>
+    </w:rPr>
+  </w:style>
+  <w:style w:customStyle="1" w:styleId="SpecialCharTok" w:type="character">
+    <w:name w:val="SpecialCharTok"/>
+    <w:basedOn w:val="VerbatimChar"/>
+    <w:rPr>
+      <w:color w:val="4070a0"/>
+    </w:rPr>
+  </w:style>
+  <w:style w:customStyle="1" w:styleId="StringTok" w:type="character">
+    <w:name w:val="StringTok"/>
+    <w:basedOn w:val="VerbatimChar"/>
+    <w:rPr>
+      <w:color w:val="4070a0"/>
+    </w:rPr>
+  </w:style>
+  <w:style w:customStyle="1" w:styleId="VerbatimStringTok" w:type="character">
+    <w:name w:val="VerbatimStringTok"/>
+    <w:basedOn w:val="VerbatimChar"/>
+    <w:rPr>
+      <w:color w:val="4070a0"/>
+    </w:rPr>
+  </w:style>
+  <w:style w:customStyle="1" w:styleId="SpecialStringTok" w:type="character">
+    <w:name w:val="SpecialStringTok"/>
+    <w:basedOn w:val="VerbatimChar"/>
+    <w:rPr>
+      <w:color w:val="bb6688"/>
+    </w:rPr>
+  </w:style>
+  <w:style w:customStyle="1" w:styleId="ImportTok" w:type="character">
+    <w:name w:val="ImportTok"/>
+    <w:basedOn w:val="VerbatimChar"/>
+    <w:rPr>
+      <w:color w:val="008000"/>
+      <w:b/>
+    </w:rPr>
+  </w:style>
+  <w:style w:customStyle="1" w:styleId="CommentTok" w:type="character">
+    <w:name w:val="CommentTok"/>
+    <w:basedOn w:val="VerbatimChar"/>
+    <w:rPr>
+      <w:color w:val="60a0b0"/>
+      <w:i/>
+    </w:rPr>
+  </w:style>
+  <w:style w:customStyle="1" w:styleId="DocumentationTok" w:type="character">
+    <w:name w:val="DocumentationTok"/>
+    <w:basedOn w:val="VerbatimChar"/>
+    <w:rPr>
+      <w:color w:val="ba2121"/>
+      <w:i/>
+    </w:rPr>
+  </w:style>
+  <w:style w:customStyle="1" w:styleId="AnnotationTok" w:type="character">
+    <w:name w:val="AnnotationTok"/>
+    <w:basedOn w:val="VerbatimChar"/>
+    <w:rPr>
+      <w:color w:val="60a0b0"/>
+      <w:b/>
+      <w:i/>
+    </w:rPr>
+  </w:style>
+  <w:style w:customStyle="1" w:styleId="CommentVarTok" w:type="character">
+    <w:name w:val="CommentVarTok"/>
+    <w:basedOn w:val="VerbatimChar"/>
+    <w:rPr>
+      <w:color w:val="60a0b0"/>
+      <w:b/>
+      <w:i/>
+    </w:rPr>
+  </w:style>
+  <w:style w:customStyle="1" w:styleId="OtherTok" w:type="character">
+    <w:name w:val="OtherTok"/>
+    <w:basedOn w:val="VerbatimChar"/>
+    <w:rPr>
+      <w:color w:val="007020"/>
+    </w:rPr>
+  </w:style>
+  <w:style w:customStyle="1" w:styleId="FunctionTok" w:type="character">
+    <w:name w:val="FunctionTok"/>
+    <w:basedOn w:val="VerbatimChar"/>
+    <w:rPr>
+      <w:color w:val="06287e"/>
+    </w:rPr>
+  </w:style>
+  <w:style w:customStyle="1" w:styleId="VariableTok" w:type="character">
+    <w:name w:val="VariableTok"/>
+    <w:basedOn w:val="VerbatimChar"/>
+    <w:rPr>
+      <w:color w:val="19177c"/>
+    </w:rPr>
+  </w:style>
+  <w:style w:customStyle="1" w:styleId="ControlFlowTok" w:type="character">
+    <w:name w:val="ControlFlowTok"/>
+    <w:basedOn w:val="VerbatimChar"/>
+    <w:rPr>
+      <w:color w:val="007020"/>
+      <w:b/>
+    </w:rPr>
+  </w:style>
+  <w:style w:customStyle="1" w:styleId="OperatorTok" w:type="character">
+    <w:name w:val="OperatorTok"/>
+    <w:basedOn w:val="VerbatimChar"/>
+    <w:rPr>
+      <w:color w:val="666666"/>
+    </w:rPr>
+  </w:style>
+  <w:style w:customStyle="1" w:styleId="BuiltInTok" w:type="character">
+    <w:name w:val="BuiltInTok"/>
+    <w:basedOn w:val="VerbatimChar"/>
+    <w:rPr>
+      <w:color w:val="008000"/>
+    </w:rPr>
+  </w:style>
+  <w:style w:customStyle="1" w:styleId="ExtensionTok" w:type="character">
+    <w:name w:val="ExtensionTok"/>
+    <w:basedOn w:val="VerbatimChar"/>
+    <w:rPr/>
+  </w:style>
+  <w:style w:customStyle="1" w:styleId="PreprocessorTok" w:type="character">
+    <w:name w:val="PreprocessorTok"/>
+    <w:basedOn w:val="VerbatimChar"/>
+    <w:rPr>
+      <w:color w:val="bc7a00"/>
+    </w:rPr>
+  </w:style>
+  <w:style w:customStyle="1" w:styleId="AttributeTok" w:type="character">
+    <w:name w:val="AttributeTok"/>
+    <w:basedOn w:val="VerbatimChar"/>
+    <w:rPr>
+      <w:color w:val="7d9029"/>
+    </w:rPr>
+  </w:style>
+  <w:style w:customStyle="1" w:styleId="RegionMarkerTok" w:type="character">
+    <w:name w:val="RegionMarkerTok"/>
+    <w:basedOn w:val="VerbatimChar"/>
+    <w:rPr/>
+  </w:style>
+  <w:style w:customStyle="1" w:styleId="InformationTok" w:type="character">
+    <w:name w:val="InformationTok"/>
+    <w:basedOn w:val="VerbatimChar"/>
+    <w:rPr>
+      <w:color w:val="60a0b0"/>
+      <w:b/>
+      <w:i/>
+    </w:rPr>
+  </w:style>
+  <w:style w:customStyle="1" w:styleId="WarningTok" w:type="character">
+    <w:name w:val="WarningTok"/>
+    <w:basedOn w:val="VerbatimChar"/>
+    <w:rPr>
+      <w:color w:val="60a0b0"/>
+      <w:b/>
+      <w:i/>
+    </w:rPr>
+  </w:style>
+  <w:style w:customStyle="1" w:styleId="AlertTok" w:type="character">
+    <w:name w:val="AlertTok"/>
+    <w:basedOn w:val="VerbatimChar"/>
+    <w:rPr>
+      <w:color w:val="ff0000"/>
+      <w:b/>
+    </w:rPr>
+  </w:style>
+  <w:style w:customStyle="1" w:styleId="ErrorTok" w:type="character">
+    <w:name w:val="ErrorTok"/>
+    <w:basedOn w:val="VerbatimChar"/>
+    <w:rPr>
+      <w:color w:val="ff0000"/>
+      <w:b/>
+    </w:rPr>
+  </w:style>
+  <w:style w:customStyle="1" w:styleId="NormalTok" w:type="character">
+    <w:name w:val="NormalTok"/>
+    <w:basedOn w:val="VerbatimChar"/>
+    <w:rPr/>
   </w:style>
   <w:style w:customStyle="1" w:styleId="KeywordTok" w:type="character">
     <w:name w:val="KeywordTok"/>

</xml_diff>

<commit_message>
Guía y README: pasos del jefe separados de la creación del bot
Co-Authored-By: Claude Opus 5.5 (1M context) <noreply@anthropic.com>
Claude-Session: https://claude.ai/code/session_01RCy4xV2R83tGYACMxcEVRz
</commit_message>
<xml_diff>
--- a/informe/guia/guia-del-sistema.docx
+++ b/informe/guia/guia-del-sistema.docx
@@ -3179,7 +3179,7 @@
           <w:bCs/>
           <w:b/>
         </w:rPr>
-        <w:t xml:space="preserve">Paso 1 · Crear el bot (una sola vez, 2 minutos):</w:t>
+        <w:t xml:space="preserve">Lo que hace el jefe para conectarse (2 toques, una sola vez):</w:t>
       </w:r>
     </w:p>
     <w:p>
@@ -3191,6 +3191,172 @@
         <w:pStyle w:val="Compact"/>
       </w:pPr>
       <w:r>
+        <w:t xml:space="preserve">Entra como jefe a</w:t>
+      </w:r>
+      <w:r>
+        <w:t xml:space="preserve"> </w:t>
+      </w:r>
+      <w:r>
+        <w:rPr>
+          <w:bCs/>
+          <w:b/>
+        </w:rPr>
+        <w:t xml:space="preserve">Configuración → Mis comercios</w:t>
+      </w:r>
+      <w:r>
+        <w:t xml:space="preserve"> </w:t>
+      </w:r>
+      <w:r>
+        <w:t xml:space="preserve">y baja hasta</w:t>
+      </w:r>
+      <w:r>
+        <w:t xml:space="preserve"> </w:t>
+      </w:r>
+      <w:r>
+        <w:rPr>
+          <w:bCs/>
+          <w:b/>
+        </w:rPr>
+        <w:t xml:space="preserve">📲 Avisos al celular</w:t>
+      </w:r>
+      <w:r>
+        <w:t xml:space="preserve">.</w:t>
+      </w:r>
+    </w:p>
+    <w:p>
+      <w:pPr>
+        <w:numPr>
+          <w:ilvl w:val="0"/>
+          <w:numId w:val="1010"/>
+        </w:numPr>
+        <w:pStyle w:val="Compact"/>
+      </w:pPr>
+      <w:r>
+        <w:t xml:space="preserve">Toca</w:t>
+      </w:r>
+      <w:r>
+        <w:t xml:space="preserve"> </w:t>
+      </w:r>
+      <w:r>
+        <w:rPr>
+          <w:bCs/>
+          <w:b/>
+        </w:rPr>
+        <w:t xml:space="preserve">📲 Conectar con Telegram</w:t>
+      </w:r>
+      <w:r>
+        <w:t xml:space="preserve"> </w:t>
+      </w:r>
+      <w:r>
+        <w:t xml:space="preserve">(puede elegir qué comercios le avisan; vienen todos marcados).</w:t>
+      </w:r>
+    </w:p>
+    <w:p>
+      <w:pPr>
+        <w:numPr>
+          <w:ilvl w:val="0"/>
+          <w:numId w:val="1010"/>
+        </w:numPr>
+        <w:pStyle w:val="Compact"/>
+      </w:pPr>
+      <w:r>
+        <w:t xml:space="preserve">Toca</w:t>
+      </w:r>
+      <w:r>
+        <w:t xml:space="preserve"> </w:t>
+      </w:r>
+      <w:r>
+        <w:rPr>
+          <w:bCs/>
+          <w:b/>
+        </w:rPr>
+        <w:t xml:space="preserve">Abrir el bot en Telegram</w:t>
+      </w:r>
+      <w:r>
+        <w:t xml:space="preserve"> </w:t>
+      </w:r>
+      <w:r>
+        <w:t xml:space="preserve">y, en Telegram, toca</w:t>
+      </w:r>
+      <w:r>
+        <w:t xml:space="preserve"> </w:t>
+      </w:r>
+      <w:r>
+        <w:rPr>
+          <w:bCs/>
+          <w:b/>
+        </w:rPr>
+        <w:t xml:space="preserve">Iniciar</w:t>
+      </w:r>
+      <w:r>
+        <w:t xml:space="preserve">. Si en la PC no tiene Telegram, copia el link y lo abre en el celular.</w:t>
+      </w:r>
+    </w:p>
+    <w:p>
+      <w:pPr>
+        <w:numPr>
+          <w:ilvl w:val="0"/>
+          <w:numId w:val="1010"/>
+        </w:numPr>
+        <w:pStyle w:val="Compact"/>
+      </w:pPr>
+      <w:r>
+        <w:t xml:space="preserve">Vuelve al sistema: en unos segundos aparece</w:t>
+      </w:r>
+      <w:r>
+        <w:t xml:space="preserve"> </w:t>
+      </w:r>
+      <w:r>
+        <w:t xml:space="preserve">“</w:t>
+      </w:r>
+      <w:r>
+        <w:t xml:space="preserve">Listo, tu celular quedó conectado</w:t>
+      </w:r>
+      <w:r>
+        <w:t xml:space="preserve">”</w:t>
+      </w:r>
+      <w:r>
+        <w:t xml:space="preserve"> </w:t>
+      </w:r>
+      <w:r>
+        <w:t xml:space="preserve">y el bot le escribe.</w:t>
+      </w:r>
+    </w:p>
+    <w:p>
+      <w:pPr>
+        <w:pStyle w:val="FirstParagraph"/>
+      </w:pPr>
+      <w:r>
+        <w:t xml:space="preserve">No hace falta su número de teléfono: se conecta con su cuenta de Telegram (solo necesita tenerlo instalado).</w:t>
+      </w:r>
+    </w:p>
+    <w:p>
+      <w:pPr>
+        <w:pStyle w:val="BodyText"/>
+      </w:pPr>
+      <w:r>
+        <w:rPr>
+          <w:bCs/>
+          <w:b/>
+        </w:rPr>
+        <w:t xml:space="preserve">Lo que hace quien instala el sistema (el dueño del software, una sola vez):</w:t>
+      </w:r>
+      <w:r>
+        <w:t xml:space="preserve"> </w:t>
+      </w:r>
+      <w:r>
+        <w:t xml:space="preserve">el jefe nunca ve esto.</w:t>
+      </w:r>
+    </w:p>
+    <w:p>
+      <w:pPr>
+        <w:numPr>
+          <w:ilvl w:val="0"/>
+          <w:numId w:val="1011"/>
+        </w:numPr>
+        <w:pStyle w:val="Compact"/>
+      </w:pPr>
+      <w:r>
         <w:t xml:space="preserve">En Telegram, buscá</w:t>
       </w:r>
       <w:r>
@@ -3227,7 +3393,7 @@
       <w:pPr>
         <w:numPr>
           <w:ilvl w:val="0"/>
-          <w:numId w:val="1010"/>
+          <w:numId w:val="1011"/>
         </w:numPr>
         <w:pStyle w:val="Compact"/>
       </w:pPr>
@@ -3251,7 +3417,7 @@
       <w:pPr>
         <w:numPr>
           <w:ilvl w:val="0"/>
-          <w:numId w:val="1010"/>
+          <w:numId w:val="1011"/>
         </w:numPr>
         <w:pStyle w:val="Compact"/>
       </w:pPr>
@@ -3269,7 +3435,7 @@
         <w:t xml:space="preserve">nombre</w:t>
       </w:r>
       <w:r>
-        <w:t xml:space="preserve">, el que vas a ver en los chats (ej.:</w:t>
+        <w:t xml:space="preserve">, el que se ve en los chats (ej.:</w:t>
       </w:r>
       <w:r>
         <w:t xml:space="preserve"> </w:t>
@@ -3279,7 +3445,7 @@
           <w:iCs/>
           <w:i/>
         </w:rPr>
-        <w:t xml:space="preserve">Avisos Ferretería</w:t>
+        <w:t xml:space="preserve">Avisos Mini-Sistema</w:t>
       </w:r>
       <w:r>
         <w:t xml:space="preserve">).</w:t>
@@ -3289,7 +3455,7 @@
       <w:pPr>
         <w:numPr>
           <w:ilvl w:val="0"/>
-          <w:numId w:val="1010"/>
+          <w:numId w:val="1011"/>
         </w:numPr>
         <w:pStyle w:val="Compact"/>
       </w:pPr>
@@ -3334,7 +3500,7 @@
         <w:rPr>
           <w:rStyle w:val="VerbatimChar"/>
         </w:rPr>
-        <w:t xml:space="preserve">avisos_ferreteria_tito_bot</w:t>
+        <w:t xml:space="preserve">avisos_minisistema_bot</w:t>
       </w:r>
       <w:r>
         <w:t xml:space="preserve">).</w:t>
@@ -3344,7 +3510,7 @@
       <w:pPr>
         <w:numPr>
           <w:ilvl w:val="0"/>
-          <w:numId w:val="1010"/>
+          <w:numId w:val="1011"/>
         </w:numPr>
         <w:pStyle w:val="Compact"/>
       </w:pPr>
@@ -3395,46 +3561,30 @@
     </w:p>
     <w:p>
       <w:pPr>
-        <w:pStyle w:val="FirstParagraph"/>
-      </w:pPr>
+        <w:numPr>
+          <w:ilvl w:val="0"/>
+          <w:numId w:val="1011"/>
+        </w:numPr>
+        <w:pStyle w:val="Compact"/>
+      </w:pPr>
+      <w:r>
+        <w:t xml:space="preserve">Ponelo en el sistema: en la PC, en</w:t>
+      </w:r>
+      <w:r>
+        <w:t xml:space="preserve"> </w:t>
+      </w:r>
       <w:r>
         <w:rPr>
           <w:bCs/>
           <w:b/>
         </w:rPr>
-        <w:t xml:space="preserve">Paso 2 · Pegar el token:</w:t>
-      </w:r>
-      <w:r>
-        <w:t xml:space="preserve"> </w:t>
-      </w:r>
-      <w:r>
-        <w:t xml:space="preserve">en</w:t>
-      </w:r>
-      <w:r>
-        <w:t xml:space="preserve"> </w:t>
-      </w:r>
-      <w:r>
-        <w:rPr>
-          <w:bCs/>
-          <w:b/>
-        </w:rPr>
-        <w:t xml:space="preserve">Mis comercios → 📲 Avisos al celular</w:t>
-      </w:r>
-      <w:r>
-        <w:t xml:space="preserve">, pegalo y tocá</w:t>
-      </w:r>
-      <w:r>
-        <w:t xml:space="preserve"> </w:t>
-      </w:r>
-      <w:r>
-        <w:rPr>
-          <w:bCs/>
-          <w:b/>
-        </w:rPr>
-        <w:t xml:space="preserve">Guardar token</w:t>
-      </w:r>
-      <w:r>
-        <w:t xml:space="preserve">. El sistema lo prueba con Telegram y lo guarda en el archivo</w:t>
+        <w:t xml:space="preserve">Mis comercios → 📲 Avisos al celular → Guardar token</w:t>
+      </w:r>
+      <w:r>
+        <w:t xml:space="preserve"> </w:t>
+      </w:r>
+      <w:r>
+        <w:t xml:space="preserve">(queda en el archivo</w:t>
       </w:r>
       <w:r>
         <w:t xml:space="preserve"> </w:t>
@@ -3449,71 +3599,40 @@
         <w:t xml:space="preserve"> </w:t>
       </w:r>
       <w:r>
-        <w:t xml:space="preserve">de la carpeta (no se sube a GitHub).</w:t>
+        <w:t xml:space="preserve">de la carpeta, que no se sube a GitHub); en la nube, en los</w:t>
+      </w:r>
+      <w:r>
+        <w:t xml:space="preserve"> </w:t>
+      </w:r>
+      <w:r>
+        <w:rPr>
+          <w:iCs/>
+          <w:i/>
+        </w:rPr>
+        <w:t xml:space="preserve">Secrets</w:t>
+      </w:r>
+      <w:r>
+        <w:t xml:space="preserve"> </w:t>
+      </w:r>
+      <w:r>
+        <w:t xml:space="preserve">del servidor como</w:t>
+      </w:r>
+      <w:r>
+        <w:t xml:space="preserve"> </w:t>
+      </w:r>
+      <w:r>
+        <w:rPr>
+          <w:rStyle w:val="VerbatimChar"/>
+        </w:rPr>
+        <w:t xml:space="preserve">TELEGRAM_BOT_TOKEN</w:t>
+      </w:r>
+      <w:r>
+        <w:t xml:space="preserve">. Con un solo bot alcanza para todos los clientes.</w:t>
       </w:r>
     </w:p>
     <w:p>
       <w:pPr>
-        <w:pStyle w:val="BodyText"/>
-      </w:pPr>
-      <w:r>
-        <w:rPr>
-          <w:bCs/>
-          <w:b/>
-        </w:rPr>
-        <w:t xml:space="preserve">Paso 3 · Conectar tu celular:</w:t>
-      </w:r>
-      <w:r>
-        <w:t xml:space="preserve"> </w:t>
-      </w:r>
-      <w:r>
-        <w:t xml:space="preserve">tocá</w:t>
-      </w:r>
-      <w:r>
-        <w:t xml:space="preserve"> </w:t>
-      </w:r>
-      <w:r>
-        <w:rPr>
-          <w:bCs/>
-          <w:b/>
-        </w:rPr>
-        <w:t xml:space="preserve">📲 Conectar con Telegram</w:t>
-      </w:r>
-      <w:r>
-        <w:t xml:space="preserve">, elegí qué comercios te avisan (vienen todos marcados), abrí el link y tocá</w:t>
-      </w:r>
-      <w:r>
-        <w:t xml:space="preserve"> </w:t>
-      </w:r>
-      <w:r>
-        <w:rPr>
-          <w:bCs/>
-          <w:b/>
-        </w:rPr>
-        <w:t xml:space="preserve">Iniciar</w:t>
-      </w:r>
-      <w:r>
-        <w:t xml:space="preserve">. En unos segundos el sistema se da cuenta solo y el bot te escribe</w:t>
-      </w:r>
-      <w:r>
-        <w:t xml:space="preserve"> </w:t>
-      </w:r>
-      <w:r>
-        <w:t xml:space="preserve">“</w:t>
-      </w:r>
-      <w:r>
-        <w:t xml:space="preserve">Listo, quedaste conectado</w:t>
-      </w:r>
-      <w:r>
-        <w:t xml:space="preserve">”</w:t>
-      </w:r>
-      <w:r>
-        <w:t xml:space="preserve">.</w:t>
-      </w:r>
-    </w:p>
-    <w:p>
-      <w:pPr>
-        <w:pStyle w:val="BodyText"/>
+        <w:pStyle w:val="FirstParagraph"/>
       </w:pPr>
       <w:r>
         <w:rPr>
@@ -3526,7 +3645,7 @@
         <w:t xml:space="preserve"> </w:t>
       </w:r>
       <w:r>
-        <w:t xml:space="preserve">en cada comercio podés elegir qué avisos querés, mandar un</w:t>
+        <w:t xml:space="preserve">en cada comercio el jefe puede elegir qué avisos quiere, mandar un</w:t>
       </w:r>
       <w:r>
         <w:t xml:space="preserve"> </w:t>
@@ -3571,7 +3690,7 @@
       <w:pPr>
         <w:numPr>
           <w:ilvl w:val="0"/>
-          <w:numId w:val="1011"/>
+          <w:numId w:val="1012"/>
         </w:numPr>
         <w:pStyle w:val="Compact"/>
       </w:pPr>
@@ -3599,7 +3718,7 @@
       <w:pPr>
         <w:numPr>
           <w:ilvl w:val="0"/>
-          <w:numId w:val="1011"/>
+          <w:numId w:val="1012"/>
         </w:numPr>
         <w:pStyle w:val="Compact"/>
       </w:pPr>
@@ -3624,7 +3743,7 @@
       <w:pPr>
         <w:numPr>
           <w:ilvl w:val="0"/>
-          <w:numId w:val="1011"/>
+          <w:numId w:val="1012"/>
         </w:numPr>
         <w:pStyle w:val="Compact"/>
       </w:pPr>
@@ -3660,7 +3779,7 @@
         <w:t xml:space="preserve">/start &lt;código&gt;</w:t>
       </w:r>
       <w:r>
-        <w:t xml:space="preserve">, el sistema lo lee, guarda tu chat (</w:t>
+        <w:t xml:space="preserve">, el sistema lo lee, guarda el chat del jefe (</w:t>
       </w:r>
       <w:r>
         <w:rPr>
@@ -3669,14 +3788,14 @@
         <w:t xml:space="preserve">telegram_chat_id</w:t>
       </w:r>
       <w:r>
-        <w:t xml:space="preserve">) y borra el código. Si en 10 minutos no tocás Iniciar, hay que pedir el link de nuevo.</w:t>
+        <w:t xml:space="preserve">) y borra el código. Si en 10 minutos no toca Iniciar, hay que pedir el link de nuevo.</w:t>
       </w:r>
     </w:p>
     <w:p>
       <w:pPr>
         <w:numPr>
           <w:ilvl w:val="0"/>
-          <w:numId w:val="1011"/>
+          <w:numId w:val="1012"/>
         </w:numPr>
         <w:pStyle w:val="Compact"/>
       </w:pPr>
@@ -3723,7 +3842,7 @@
       <w:pPr>
         <w:numPr>
           <w:ilvl w:val="0"/>
-          <w:numId w:val="1011"/>
+          <w:numId w:val="1012"/>
         </w:numPr>
         <w:pStyle w:val="Compact"/>
       </w:pPr>
@@ -3738,7 +3857,7 @@
         <w:t xml:space="preserve"> </w:t>
       </w:r>
       <w:r>
-        <w:t xml:space="preserve">(más adelante) va a haber un solo bot del sistema para todos los clientes; cada jefe solo hace el paso 3.</w:t>
+        <w:t xml:space="preserve">(más adelante) va a haber un solo bot del sistema para todos los clientes; cada jefe solo hace sus 2 toques.</w:t>
       </w:r>
     </w:p>
     <w:bookmarkEnd w:id="29"/>
@@ -3818,7 +3937,7 @@
       <w:pPr>
         <w:numPr>
           <w:ilvl w:val="0"/>
-          <w:numId w:val="1012"/>
+          <w:numId w:val="1013"/>
         </w:numPr>
         <w:pStyle w:val="Compact"/>
       </w:pPr>
@@ -3897,7 +4016,7 @@
       <w:pPr>
         <w:numPr>
           <w:ilvl w:val="0"/>
-          <w:numId w:val="1012"/>
+          <w:numId w:val="1013"/>
         </w:numPr>
         <w:pStyle w:val="Compact"/>
       </w:pPr>
@@ -3937,7 +4056,7 @@
       <w:pPr>
         <w:numPr>
           <w:ilvl w:val="0"/>
-          <w:numId w:val="1012"/>
+          <w:numId w:val="1013"/>
         </w:numPr>
         <w:pStyle w:val="Compact"/>
       </w:pPr>
@@ -3971,7 +4090,7 @@
       <w:pPr>
         <w:numPr>
           <w:ilvl w:val="0"/>
-          <w:numId w:val="1013"/>
+          <w:numId w:val="1014"/>
         </w:numPr>
         <w:pStyle w:val="Compact"/>
       </w:pPr>
@@ -4008,7 +4127,7 @@
       <w:pPr>
         <w:numPr>
           <w:ilvl w:val="0"/>
-          <w:numId w:val="1013"/>
+          <w:numId w:val="1014"/>
         </w:numPr>
         <w:pStyle w:val="Compact"/>
       </w:pPr>
@@ -4045,7 +4164,7 @@
       <w:pPr>
         <w:numPr>
           <w:ilvl w:val="0"/>
-          <w:numId w:val="1013"/>
+          <w:numId w:val="1014"/>
         </w:numPr>
         <w:pStyle w:val="Compact"/>
       </w:pPr>
@@ -4057,7 +4176,7 @@
       <w:pPr>
         <w:numPr>
           <w:ilvl w:val="0"/>
-          <w:numId w:val="1013"/>
+          <w:numId w:val="1014"/>
         </w:numPr>
         <w:pStyle w:val="Compact"/>
       </w:pPr>
@@ -4816,135 +4935,12 @@
       <w:pPr>
         <w:numPr>
           <w:ilvl w:val="0"/>
-          <w:numId w:val="1014"/>
+          <w:numId w:val="1015"/>
         </w:numPr>
         <w:pStyle w:val="Compact"/>
       </w:pPr>
       <w:r>
         <w:t xml:space="preserve">Se revisa que la caja siga abierta (si está cerrada, no se puede cobrar).</w:t>
-      </w:r>
-    </w:p>
-    <w:p>
-      <w:pPr>
-        <w:numPr>
-          <w:ilvl w:val="0"/>
-          <w:numId w:val="1014"/>
-        </w:numPr>
-        <w:pStyle w:val="Compact"/>
-      </w:pPr>
-      <w:r>
-        <w:t xml:space="preserve">Se crea una fila en</w:t>
-      </w:r>
-      <w:r>
-        <w:t xml:space="preserve"> </w:t>
-      </w:r>
-      <w:r>
-        <w:rPr>
-          <w:rStyle w:val="VerbatimChar"/>
-        </w:rPr>
-        <w:t xml:space="preserve">ventas</w:t>
-      </w:r>
-      <w:r>
-        <w:t xml:space="preserve"> </w:t>
-      </w:r>
-      <w:r>
-        <w:t xml:space="preserve">con la fecha, el total, el medio de pago y la caja.</w:t>
-      </w:r>
-    </w:p>
-    <w:p>
-      <w:pPr>
-        <w:numPr>
-          <w:ilvl w:val="0"/>
-          <w:numId w:val="1014"/>
-        </w:numPr>
-        <w:pStyle w:val="Compact"/>
-      </w:pPr>
-      <w:r>
-        <w:t xml:space="preserve">Se crea una fila en</w:t>
-      </w:r>
-      <w:r>
-        <w:t xml:space="preserve"> </w:t>
-      </w:r>
-      <w:r>
-        <w:rPr>
-          <w:rStyle w:val="VerbatimChar"/>
-        </w:rPr>
-        <w:t xml:space="preserve">ventas_detalle</w:t>
-      </w:r>
-      <w:r>
-        <w:t xml:space="preserve"> </w:t>
-      </w:r>
-      <w:r>
-        <w:t xml:space="preserve">por cada producto, con su precio y su costo.</w:t>
-      </w:r>
-    </w:p>
-    <w:p>
-      <w:pPr>
-        <w:numPr>
-          <w:ilvl w:val="0"/>
-          <w:numId w:val="1014"/>
-        </w:numPr>
-        <w:pStyle w:val="Compact"/>
-      </w:pPr>
-      <w:r>
-        <w:t xml:space="preserve">Se descuenta el stock de cada producto en</w:t>
-      </w:r>
-      <w:r>
-        <w:t xml:space="preserve"> </w:t>
-      </w:r>
-      <w:r>
-        <w:rPr>
-          <w:rStyle w:val="VerbatimChar"/>
-        </w:rPr>
-        <w:t xml:space="preserve">productos</w:t>
-      </w:r>
-      <w:r>
-        <w:t xml:space="preserve">.</w:t>
-      </w:r>
-    </w:p>
-    <w:p>
-      <w:pPr>
-        <w:numPr>
-          <w:ilvl w:val="0"/>
-          <w:numId w:val="1014"/>
-        </w:numPr>
-        <w:pStyle w:val="Compact"/>
-      </w:pPr>
-      <w:r>
-        <w:t xml:space="preserve">Si el cliente pidió ticket, se crea una fila en</w:t>
-      </w:r>
-      <w:r>
-        <w:t xml:space="preserve"> </w:t>
-      </w:r>
-      <w:r>
-        <w:rPr>
-          <w:rStyle w:val="VerbatimChar"/>
-        </w:rPr>
-        <w:t xml:space="preserve">tickets</w:t>
-      </w:r>
-      <w:r>
-        <w:t xml:space="preserve"> </w:t>
-      </w:r>
-      <w:r>
-        <w:t xml:space="preserve">con el número siguiente.</w:t>
-      </w:r>
-    </w:p>
-    <w:p>
-      <w:pPr>
-        <w:pStyle w:val="FirstParagraph"/>
-      </w:pPr>
-      <w:r>
-        <w:t xml:space="preserve">Todo eso pasa junto: si algo falla, no se guarda nada a medias.</w:t>
-      </w:r>
-    </w:p>
-    <w:bookmarkEnd w:id="32"/>
-    <w:bookmarkStart w:id="33" w:name="los-excel-del-sistema"/>
-    <w:p>
-      <w:pPr>
-        <w:pStyle w:val="Heading2"/>
-      </w:pPr>
-      <w:r>
-        <w:t xml:space="preserve">8. Los Excel del sistema</w:t>
       </w:r>
     </w:p>
     <w:p>
@@ -4956,6 +4952,129 @@
         <w:pStyle w:val="Compact"/>
       </w:pPr>
       <w:r>
+        <w:t xml:space="preserve">Se crea una fila en</w:t>
+      </w:r>
+      <w:r>
+        <w:t xml:space="preserve"> </w:t>
+      </w:r>
+      <w:r>
+        <w:rPr>
+          <w:rStyle w:val="VerbatimChar"/>
+        </w:rPr>
+        <w:t xml:space="preserve">ventas</w:t>
+      </w:r>
+      <w:r>
+        <w:t xml:space="preserve"> </w:t>
+      </w:r>
+      <w:r>
+        <w:t xml:space="preserve">con la fecha, el total, el medio de pago y la caja.</w:t>
+      </w:r>
+    </w:p>
+    <w:p>
+      <w:pPr>
+        <w:numPr>
+          <w:ilvl w:val="0"/>
+          <w:numId w:val="1015"/>
+        </w:numPr>
+        <w:pStyle w:val="Compact"/>
+      </w:pPr>
+      <w:r>
+        <w:t xml:space="preserve">Se crea una fila en</w:t>
+      </w:r>
+      <w:r>
+        <w:t xml:space="preserve"> </w:t>
+      </w:r>
+      <w:r>
+        <w:rPr>
+          <w:rStyle w:val="VerbatimChar"/>
+        </w:rPr>
+        <w:t xml:space="preserve">ventas_detalle</w:t>
+      </w:r>
+      <w:r>
+        <w:t xml:space="preserve"> </w:t>
+      </w:r>
+      <w:r>
+        <w:t xml:space="preserve">por cada producto, con su precio y su costo.</w:t>
+      </w:r>
+    </w:p>
+    <w:p>
+      <w:pPr>
+        <w:numPr>
+          <w:ilvl w:val="0"/>
+          <w:numId w:val="1015"/>
+        </w:numPr>
+        <w:pStyle w:val="Compact"/>
+      </w:pPr>
+      <w:r>
+        <w:t xml:space="preserve">Se descuenta el stock de cada producto en</w:t>
+      </w:r>
+      <w:r>
+        <w:t xml:space="preserve"> </w:t>
+      </w:r>
+      <w:r>
+        <w:rPr>
+          <w:rStyle w:val="VerbatimChar"/>
+        </w:rPr>
+        <w:t xml:space="preserve">productos</w:t>
+      </w:r>
+      <w:r>
+        <w:t xml:space="preserve">.</w:t>
+      </w:r>
+    </w:p>
+    <w:p>
+      <w:pPr>
+        <w:numPr>
+          <w:ilvl w:val="0"/>
+          <w:numId w:val="1015"/>
+        </w:numPr>
+        <w:pStyle w:val="Compact"/>
+      </w:pPr>
+      <w:r>
+        <w:t xml:space="preserve">Si el cliente pidió ticket, se crea una fila en</w:t>
+      </w:r>
+      <w:r>
+        <w:t xml:space="preserve"> </w:t>
+      </w:r>
+      <w:r>
+        <w:rPr>
+          <w:rStyle w:val="VerbatimChar"/>
+        </w:rPr>
+        <w:t xml:space="preserve">tickets</w:t>
+      </w:r>
+      <w:r>
+        <w:t xml:space="preserve"> </w:t>
+      </w:r>
+      <w:r>
+        <w:t xml:space="preserve">con el número siguiente.</w:t>
+      </w:r>
+    </w:p>
+    <w:p>
+      <w:pPr>
+        <w:pStyle w:val="FirstParagraph"/>
+      </w:pPr>
+      <w:r>
+        <w:t xml:space="preserve">Todo eso pasa junto: si algo falla, no se guarda nada a medias.</w:t>
+      </w:r>
+    </w:p>
+    <w:bookmarkEnd w:id="32"/>
+    <w:bookmarkStart w:id="33" w:name="los-excel-del-sistema"/>
+    <w:p>
+      <w:pPr>
+        <w:pStyle w:val="Heading2"/>
+      </w:pPr>
+      <w:r>
+        <w:t xml:space="preserve">8. Los Excel del sistema</w:t>
+      </w:r>
+    </w:p>
+    <w:p>
+      <w:pPr>
+        <w:numPr>
+          <w:ilvl w:val="0"/>
+          <w:numId w:val="1016"/>
+        </w:numPr>
+        <w:pStyle w:val="Compact"/>
+      </w:pPr>
+      <w:r>
         <w:rPr>
           <w:bCs/>
           <w:b/>
@@ -5087,7 +5206,7 @@
       <w:pPr>
         <w:numPr>
           <w:ilvl w:val="0"/>
-          <w:numId w:val="1015"/>
+          <w:numId w:val="1016"/>
         </w:numPr>
         <w:pStyle w:val="Compact"/>
       </w:pPr>
@@ -5109,7 +5228,7 @@
       <w:pPr>
         <w:numPr>
           <w:ilvl w:val="0"/>
-          <w:numId w:val="1015"/>
+          <w:numId w:val="1016"/>
         </w:numPr>
         <w:pStyle w:val="Compact"/>
       </w:pPr>
@@ -5755,7 +5874,7 @@
       <w:pPr>
         <w:numPr>
           <w:ilvl w:val="0"/>
-          <w:numId w:val="1016"/>
+          <w:numId w:val="1017"/>
         </w:numPr>
         <w:pStyle w:val="Compact"/>
       </w:pPr>
@@ -5780,7 +5899,7 @@
       <w:pPr>
         <w:numPr>
           <w:ilvl w:val="0"/>
-          <w:numId w:val="1016"/>
+          <w:numId w:val="1017"/>
         </w:numPr>
         <w:pStyle w:val="Compact"/>
       </w:pPr>
@@ -5814,7 +5933,7 @@
       <w:pPr>
         <w:numPr>
           <w:ilvl w:val="0"/>
-          <w:numId w:val="1016"/>
+          <w:numId w:val="1017"/>
         </w:numPr>
         <w:pStyle w:val="Compact"/>
       </w:pPr>
@@ -5864,7 +5983,7 @@
       <w:pPr>
         <w:numPr>
           <w:ilvl w:val="0"/>
-          <w:numId w:val="1016"/>
+          <w:numId w:val="1017"/>
         </w:numPr>
         <w:pStyle w:val="Compact"/>
       </w:pPr>
@@ -5889,7 +6008,7 @@
       <w:pPr>
         <w:numPr>
           <w:ilvl w:val="0"/>
-          <w:numId w:val="1016"/>
+          <w:numId w:val="1017"/>
         </w:numPr>
         <w:pStyle w:val="Compact"/>
       </w:pPr>
@@ -5940,7 +6059,7 @@
       <w:pPr>
         <w:numPr>
           <w:ilvl w:val="0"/>
-          <w:numId w:val="1016"/>
+          <w:numId w:val="1017"/>
         </w:numPr>
         <w:pStyle w:val="Compact"/>
       </w:pPr>
@@ -5990,7 +6109,7 @@
       <w:pPr>
         <w:numPr>
           <w:ilvl w:val="0"/>
-          <w:numId w:val="1016"/>
+          <w:numId w:val="1017"/>
         </w:numPr>
         <w:pStyle w:val="Compact"/>
       </w:pPr>
@@ -6037,7 +6156,7 @@
       <w:pPr>
         <w:numPr>
           <w:ilvl w:val="0"/>
-          <w:numId w:val="1017"/>
+          <w:numId w:val="1018"/>
         </w:numPr>
         <w:pStyle w:val="Compact"/>
       </w:pPr>
@@ -6059,7 +6178,7 @@
       <w:pPr>
         <w:numPr>
           <w:ilvl w:val="0"/>
-          <w:numId w:val="1017"/>
+          <w:numId w:val="1018"/>
         </w:numPr>
         <w:pStyle w:val="Compact"/>
       </w:pPr>
@@ -6081,70 +6200,12 @@
       <w:pPr>
         <w:numPr>
           <w:ilvl w:val="0"/>
-          <w:numId w:val="1017"/>
+          <w:numId w:val="1018"/>
         </w:numPr>
         <w:pStyle w:val="Compact"/>
       </w:pPr>
       <w:r>
         <w:t xml:space="preserve">Los sistemas parecidos que facturan ARCA cobran entre $19.000 y $35.000 por mes (o de US$20 a US$79). Como todavía no factura, conviene entrar más abajo.</w:t>
-      </w:r>
-    </w:p>
-    <w:p>
-      <w:pPr>
-        <w:numPr>
-          <w:ilvl w:val="0"/>
-          <w:numId w:val="1017"/>
-        </w:numPr>
-        <w:pStyle w:val="Compact"/>
-      </w:pPr>
-      <w:r>
-        <w:t xml:space="preserve">Descuento de lanzamiento para los primeros clientes, a cambio de que digan qué mejorar.</w:t>
-      </w:r>
-    </w:p>
-    <w:p>
-      <w:pPr>
-        <w:numPr>
-          <w:ilvl w:val="0"/>
-          <w:numId w:val="1017"/>
-        </w:numPr>
-        <w:pStyle w:val="Compact"/>
-      </w:pPr>
-      <w:r>
-        <w:t xml:space="preserve">Cobro único opcional por cargarle los productos al cliente.</w:t>
-      </w:r>
-    </w:p>
-    <w:p>
-      <w:pPr>
-        <w:numPr>
-          <w:ilvl w:val="0"/>
-          <w:numId w:val="1017"/>
-        </w:numPr>
-        <w:pStyle w:val="Compact"/>
-      </w:pPr>
-      <w:r>
-        <w:t xml:space="preserve">Con la factura ARCA, subir a unos $29.900. Ajuste por inflación cada 3 meses.</w:t>
-      </w:r>
-    </w:p>
-    <w:p>
-      <w:pPr>
-        <w:numPr>
-          <w:ilvl w:val="0"/>
-          <w:numId w:val="1017"/>
-        </w:numPr>
-        <w:pStyle w:val="Compact"/>
-      </w:pPr>
-      <w:r>
-        <w:t xml:space="preserve">Los costos de la nube rondan US$30-35 por mes: con 3 clientes ya se cubren.</w:t>
-      </w:r>
-    </w:p>
-    <w:bookmarkEnd w:id="36"/>
-    <w:bookmarkStart w:id="37" w:name="lo-que-viene"/>
-    <w:p>
-      <w:pPr>
-        <w:pStyle w:val="Heading2"/>
-      </w:pPr>
-      <w:r>
-        <w:t xml:space="preserve">12. Lo que viene</w:t>
       </w:r>
     </w:p>
     <w:p>
@@ -6156,6 +6217,64 @@
         <w:pStyle w:val="Compact"/>
       </w:pPr>
       <w:r>
+        <w:t xml:space="preserve">Descuento de lanzamiento para los primeros clientes, a cambio de que digan qué mejorar.</w:t>
+      </w:r>
+    </w:p>
+    <w:p>
+      <w:pPr>
+        <w:numPr>
+          <w:ilvl w:val="0"/>
+          <w:numId w:val="1018"/>
+        </w:numPr>
+        <w:pStyle w:val="Compact"/>
+      </w:pPr>
+      <w:r>
+        <w:t xml:space="preserve">Cobro único opcional por cargarle los productos al cliente.</w:t>
+      </w:r>
+    </w:p>
+    <w:p>
+      <w:pPr>
+        <w:numPr>
+          <w:ilvl w:val="0"/>
+          <w:numId w:val="1018"/>
+        </w:numPr>
+        <w:pStyle w:val="Compact"/>
+      </w:pPr>
+      <w:r>
+        <w:t xml:space="preserve">Con la factura ARCA, subir a unos $29.900. Ajuste por inflación cada 3 meses.</w:t>
+      </w:r>
+    </w:p>
+    <w:p>
+      <w:pPr>
+        <w:numPr>
+          <w:ilvl w:val="0"/>
+          <w:numId w:val="1018"/>
+        </w:numPr>
+        <w:pStyle w:val="Compact"/>
+      </w:pPr>
+      <w:r>
+        <w:t xml:space="preserve">Los costos de la nube rondan US$30-35 por mes: con 3 clientes ya se cubren.</w:t>
+      </w:r>
+    </w:p>
+    <w:bookmarkEnd w:id="36"/>
+    <w:bookmarkStart w:id="37" w:name="lo-que-viene"/>
+    <w:p>
+      <w:pPr>
+        <w:pStyle w:val="Heading2"/>
+      </w:pPr>
+      <w:r>
+        <w:t xml:space="preserve">12. Lo que viene</w:t>
+      </w:r>
+    </w:p>
+    <w:p>
+      <w:pPr>
+        <w:numPr>
+          <w:ilvl w:val="0"/>
+          <w:numId w:val="1019"/>
+        </w:numPr>
+        <w:pStyle w:val="Compact"/>
+      </w:pPr>
+      <w:r>
         <w:rPr>
           <w:bCs/>
           <w:b/>
@@ -6218,7 +6337,7 @@
       <w:pPr>
         <w:numPr>
           <w:ilvl w:val="0"/>
-          <w:numId w:val="1018"/>
+          <w:numId w:val="1019"/>
         </w:numPr>
         <w:pStyle w:val="Compact"/>
       </w:pPr>
@@ -6240,7 +6359,7 @@
       <w:pPr>
         <w:numPr>
           <w:ilvl w:val="0"/>
-          <w:numId w:val="1018"/>
+          <w:numId w:val="1019"/>
         </w:numPr>
         <w:pStyle w:val="Compact"/>
       </w:pPr>
@@ -6262,7 +6381,7 @@
       <w:pPr>
         <w:numPr>
           <w:ilvl w:val="0"/>
-          <w:numId w:val="1018"/>
+          <w:numId w:val="1019"/>
         </w:numPr>
         <w:pStyle w:val="Compact"/>
       </w:pPr>
@@ -6302,7 +6421,7 @@
       <w:pPr>
         <w:numPr>
           <w:ilvl w:val="0"/>
-          <w:numId w:val="1018"/>
+          <w:numId w:val="1019"/>
         </w:numPr>
         <w:pStyle w:val="Compact"/>
       </w:pPr>
@@ -7514,9 +7633,6 @@
     </w:lvlOverride>
   </w:num>
   <w:num w:numId="1011">
-    <w:abstractNumId w:val="991"/>
-  </w:num>
-  <w:num w:numId="1012">
     <w:abstractNumId w:val="99411"/>
     <w:lvlOverride w:ilvl="0">
       <w:startOverride w:val="1"/>
@@ -7546,10 +7662,10 @@
       <w:startOverride w:val="1"/>
     </w:lvlOverride>
   </w:num>
-  <w:num w:numId="1013">
+  <w:num w:numId="1012">
     <w:abstractNumId w:val="991"/>
   </w:num>
-  <w:num w:numId="1014">
+  <w:num w:numId="1013">
     <w:abstractNumId w:val="99411"/>
     <w:lvlOverride w:ilvl="0">
       <w:startOverride w:val="1"/>
@@ -7579,8 +7695,38 @@
       <w:startOverride w:val="1"/>
     </w:lvlOverride>
   </w:num>
+  <w:num w:numId="1014">
+    <w:abstractNumId w:val="991"/>
+  </w:num>
   <w:num w:numId="1015">
-    <w:abstractNumId w:val="991"/>
+    <w:abstractNumId w:val="99411"/>
+    <w:lvlOverride w:ilvl="0">
+      <w:startOverride w:val="1"/>
+    </w:lvlOverride>
+    <w:lvlOverride w:ilvl="1">
+      <w:startOverride w:val="1"/>
+    </w:lvlOverride>
+    <w:lvlOverride w:ilvl="2">
+      <w:startOverride w:val="1"/>
+    </w:lvlOverride>
+    <w:lvlOverride w:ilvl="3">
+      <w:startOverride w:val="1"/>
+    </w:lvlOverride>
+    <w:lvlOverride w:ilvl="4">
+      <w:startOverride w:val="1"/>
+    </w:lvlOverride>
+    <w:lvlOverride w:ilvl="5">
+      <w:startOverride w:val="1"/>
+    </w:lvlOverride>
+    <w:lvlOverride w:ilvl="6">
+      <w:startOverride w:val="1"/>
+    </w:lvlOverride>
+    <w:lvlOverride w:ilvl="7">
+      <w:startOverride w:val="1"/>
+    </w:lvlOverride>
+    <w:lvlOverride w:ilvl="8">
+      <w:startOverride w:val="1"/>
+    </w:lvlOverride>
   </w:num>
   <w:num w:numId="1016">
     <w:abstractNumId w:val="991"/>
@@ -7589,6 +7735,9 @@
     <w:abstractNumId w:val="991"/>
   </w:num>
   <w:num w:numId="1018">
+    <w:abstractNumId w:val="991"/>
+  </w:num>
+  <w:num w:numId="1019">
     <w:abstractNumId w:val="99411"/>
     <w:lvlOverride w:ilvl="0">
       <w:startOverride w:val="1"/>

</xml_diff>

<commit_message>
Reservas desde el celular: vienen apagadas, también en la demo
Se prenden solo si el gimnasio las necesita. Mientras tanto, el jefe y
recepción anotan a los socios a mano (Clases, Socios o Ingreso por DNI),
con el mismo cupo y lista de espera. La demo deja listo el link
?reservar=fuerzanorte para cuando se prenda.

Co-Authored-By: Claude Opus 5.5 (1M context) <noreply@anthropic.com>
Claude-Session: https://claude.ai/code/session_01FS9aKLz15s45nuzH59Cmdf
</commit_message>
<xml_diff>
--- a/informe/guia/guia-del-sistema.docx
+++ b/informe/guia/guia-del-sistema.docx
@@ -5482,7 +5482,20 @@
         <w:pStyle w:val="FirstParagraph"/>
       </w:pPr>
       <w:r>
-        <w:t xml:space="preserve">El socio reserva solo, sin pasar por recepción. El jefe lo prende en</w:t>
+        <w:t xml:space="preserve">El socio reserva solo, sin pasar por recepción.</w:t>
+      </w:r>
+      <w:r>
+        <w:t xml:space="preserve"> </w:t>
+      </w:r>
+      <w:r>
+        <w:rPr>
+          <w:bCs/>
+          <w:b/>
+        </w:rPr>
+        <w:t xml:space="preserve">Viene apagada</w:t>
+      </w:r>
+      <w:r>
+        <w:t xml:space="preserve">: mientras tanto, el jefe y recepción anotan a los socios a mano (en Clases, en la ficha de Socios o en el Ingreso por DNI), con el mismo cupo y la misma lista de espera. Si el gimnasio la quiere, el jefe la prende en</w:t>
       </w:r>
       <w:r>
         <w:t xml:space="preserve"> </w:t>
@@ -8177,7 +8190,7 @@
         <w:t xml:space="preserve"> </w:t>
       </w:r>
       <w:r>
-        <w:t xml:space="preserve">es de un socio de prueba). La página de reservas del socio de la demo es</w:t>
+        <w:t xml:space="preserve">es de un socio de prueba). La página de reservas del socio viene apagada; si se prende, el link de la demo es</w:t>
       </w:r>
       <w:r>
         <w:t xml:space="preserve"> </w:t>

</xml_diff>

<commit_message>
Caja: botones − y + para cambiar la cantidad de cada producto
El total, el subtotal y el vuelto se recalculan solos. El − no baja de 1
(para sacar el producto está la X) y el + no deja pasar el stock cargado.
Los botones usan callbacks, así la pantalla se redibuja una sola vez.

Co-Authored-By: Claude Opus 5.5 (1M context) <noreply@anthropic.com>
Claude-Session: https://claude.ai/code/session_01P334F9DzHSPpSbKmDCQ794
</commit_message>
<xml_diff>
--- a/informe/guia/guia-del-sistema.docx
+++ b/informe/guia/guia-del-sistema.docx
@@ -1157,7 +1157,7 @@
               <w:jc w:val="left"/>
             </w:pPr>
             <w:r>
-              <w:t xml:space="preserve">Abrir caja, vender con el lector o la lista, vuelto, cobrar, ticket, relevo de turno, cerrar caja con arqueo. El jefe ve el historial de cajas, los turnos de cada una y las ajusta.</w:t>
+              <w:t xml:space="preserve">Abrir caja, vender con el lector o la lista, botones − y + para cambiar cantidades, vuelto, cobrar, ticket, relevo de turno, cerrar caja con arqueo. El jefe ve el historial de cajas, los turnos de cada una y las ajusta.</w:t>
             </w:r>
           </w:p>
         </w:tc>
@@ -4440,6 +4440,60 @@
       </w:r>
       <w:r>
         <w:t xml:space="preserve">. Cada pasada suma 1 unidad; si se pasa dos veces, suma 2.</w:t>
+      </w:r>
+    </w:p>
+    <w:p>
+      <w:pPr>
+        <w:numPr>
+          <w:ilvl w:val="0"/>
+          <w:numId w:val="1014"/>
+        </w:numPr>
+        <w:pStyle w:val="Compact"/>
+      </w:pPr>
+      <w:r>
+        <w:rPr>
+          <w:bCs/>
+          <w:b/>
+        </w:rPr>
+        <w:t xml:space="preserve">Cambiar la cantidad sin volver a escanear:</w:t>
+      </w:r>
+      <w:r>
+        <w:t xml:space="preserve"> </w:t>
+      </w:r>
+      <w:r>
+        <w:t xml:space="preserve">cada producto de la venta tiene los botones</w:t>
+      </w:r>
+      <w:r>
+        <w:t xml:space="preserve"> </w:t>
+      </w:r>
+      <w:r>
+        <w:rPr>
+          <w:bCs/>
+          <w:b/>
+        </w:rPr>
+        <w:t xml:space="preserve">−</w:t>
+      </w:r>
+      <w:r>
+        <w:t xml:space="preserve"> </w:t>
+      </w:r>
+      <w:r>
+        <w:t xml:space="preserve">y</w:t>
+      </w:r>
+      <w:r>
+        <w:t xml:space="preserve"> </w:t>
+      </w:r>
+      <w:r>
+        <w:rPr>
+          <w:bCs/>
+          <w:b/>
+        </w:rPr>
+        <w:t xml:space="preserve">+</w:t>
+      </w:r>
+      <w:r>
+        <w:t xml:space="preserve"> </w:t>
+      </w:r>
+      <w:r>
+        <w:t xml:space="preserve">al lado del número. El total y el vuelto se recalculan solos. El − no baja de 1 (para sacar el producto está la X) y el + no deja pasar el stock que hay cargado.</w:t>
       </w:r>
     </w:p>
     <w:p>
@@ -23235,6 +23289,232 @@
     <w:basedOn w:val="VerbatimChar"/>
     <w:rPr/>
   </w:style>
+  <w:style w:customStyle="1" w:styleId="KeywordTok" w:type="character">
+    <w:name w:val="KeywordTok"/>
+    <w:basedOn w:val="VerbatimChar"/>
+    <w:rPr>
+      <w:color w:val="007020"/>
+      <w:b/>
+    </w:rPr>
+  </w:style>
+  <w:style w:customStyle="1" w:styleId="DataTypeTok" w:type="character">
+    <w:name w:val="DataTypeTok"/>
+    <w:basedOn w:val="VerbatimChar"/>
+    <w:rPr>
+      <w:color w:val="902000"/>
+    </w:rPr>
+  </w:style>
+  <w:style w:customStyle="1" w:styleId="DecValTok" w:type="character">
+    <w:name w:val="DecValTok"/>
+    <w:basedOn w:val="VerbatimChar"/>
+    <w:rPr>
+      <w:color w:val="40a070"/>
+    </w:rPr>
+  </w:style>
+  <w:style w:customStyle="1" w:styleId="BaseNTok" w:type="character">
+    <w:name w:val="BaseNTok"/>
+    <w:basedOn w:val="VerbatimChar"/>
+    <w:rPr>
+      <w:color w:val="40a070"/>
+    </w:rPr>
+  </w:style>
+  <w:style w:customStyle="1" w:styleId="FloatTok" w:type="character">
+    <w:name w:val="FloatTok"/>
+    <w:basedOn w:val="VerbatimChar"/>
+    <w:rPr>
+      <w:color w:val="40a070"/>
+    </w:rPr>
+  </w:style>
+  <w:style w:customStyle="1" w:styleId="ConstantTok" w:type="character">
+    <w:name w:val="ConstantTok"/>
+    <w:basedOn w:val="VerbatimChar"/>
+    <w:rPr>
+      <w:color w:val="880000"/>
+    </w:rPr>
+  </w:style>
+  <w:style w:customStyle="1" w:styleId="CharTok" w:type="character">
+    <w:name w:val="CharTok"/>
+    <w:basedOn w:val="VerbatimChar"/>
+    <w:rPr>
+      <w:color w:val="4070a0"/>
+    </w:rPr>
+  </w:style>
+  <w:style w:customStyle="1" w:styleId="SpecialCharTok" w:type="character">
+    <w:name w:val="SpecialCharTok"/>
+    <w:basedOn w:val="VerbatimChar"/>
+    <w:rPr>
+      <w:color w:val="4070a0"/>
+    </w:rPr>
+  </w:style>
+  <w:style w:customStyle="1" w:styleId="StringTok" w:type="character">
+    <w:name w:val="StringTok"/>
+    <w:basedOn w:val="VerbatimChar"/>
+    <w:rPr>
+      <w:color w:val="4070a0"/>
+    </w:rPr>
+  </w:style>
+  <w:style w:customStyle="1" w:styleId="VerbatimStringTok" w:type="character">
+    <w:name w:val="VerbatimStringTok"/>
+    <w:basedOn w:val="VerbatimChar"/>
+    <w:rPr>
+      <w:color w:val="4070a0"/>
+    </w:rPr>
+  </w:style>
+  <w:style w:customStyle="1" w:styleId="SpecialStringTok" w:type="character">
+    <w:name w:val="SpecialStringTok"/>
+    <w:basedOn w:val="VerbatimChar"/>
+    <w:rPr>
+      <w:color w:val="bb6688"/>
+    </w:rPr>
+  </w:style>
+  <w:style w:customStyle="1" w:styleId="ImportTok" w:type="character">
+    <w:name w:val="ImportTok"/>
+    <w:basedOn w:val="VerbatimChar"/>
+    <w:rPr>
+      <w:color w:val="008000"/>
+      <w:b/>
+    </w:rPr>
+  </w:style>
+  <w:style w:customStyle="1" w:styleId="CommentTok" w:type="character">
+    <w:name w:val="CommentTok"/>
+    <w:basedOn w:val="VerbatimChar"/>
+    <w:rPr>
+      <w:color w:val="60a0b0"/>
+      <w:i/>
+    </w:rPr>
+  </w:style>
+  <w:style w:customStyle="1" w:styleId="DocumentationTok" w:type="character">
+    <w:name w:val="DocumentationTok"/>
+    <w:basedOn w:val="VerbatimChar"/>
+    <w:rPr>
+      <w:color w:val="ba2121"/>
+      <w:i/>
+    </w:rPr>
+  </w:style>
+  <w:style w:customStyle="1" w:styleId="AnnotationTok" w:type="character">
+    <w:name w:val="AnnotationTok"/>
+    <w:basedOn w:val="VerbatimChar"/>
+    <w:rPr>
+      <w:color w:val="60a0b0"/>
+      <w:b/>
+      <w:i/>
+    </w:rPr>
+  </w:style>
+  <w:style w:customStyle="1" w:styleId="CommentVarTok" w:type="character">
+    <w:name w:val="CommentVarTok"/>
+    <w:basedOn w:val="VerbatimChar"/>
+    <w:rPr>
+      <w:color w:val="60a0b0"/>
+      <w:b/>
+      <w:i/>
+    </w:rPr>
+  </w:style>
+  <w:style w:customStyle="1" w:styleId="OtherTok" w:type="character">
+    <w:name w:val="OtherTok"/>
+    <w:basedOn w:val="VerbatimChar"/>
+    <w:rPr>
+      <w:color w:val="007020"/>
+    </w:rPr>
+  </w:style>
+  <w:style w:customStyle="1" w:styleId="FunctionTok" w:type="character">
+    <w:name w:val="FunctionTok"/>
+    <w:basedOn w:val="VerbatimChar"/>
+    <w:rPr>
+      <w:color w:val="06287e"/>
+    </w:rPr>
+  </w:style>
+  <w:style w:customStyle="1" w:styleId="VariableTok" w:type="character">
+    <w:name w:val="VariableTok"/>
+    <w:basedOn w:val="VerbatimChar"/>
+    <w:rPr>
+      <w:color w:val="19177c"/>
+    </w:rPr>
+  </w:style>
+  <w:style w:customStyle="1" w:styleId="ControlFlowTok" w:type="character">
+    <w:name w:val="ControlFlowTok"/>
+    <w:basedOn w:val="VerbatimChar"/>
+    <w:rPr>
+      <w:color w:val="007020"/>
+      <w:b/>
+    </w:rPr>
+  </w:style>
+  <w:style w:customStyle="1" w:styleId="OperatorTok" w:type="character">
+    <w:name w:val="OperatorTok"/>
+    <w:basedOn w:val="VerbatimChar"/>
+    <w:rPr>
+      <w:color w:val="666666"/>
+    </w:rPr>
+  </w:style>
+  <w:style w:customStyle="1" w:styleId="BuiltInTok" w:type="character">
+    <w:name w:val="BuiltInTok"/>
+    <w:basedOn w:val="VerbatimChar"/>
+    <w:rPr>
+      <w:color w:val="008000"/>
+    </w:rPr>
+  </w:style>
+  <w:style w:customStyle="1" w:styleId="ExtensionTok" w:type="character">
+    <w:name w:val="ExtensionTok"/>
+    <w:basedOn w:val="VerbatimChar"/>
+    <w:rPr/>
+  </w:style>
+  <w:style w:customStyle="1" w:styleId="PreprocessorTok" w:type="character">
+    <w:name w:val="PreprocessorTok"/>
+    <w:basedOn w:val="VerbatimChar"/>
+    <w:rPr>
+      <w:color w:val="bc7a00"/>
+    </w:rPr>
+  </w:style>
+  <w:style w:customStyle="1" w:styleId="AttributeTok" w:type="character">
+    <w:name w:val="AttributeTok"/>
+    <w:basedOn w:val="VerbatimChar"/>
+    <w:rPr>
+      <w:color w:val="7d9029"/>
+    </w:rPr>
+  </w:style>
+  <w:style w:customStyle="1" w:styleId="RegionMarkerTok" w:type="character">
+    <w:name w:val="RegionMarkerTok"/>
+    <w:basedOn w:val="VerbatimChar"/>
+    <w:rPr/>
+  </w:style>
+  <w:style w:customStyle="1" w:styleId="InformationTok" w:type="character">
+    <w:name w:val="InformationTok"/>
+    <w:basedOn w:val="VerbatimChar"/>
+    <w:rPr>
+      <w:color w:val="60a0b0"/>
+      <w:b/>
+      <w:i/>
+    </w:rPr>
+  </w:style>
+  <w:style w:customStyle="1" w:styleId="WarningTok" w:type="character">
+    <w:name w:val="WarningTok"/>
+    <w:basedOn w:val="VerbatimChar"/>
+    <w:rPr>
+      <w:color w:val="60a0b0"/>
+      <w:b/>
+      <w:i/>
+    </w:rPr>
+  </w:style>
+  <w:style w:customStyle="1" w:styleId="AlertTok" w:type="character">
+    <w:name w:val="AlertTok"/>
+    <w:basedOn w:val="VerbatimChar"/>
+    <w:rPr>
+      <w:color w:val="ff0000"/>
+      <w:b/>
+    </w:rPr>
+  </w:style>
+  <w:style w:customStyle="1" w:styleId="ErrorTok" w:type="character">
+    <w:name w:val="ErrorTok"/>
+    <w:basedOn w:val="VerbatimChar"/>
+    <w:rPr>
+      <w:color w:val="ff0000"/>
+      <w:b/>
+    </w:rPr>
+  </w:style>
+  <w:style w:customStyle="1" w:styleId="NormalTok" w:type="character">
+    <w:name w:val="NormalTok"/>
+    <w:basedOn w:val="VerbatimChar"/>
+    <w:rPr/>
+  </w:style>
   <w:style w:type="character" w:customStyle="1" w:styleId="KeywordTok">
     <w:name w:val="KeywordTok"/>
     <w:basedOn w:val="VerbatimChar"/>

</xml_diff>